<commit_message>
Prima bozza file design
</commit_message>
<xml_diff>
--- a/documentazione/Design.docx
+++ b/documentazione/Design.docx
@@ -7,7 +7,6 @@
         <w:t>DESIGN</w:t>
       </w:r>
     </w:p>
-    <w:p/>
     <w:p>
       <w:pPr>
         <w:rPr>
@@ -217,13 +216,316 @@
         <w:t>)</w:t>
       </w:r>
     </w:p>
-    <w:p/>
     <w:p>
       <w:r>
         <w:t>Documentazione: immagini nel documento o in una cartella separata (specificare qui quale è la cartella)</w:t>
       </w:r>
     </w:p>
-    <w:p/>
+    <w:p>
+      <w:pPr>
+        <w:rPr>
+          <w:i/>
+          <w:iCs/>
+          <w:u w:val="single"/>
+        </w:rPr>
+      </w:pPr>
+      <w:proofErr w:type="spellStart"/>
+      <w:r>
+        <w:rPr>
+          <w:i/>
+          <w:iCs/>
+          <w:u w:val="single"/>
+        </w:rPr>
+        <w:t>Modelling</w:t>
+      </w:r>
+      <w:proofErr w:type="spellEnd"/>
+    </w:p>
+    <w:p>
+      <w:r>
+        <w:t>Il team ha modellato il sistema utilizzando i diagrammi UML citati qui.</w:t>
+      </w:r>
+    </w:p>
+    <w:p>
+      <w:pPr>
+        <w:pStyle w:val="Paragrafoelenco"/>
+        <w:numPr>
+          <w:ilvl w:val="1"/>
+          <w:numId w:val="13"/>
+        </w:numPr>
+        <w:spacing w:after="0"/>
+      </w:pPr>
+      <w:r>
+        <w:t xml:space="preserve">Use case </w:t>
+      </w:r>
+      <w:proofErr w:type="spellStart"/>
+      <w:r>
+        <w:t>Diagram</w:t>
+      </w:r>
+      <w:proofErr w:type="spellEnd"/>
+      <w:r>
+        <w:t xml:space="preserve"> : definisce i confini del sistema e le interazioni degli attori Utente ed Admin</w:t>
+      </w:r>
+    </w:p>
+    <w:p>
+      <w:pPr>
+        <w:spacing w:after="0"/>
+        <w:ind w:left="720"/>
+      </w:pPr>
+    </w:p>
+    <w:p>
+      <w:pPr>
+        <w:pStyle w:val="Paragrafoelenco"/>
+        <w:numPr>
+          <w:ilvl w:val="1"/>
+          <w:numId w:val="13"/>
+        </w:numPr>
+        <w:spacing w:after="0"/>
+      </w:pPr>
+      <w:r>
+        <w:t xml:space="preserve">Class </w:t>
+      </w:r>
+      <w:proofErr w:type="spellStart"/>
+      <w:r>
+        <w:t>diagram</w:t>
+      </w:r>
+      <w:proofErr w:type="spellEnd"/>
+      <w:r>
+        <w:t xml:space="preserve"> : </w:t>
+      </w:r>
+      <w:proofErr w:type="spellStart"/>
+      <w:r>
+        <w:t>rapprsneta</w:t>
+      </w:r>
+      <w:proofErr w:type="spellEnd"/>
+      <w:r>
+        <w:t xml:space="preserve"> l struttura del sistema e le interazioni tra le varie componenti </w:t>
+      </w:r>
+    </w:p>
+    <w:p>
+      <w:pPr>
+        <w:pStyle w:val="Paragrafoelenco"/>
+        <w:spacing w:after="0"/>
+      </w:pPr>
+    </w:p>
+    <w:p>
+      <w:pPr>
+        <w:pStyle w:val="Paragrafoelenco"/>
+        <w:numPr>
+          <w:ilvl w:val="1"/>
+          <w:numId w:val="13"/>
+        </w:numPr>
+        <w:spacing w:after="0"/>
+      </w:pPr>
+      <w:r>
+        <w:t xml:space="preserve">State </w:t>
+      </w:r>
+      <w:proofErr w:type="spellStart"/>
+      <w:r>
+        <w:t>Machien</w:t>
+      </w:r>
+      <w:proofErr w:type="spellEnd"/>
+      <w:r>
+        <w:t xml:space="preserve"> </w:t>
+      </w:r>
+      <w:proofErr w:type="spellStart"/>
+      <w:r>
+        <w:t>Diagram</w:t>
+      </w:r>
+      <w:proofErr w:type="spellEnd"/>
+      <w:r>
+        <w:t>: modellato il flusso dell’accesso e della prenotazione</w:t>
+      </w:r>
+    </w:p>
+    <w:p>
+      <w:pPr>
+        <w:pStyle w:val="Paragrafoelenco"/>
+        <w:spacing w:after="0"/>
+      </w:pPr>
+    </w:p>
+    <w:p>
+      <w:pPr>
+        <w:pStyle w:val="Paragrafoelenco"/>
+        <w:numPr>
+          <w:ilvl w:val="1"/>
+          <w:numId w:val="13"/>
+        </w:numPr>
+        <w:spacing w:after="0"/>
+      </w:pPr>
+      <w:proofErr w:type="spellStart"/>
+      <w:r>
+        <w:t>Sequence</w:t>
+      </w:r>
+      <w:proofErr w:type="spellEnd"/>
+      <w:r>
+        <w:t xml:space="preserve"> </w:t>
+      </w:r>
+      <w:proofErr w:type="spellStart"/>
+      <w:r>
+        <w:t>diagram</w:t>
+      </w:r>
+      <w:proofErr w:type="spellEnd"/>
+      <w:r>
+        <w:t xml:space="preserve">: rappresenta flusso di messaggi dal </w:t>
+      </w:r>
+      <w:proofErr w:type="spellStart"/>
+      <w:r>
+        <w:t>tenativo</w:t>
+      </w:r>
+      <w:proofErr w:type="spellEnd"/>
+      <w:r>
+        <w:t xml:space="preserve"> di prenotazione alla sua conferma</w:t>
+      </w:r>
+    </w:p>
+    <w:p>
+      <w:pPr>
+        <w:pStyle w:val="Paragrafoelenco"/>
+      </w:pPr>
+    </w:p>
+    <w:p>
+      <w:pPr>
+        <w:pStyle w:val="Paragrafoelenco"/>
+        <w:numPr>
+          <w:ilvl w:val="1"/>
+          <w:numId w:val="13"/>
+        </w:numPr>
+        <w:spacing w:after="0"/>
+      </w:pPr>
+      <w:proofErr w:type="spellStart"/>
+      <w:r>
+        <w:t>Communication</w:t>
+      </w:r>
+      <w:proofErr w:type="spellEnd"/>
+      <w:r>
+        <w:t xml:space="preserve"> </w:t>
+      </w:r>
+      <w:proofErr w:type="spellStart"/>
+      <w:r>
+        <w:t>Diagram</w:t>
+      </w:r>
+      <w:proofErr w:type="spellEnd"/>
+      <w:r>
+        <w:t xml:space="preserve">: </w:t>
+      </w:r>
+      <w:r>
+        <w:t>rappresenta flusso di messaggi dal ten</w:t>
+      </w:r>
+      <w:r>
+        <w:t>t</w:t>
+      </w:r>
+      <w:r>
+        <w:t>ativo di prenotazione alla sua conferma</w:t>
+      </w:r>
+    </w:p>
+    <w:p>
+      <w:pPr>
+        <w:pStyle w:val="Paragrafoelenco"/>
+      </w:pPr>
+    </w:p>
+    <w:p>
+      <w:pPr>
+        <w:pStyle w:val="Paragrafoelenco"/>
+        <w:numPr>
+          <w:ilvl w:val="1"/>
+          <w:numId w:val="13"/>
+        </w:numPr>
+        <w:spacing w:after="0"/>
+      </w:pPr>
+      <w:r>
+        <w:t xml:space="preserve">Activity </w:t>
+      </w:r>
+      <w:proofErr w:type="spellStart"/>
+      <w:r>
+        <w:t>diagram</w:t>
+      </w:r>
+      <w:proofErr w:type="spellEnd"/>
+    </w:p>
+    <w:p>
+      <w:pPr>
+        <w:pStyle w:val="Paragrafoelenco"/>
+      </w:pPr>
+    </w:p>
+    <w:p>
+      <w:pPr>
+        <w:pStyle w:val="Paragrafoelenco"/>
+        <w:numPr>
+          <w:ilvl w:val="1"/>
+          <w:numId w:val="13"/>
+        </w:numPr>
+        <w:spacing w:after="0"/>
+      </w:pPr>
+      <w:r>
+        <w:t xml:space="preserve">Component </w:t>
+      </w:r>
+      <w:proofErr w:type="spellStart"/>
+      <w:r>
+        <w:t>diagram</w:t>
+      </w:r>
+      <w:proofErr w:type="spellEnd"/>
+    </w:p>
+    <w:p>
+      <w:pPr>
+        <w:pStyle w:val="Paragrafoelenco"/>
+      </w:pPr>
+    </w:p>
+    <w:p>
+      <w:pPr>
+        <w:pStyle w:val="Paragrafoelenco"/>
+        <w:numPr>
+          <w:ilvl w:val="1"/>
+          <w:numId w:val="13"/>
+        </w:numPr>
+        <w:spacing w:after="0"/>
+      </w:pPr>
+      <w:r>
+        <w:t xml:space="preserve">Package </w:t>
+      </w:r>
+      <w:proofErr w:type="spellStart"/>
+      <w:r>
+        <w:t>diagram</w:t>
+      </w:r>
+      <w:proofErr w:type="spellEnd"/>
+    </w:p>
+    <w:p>
+      <w:pPr>
+        <w:pStyle w:val="Paragrafoelenco"/>
+      </w:pPr>
+    </w:p>
+    <w:p>
+      <w:pPr>
+        <w:pStyle w:val="Paragrafoelenco"/>
+        <w:spacing w:after="0"/>
+        <w:ind w:left="1440"/>
+      </w:pPr>
+    </w:p>
+    <w:p>
+      <w:pPr>
+        <w:spacing w:after="0"/>
+      </w:pPr>
+      <w:r>
+        <w:t>I file presenti in questo documento sono ritrovabili anche all’interno della cartella del codice (</w:t>
+      </w:r>
+      <w:proofErr w:type="spellStart"/>
+      <w:r>
+        <w:t>find</w:t>
+      </w:r>
+      <w:proofErr w:type="spellEnd"/>
+      <w:r>
+        <w:t>-n-</w:t>
+      </w:r>
+      <w:proofErr w:type="spellStart"/>
+      <w:r>
+        <w:t>charge</w:t>
+      </w:r>
+      <w:proofErr w:type="spellEnd"/>
+      <w:r>
+        <w:t>/</w:t>
+      </w:r>
+      <w:proofErr w:type="spellStart"/>
+      <w:r>
+        <w:t>diagrammiUML</w:t>
+      </w:r>
+      <w:proofErr w:type="spellEnd"/>
+    </w:p>
     <w:p>
       <w:pPr>
         <w:rPr>
@@ -236,65 +538,415 @@
           <w:b/>
           <w:bCs/>
         </w:rPr>
-        <w:t>Software Architecture</w:t>
-      </w:r>
-    </w:p>
-    <w:p>
-      <w:r>
-        <w:t xml:space="preserve">DEVE contenere la descrizione dell’architettura con almeno un paio di </w:t>
-      </w:r>
-      <w:proofErr w:type="spellStart"/>
-      <w:r>
-        <w:t>architectural</w:t>
-      </w:r>
-      <w:proofErr w:type="spellEnd"/>
-      <w:r>
-        <w:t xml:space="preserve"> </w:t>
-      </w:r>
-      <w:proofErr w:type="spellStart"/>
-      <w:r>
-        <w:t>views</w:t>
-      </w:r>
-      <w:proofErr w:type="spellEnd"/>
-      <w:r>
-        <w:t xml:space="preserve"> (per differenti punti di vista) DOVREBBE avere almeno una vista con connettori e componenti con la descrizione dello stile architetturale (11.4) DEVE utilizzare almeno una libreria esterna con </w:t>
-      </w:r>
-      <w:proofErr w:type="spellStart"/>
-      <w:r>
-        <w:t>maven</w:t>
-      </w:r>
-      <w:proofErr w:type="spellEnd"/>
-      <w:r>
-        <w:t>. Ad esempio l’uso di log4j è molto consigliata.</w:t>
-      </w:r>
-    </w:p>
-    <w:p/>
-    <w:p>
-      <w:pPr>
+        <w:lastRenderedPageBreak/>
+        <w:t>Software Archite</w:t>
+      </w:r>
+      <w:r>
         <w:rPr>
           <w:b/>
           <w:bCs/>
         </w:rPr>
-      </w:pPr>
+        <w:t>c</w:t>
+      </w:r>
       <w:r>
         <w:rPr>
           <w:b/>
           <w:bCs/>
         </w:rPr>
-        <w:t xml:space="preserve">Software </w:t>
-      </w:r>
-      <w:proofErr w:type="spellStart"/>
-      <w:r>
+        <w:t>ture</w:t>
+      </w:r>
+    </w:p>
+    <w:p>
+      <w:r>
+        <w:t xml:space="preserve">DEVE contenere la descrizione dell’architettura con almeno un paio di </w:t>
+      </w:r>
+      <w:proofErr w:type="spellStart"/>
+      <w:r>
+        <w:t>architectural</w:t>
+      </w:r>
+      <w:proofErr w:type="spellEnd"/>
+      <w:r>
+        <w:t xml:space="preserve"> </w:t>
+      </w:r>
+      <w:proofErr w:type="spellStart"/>
+      <w:r>
+        <w:t>views</w:t>
+      </w:r>
+      <w:proofErr w:type="spellEnd"/>
+      <w:r>
+        <w:t xml:space="preserve"> (per differenti punti di vista) DOVREBBE avere almeno una vista con connettori e componenti con la descrizione dello stile architetturale (11.4) DEVE utilizzare almeno una libreria esterna con </w:t>
+      </w:r>
+      <w:proofErr w:type="spellStart"/>
+      <w:r>
+        <w:t>maven</w:t>
+      </w:r>
+      <w:proofErr w:type="spellEnd"/>
+      <w:r>
+        <w:t>. Ad esempio l’uso di log4j è molto consigliata.</w:t>
+      </w:r>
+    </w:p>
+    <w:p>
+      <w:pPr>
+        <w:rPr>
+          <w:i/>
+          <w:iCs/>
+          <w:u w:val="single"/>
+        </w:rPr>
+      </w:pPr>
+    </w:p>
+    <w:p>
+      <w:pPr>
+        <w:rPr>
+          <w:i/>
+          <w:iCs/>
+          <w:u w:val="single"/>
+        </w:rPr>
+      </w:pPr>
+      <w:r>
+        <w:rPr>
+          <w:i/>
+          <w:iCs/>
+          <w:u w:val="single"/>
+        </w:rPr>
+        <w:t>Software Architecture</w:t>
+      </w:r>
+    </w:p>
+    <w:p>
+      <w:r>
+        <w:t>Stile architetturale: il software utilizza un architettura a strati (</w:t>
+      </w:r>
+      <w:proofErr w:type="spellStart"/>
+      <w:r>
+        <w:t>layered</w:t>
+      </w:r>
+      <w:proofErr w:type="spellEnd"/>
+      <w:r>
+        <w:t>) per garantire la separazione delle responsabilità e facilitare la manutenibilità.</w:t>
+      </w:r>
+    </w:p>
+    <w:p>
+      <w:r>
+        <w:t xml:space="preserve">Il sistema è diviso in tre </w:t>
+      </w:r>
+      <w:proofErr w:type="spellStart"/>
+      <w:r>
+        <w:t>layer</w:t>
+      </w:r>
+      <w:proofErr w:type="spellEnd"/>
+      <w:r>
+        <w:t xml:space="preserve"> principali:</w:t>
+      </w:r>
+    </w:p>
+    <w:p>
+      <w:pPr>
+        <w:pStyle w:val="Paragrafoelenco"/>
+        <w:numPr>
+          <w:ilvl w:val="0"/>
+          <w:numId w:val="7"/>
+        </w:numPr>
+        <w:spacing w:line="360" w:lineRule="auto"/>
+      </w:pPr>
+      <w:r>
+        <w:t>Presentation Layer (</w:t>
+      </w:r>
+      <w:proofErr w:type="spellStart"/>
+      <w:r>
+        <w:t>Views</w:t>
+      </w:r>
+      <w:proofErr w:type="spellEnd"/>
+      <w:r>
+        <w:t>): Gestione dell'interfaccia utente (</w:t>
+      </w:r>
+      <w:proofErr w:type="spellStart"/>
+      <w:r>
+        <w:t>Vaadin</w:t>
+      </w:r>
+      <w:proofErr w:type="spellEnd"/>
+      <w:r>
+        <w:t>)</w:t>
+      </w:r>
+      <w:r>
+        <w:t xml:space="preserve">. </w:t>
+      </w:r>
+    </w:p>
+    <w:p>
+      <w:pPr>
+        <w:pStyle w:val="Paragrafoelenco"/>
+        <w:numPr>
+          <w:ilvl w:val="0"/>
+          <w:numId w:val="7"/>
+        </w:numPr>
+        <w:spacing w:line="360" w:lineRule="auto"/>
+      </w:pPr>
+      <w:r>
+        <w:t>Business Layer (Service): Logica applicativa e validazione.</w:t>
+      </w:r>
+    </w:p>
+    <w:p>
+      <w:pPr>
+        <w:pStyle w:val="Paragrafoelenco"/>
+        <w:numPr>
+          <w:ilvl w:val="0"/>
+          <w:numId w:val="7"/>
+        </w:numPr>
+        <w:spacing w:line="360" w:lineRule="auto"/>
+      </w:pPr>
+      <w:r>
+        <w:t xml:space="preserve">Data Access Layer (Interface + </w:t>
+      </w:r>
+      <w:proofErr w:type="spellStart"/>
+      <w:r>
+        <w:t>FirebaseService</w:t>
+      </w:r>
+      <w:proofErr w:type="spellEnd"/>
+      <w:r>
+        <w:t>): Gestione dati.</w:t>
+      </w:r>
+    </w:p>
+    <w:p>
+      <w:pPr>
+        <w:spacing w:line="360" w:lineRule="auto"/>
+        <w:rPr>
+          <w:i/>
+          <w:iCs/>
+          <w:u w:val="single"/>
+        </w:rPr>
+      </w:pPr>
+      <w:r>
+        <w:rPr>
+          <w:i/>
+          <w:iCs/>
+          <w:u w:val="single"/>
+        </w:rPr>
+        <w:t>Componenti e connettori</w:t>
+      </w:r>
+    </w:p>
+    <w:p>
+      <w:pPr>
+        <w:spacing w:line="360" w:lineRule="auto"/>
+      </w:pPr>
+      <w:r>
+        <w:t xml:space="preserve">Componenti principali: oggetti, Firebase, Client Browser, Spring, </w:t>
+      </w:r>
+      <w:proofErr w:type="spellStart"/>
+      <w:r>
+        <w:t>backend</w:t>
+      </w:r>
+      <w:proofErr w:type="spellEnd"/>
+      <w:r>
+        <w:t xml:space="preserve"> </w:t>
+      </w:r>
+      <w:proofErr w:type="spellStart"/>
+      <w:r>
+        <w:t>Vaadin</w:t>
+      </w:r>
+      <w:proofErr w:type="spellEnd"/>
+    </w:p>
+    <w:p>
+      <w:pPr>
+        <w:spacing w:line="360" w:lineRule="auto"/>
+      </w:pPr>
+      <w:r>
+        <w:t>Connettori principali: chiamate a Firebase, chiamate Spring (injection), chiamate HTTPS.</w:t>
+      </w:r>
+    </w:p>
+    <w:p>
+      <w:pPr>
+        <w:spacing w:line="360" w:lineRule="auto"/>
+        <w:rPr>
+          <w:i/>
+          <w:iCs/>
+          <w:u w:val="single"/>
+        </w:rPr>
+      </w:pPr>
+      <w:r>
+        <w:rPr>
+          <w:i/>
+          <w:iCs/>
+          <w:u w:val="single"/>
+        </w:rPr>
+        <w:t>Gestione delle dipendenze</w:t>
+      </w:r>
+    </w:p>
+    <w:p>
+      <w:pPr>
+        <w:spacing w:line="360" w:lineRule="auto"/>
+      </w:pPr>
+      <w:r>
+        <w:t>La gestione delle dipendenze è avvenuta tramite la loro aggiunta al POM tramite Maven.</w:t>
+      </w:r>
+    </w:p>
+    <w:p>
+      <w:pPr>
+        <w:spacing w:line="360" w:lineRule="auto"/>
+      </w:pPr>
+      <w:r>
+        <w:t>Sono state integrate differenti librerie tra le quali:</w:t>
+      </w:r>
+    </w:p>
+    <w:p>
+      <w:pPr>
+        <w:pStyle w:val="Paragrafoelenco"/>
+        <w:numPr>
+          <w:ilvl w:val="0"/>
+          <w:numId w:val="8"/>
+        </w:numPr>
+        <w:spacing w:line="360" w:lineRule="auto"/>
+      </w:pPr>
+      <w:r>
+        <w:t xml:space="preserve">Dipendenze Spring – per il corretto funzionamento di </w:t>
+      </w:r>
+      <w:proofErr w:type="spellStart"/>
+      <w:r>
+        <w:t>SpringBoot</w:t>
+      </w:r>
+      <w:proofErr w:type="spellEnd"/>
+      <w:r>
+        <w:t xml:space="preserve"> e Tomcat</w:t>
+      </w:r>
+    </w:p>
+    <w:p>
+      <w:pPr>
+        <w:pStyle w:val="Paragrafoelenco"/>
+        <w:numPr>
+          <w:ilvl w:val="0"/>
+          <w:numId w:val="8"/>
+        </w:numPr>
+        <w:spacing w:line="360" w:lineRule="auto"/>
+      </w:pPr>
+      <w:r>
+        <w:t xml:space="preserve">Dipendenze </w:t>
+      </w:r>
+      <w:proofErr w:type="spellStart"/>
+      <w:r>
+        <w:t>Zxing</w:t>
+      </w:r>
+      <w:proofErr w:type="spellEnd"/>
+      <w:r>
+        <w:t xml:space="preserve"> – per la generazione dei QR code</w:t>
+      </w:r>
+    </w:p>
+    <w:p>
+      <w:pPr>
+        <w:pStyle w:val="Paragrafoelenco"/>
+        <w:numPr>
+          <w:ilvl w:val="0"/>
+          <w:numId w:val="8"/>
+        </w:numPr>
+        <w:spacing w:line="360" w:lineRule="auto"/>
+      </w:pPr>
+      <w:r>
+        <w:t xml:space="preserve">Dipendenze </w:t>
+      </w:r>
+      <w:proofErr w:type="spellStart"/>
+      <w:r>
+        <w:t>BCrypt</w:t>
+      </w:r>
+      <w:proofErr w:type="spellEnd"/>
+      <w:r>
+        <w:t xml:space="preserve"> – per la gestione di password criptate</w:t>
+      </w:r>
+    </w:p>
+    <w:p>
+      <w:pPr>
+        <w:pStyle w:val="Paragrafoelenco"/>
+        <w:numPr>
+          <w:ilvl w:val="0"/>
+          <w:numId w:val="8"/>
+        </w:numPr>
+        <w:spacing w:line="360" w:lineRule="auto"/>
+      </w:pPr>
+      <w:proofErr w:type="spellStart"/>
+      <w:r>
+        <w:t>ApexCharts</w:t>
+      </w:r>
+      <w:proofErr w:type="spellEnd"/>
+      <w:r>
+        <w:t xml:space="preserve"> – per grafici e statistiche</w:t>
+      </w:r>
+    </w:p>
+    <w:p>
+      <w:pPr>
+        <w:pStyle w:val="Paragrafoelenco"/>
+        <w:numPr>
+          <w:ilvl w:val="0"/>
+          <w:numId w:val="8"/>
+        </w:numPr>
+        <w:spacing w:line="360" w:lineRule="auto"/>
+      </w:pPr>
+      <w:proofErr w:type="spellStart"/>
+      <w:r>
+        <w:t>Vaadin</w:t>
+      </w:r>
+      <w:proofErr w:type="spellEnd"/>
+      <w:r>
+        <w:t xml:space="preserve"> – per completa gestione </w:t>
+      </w:r>
+      <w:proofErr w:type="spellStart"/>
+      <w:r>
+        <w:t>frontend</w:t>
+      </w:r>
+      <w:proofErr w:type="spellEnd"/>
+    </w:p>
+    <w:p>
+      <w:pPr>
+        <w:pStyle w:val="Paragrafoelenco"/>
+        <w:numPr>
+          <w:ilvl w:val="0"/>
+          <w:numId w:val="8"/>
+        </w:numPr>
+        <w:spacing w:line="360" w:lineRule="auto"/>
+      </w:pPr>
+      <w:r>
+        <w:t xml:space="preserve">LogJ4 – per log errori </w:t>
+      </w:r>
+    </w:p>
+    <w:p>
+      <w:pPr>
+        <w:spacing w:line="360" w:lineRule="auto"/>
+      </w:pPr>
+    </w:p>
+    <w:p>
+      <w:pPr>
+        <w:pStyle w:val="Paragrafoelenco"/>
+        <w:ind w:left="1440"/>
+      </w:pPr>
+    </w:p>
+    <w:p>
+      <w:pPr>
+        <w:pStyle w:val="Paragrafoelenco"/>
+        <w:ind w:left="1440"/>
+      </w:pPr>
+    </w:p>
+    <w:p>
+      <w:pPr>
+        <w:pStyle w:val="Paragrafoelenco"/>
+        <w:ind w:left="1440"/>
+      </w:pPr>
+    </w:p>
+    <w:p>
+      <w:r>
+        <w:tab/>
+      </w:r>
+    </w:p>
+    <w:p>
+      <w:pPr>
         <w:rPr>
           <w:b/>
           <w:bCs/>
         </w:rPr>
-        <w:t>Desing</w:t>
-      </w:r>
-      <w:proofErr w:type="spellEnd"/>
-    </w:p>
-    <w:p>
-      <w:r>
+      </w:pPr>
+      <w:r>
+        <w:rPr>
+          <w:b/>
+          <w:bCs/>
+        </w:rPr>
+        <w:t>Software Desing</w:t>
+      </w:r>
+    </w:p>
+    <w:p>
+      <w:r>
+        <w:lastRenderedPageBreak/>
         <w:t xml:space="preserve">DEVE contenere una descrizione del design (mediante i diagrammi UML va bene) POTREBBE contenere un calcolo di complessità (ad esempio con McCabe) di una piccola parte DOVREBBE contenere qualche misurazione del codice, (con qualche metrica che abbiamo visto). Alcuni tools che vedremo a lezione: </w:t>
       </w:r>
       <w:proofErr w:type="spellStart"/>
@@ -323,6 +975,196 @@
       </w:r>
     </w:p>
     <w:p/>
+    <w:p>
+      <w:pPr>
+        <w:rPr>
+          <w:i/>
+          <w:iCs/>
+          <w:u w:val="single"/>
+        </w:rPr>
+      </w:pPr>
+      <w:r>
+        <w:rPr>
+          <w:i/>
+          <w:iCs/>
+          <w:u w:val="single"/>
+        </w:rPr>
+        <w:t>Design patterns</w:t>
+      </w:r>
+    </w:p>
+    <w:p>
+      <w:r>
+        <w:t>Il progetto sfrutta Design Pattern quali:</w:t>
+      </w:r>
+    </w:p>
+    <w:p>
+      <w:pPr>
+        <w:numPr>
+          <w:ilvl w:val="0"/>
+          <w:numId w:val="9"/>
+        </w:numPr>
+      </w:pPr>
+      <w:r>
+        <w:t>Singleton</w:t>
+      </w:r>
+      <w:r>
+        <w:t xml:space="preserve"> Pattern</w:t>
+      </w:r>
+      <w:r>
+        <w:t>: utilizzo di @Service e @Repository garantisce la creazione di una sola istanza di quella classe</w:t>
+      </w:r>
+    </w:p>
+    <w:p>
+      <w:pPr>
+        <w:numPr>
+          <w:ilvl w:val="0"/>
+          <w:numId w:val="9"/>
+        </w:numPr>
+      </w:pPr>
+      <w:r>
+        <w:t>Adapter</w:t>
+      </w:r>
+      <w:r>
+        <w:t xml:space="preserve"> Pattern</w:t>
+      </w:r>
+      <w:r>
+        <w:t>: utilizzo di interfacce permette di cambiare database in qualunque momento</w:t>
+      </w:r>
+    </w:p>
+    <w:p>
+      <w:pPr>
+        <w:numPr>
+          <w:ilvl w:val="0"/>
+          <w:numId w:val="9"/>
+        </w:numPr>
+      </w:pPr>
+      <w:r>
+        <w:t>Observer</w:t>
+      </w:r>
+      <w:r>
+        <w:t xml:space="preserve"> Pattern</w:t>
+      </w:r>
+      <w:r>
+        <w:t xml:space="preserve">: utilizzo di </w:t>
+      </w:r>
+      <w:proofErr w:type="spellStart"/>
+      <w:r>
+        <w:t>addClickListener</w:t>
+      </w:r>
+      <w:proofErr w:type="spellEnd"/>
+      <w:r>
+        <w:t xml:space="preserve"> per </w:t>
+      </w:r>
+      <w:proofErr w:type="spellStart"/>
+      <w:r>
+        <w:t>frontend</w:t>
+      </w:r>
+      <w:proofErr w:type="spellEnd"/>
+      <w:r>
+        <w:t xml:space="preserve"> e </w:t>
+      </w:r>
+      <w:proofErr w:type="spellStart"/>
+      <w:r>
+        <w:t>ValueEventListener</w:t>
+      </w:r>
+      <w:proofErr w:type="spellEnd"/>
+      <w:r>
+        <w:t xml:space="preserve"> per </w:t>
+      </w:r>
+      <w:proofErr w:type="spellStart"/>
+      <w:r>
+        <w:t>backend</w:t>
+      </w:r>
+      <w:proofErr w:type="spellEnd"/>
+    </w:p>
+    <w:p/>
+    <w:p>
+      <w:pPr>
+        <w:rPr>
+          <w:i/>
+          <w:iCs/>
+          <w:u w:val="single"/>
+        </w:rPr>
+      </w:pPr>
+      <w:r>
+        <w:rPr>
+          <w:i/>
+          <w:iCs/>
+          <w:u w:val="single"/>
+        </w:rPr>
+        <w:t>Metriche del codice</w:t>
+      </w:r>
+    </w:p>
+    <w:p>
+      <w:r>
+        <w:t>È stata effettuata un’analisi del codice e sono emersi i seguenti dati.</w:t>
+      </w:r>
+    </w:p>
+    <w:p>
+      <w:pPr>
+        <w:pStyle w:val="Paragrafoelenco"/>
+        <w:numPr>
+          <w:ilvl w:val="0"/>
+          <w:numId w:val="10"/>
+        </w:numPr>
+        <w:spacing w:line="360" w:lineRule="auto"/>
+      </w:pPr>
+      <w:r>
+        <w:t xml:space="preserve">Lines of Code (LOC) : </w:t>
+      </w:r>
+    </w:p>
+    <w:p>
+      <w:pPr>
+        <w:pStyle w:val="Paragrafoelenco"/>
+        <w:numPr>
+          <w:ilvl w:val="0"/>
+          <w:numId w:val="10"/>
+        </w:numPr>
+        <w:spacing w:line="360" w:lineRule="auto"/>
+      </w:pPr>
+      <w:r>
+        <w:t xml:space="preserve">Numero classi: </w:t>
+      </w:r>
+    </w:p>
+    <w:p>
+      <w:pPr>
+        <w:pStyle w:val="Paragrafoelenco"/>
+        <w:numPr>
+          <w:ilvl w:val="0"/>
+          <w:numId w:val="10"/>
+        </w:numPr>
+        <w:spacing w:line="360" w:lineRule="auto"/>
+      </w:pPr>
+      <w:r>
+        <w:t xml:space="preserve">Complessità </w:t>
+      </w:r>
+      <w:proofErr w:type="spellStart"/>
+      <w:r>
+        <w:t>ciclomatica</w:t>
+      </w:r>
+      <w:proofErr w:type="spellEnd"/>
+      <w:r>
+        <w:t xml:space="preserve"> (McCabe): </w:t>
+      </w:r>
+    </w:p>
+    <w:p>
+      <w:pPr>
+        <w:pStyle w:val="Paragrafoelenco"/>
+        <w:numPr>
+          <w:ilvl w:val="0"/>
+          <w:numId w:val="10"/>
+        </w:numPr>
+        <w:spacing w:line="360" w:lineRule="auto"/>
+      </w:pPr>
+      <w:proofErr w:type="spellStart"/>
+      <w:r>
+        <w:t>Pollution</w:t>
+      </w:r>
+      <w:proofErr w:type="spellEnd"/>
+      <w:r>
+        <w:t xml:space="preserve"> alla consegna: </w:t>
+      </w:r>
+    </w:p>
     <w:p/>
     <w:sectPr>
       <w:pgSz w:w="11906" w:h="16838"/>
@@ -332,6 +1174,1714 @@
     </w:sectPr>
   </w:body>
 </w:document>
+</file>
+
+<file path=word/numbering.xml><?xml version="1.0" encoding="utf-8"?>
+<w:numbering xmlns:wpc="http://schemas.microsoft.com/office/word/2010/wordprocessingCanvas" xmlns:cx="http://schemas.microsoft.com/office/drawing/2014/chartex" xmlns:cx1="http://schemas.microsoft.com/office/drawing/2015/9/8/chartex" xmlns:cx2="http://schemas.microsoft.com/office/drawing/2015/10/21/chartex" xmlns:cx3="http://schemas.microsoft.com/office/drawing/2016/5/9/chartex" xmlns:cx4="http://schemas.microsoft.com/office/drawing/2016/5/10/chartex" xmlns:cx5="http://schemas.microsoft.com/office/drawing/2016/5/11/chartex" xmlns:cx6="http://schemas.microsoft.com/office/drawing/2016/5/12/chartex" xmlns:cx7="http://schemas.microsoft.com/office/drawing/2016/5/13/chartex" xmlns:cx8="http://schemas.microsoft.com/office/drawing/2016/5/14/chartex" xmlns:mc="http://schemas.openxmlformats.org/markup-compatibility/2006" xmlns:aink="http://schemas.microsoft.com/office/drawing/2016/ink" xmlns:am3d="http://schemas.microsoft.com/office/drawing/2017/model3d" xmlns:o="urn:schemas-microsoft-com:office:office" xmlns:oel="http://schemas.microsoft.com/office/2019/extlst" xmlns:r="http://schemas.openxmlformats.org/officeDocument/2006/relationships" xmlns:m="http://schemas.openxmlformats.org/officeDocument/2006/math" xmlns:v="urn:schemas-microsoft-com:vml" xmlns:wp14="http://schemas.microsoft.com/office/word/2010/wordprocessingDrawing" xmlns:wp="http://schemas.openxmlformats.org/drawingml/2006/wordprocessingDrawing" xmlns:w10="urn:schemas-microsoft-com:office:word" xmlns:w="http://schemas.openxmlformats.org/wordprocessingml/2006/main" xmlns:w14="http://schemas.microsoft.com/office/word/2010/wordml" xmlns:w15="http://schemas.microsoft.com/office/word/2012/wordml" xmlns:w16cex="http://schemas.microsoft.com/office/word/2018/wordml/cex" xmlns:w16cid="http://schemas.microsoft.com/office/word/2016/wordml/cid" xmlns:w16="http://schemas.microsoft.com/office/word/2018/wordml" xmlns:w16du="http://schemas.microsoft.com/office/word/2023/wordml/word16du" xmlns:w16sdtdh="http://schemas.microsoft.com/office/word/2020/wordml/sdtdatahash" xmlns:w16sdtfl="http://schemas.microsoft.com/office/word/2024/wordml/sdtformatlock" xmlns:w16se="http://schemas.microsoft.com/office/word/2015/wordml/symex" xmlns:wpg="http://schemas.microsoft.com/office/word/2010/wordprocessingGroup" xmlns:wpi="http://schemas.microsoft.com/office/word/2010/wordprocessingInk" xmlns:wne="http://schemas.microsoft.com/office/word/2006/wordml" xmlns:wps="http://schemas.microsoft.com/office/word/2010/wordprocessingShape" mc:Ignorable="w14 w15 w16se w16cid w16 w16cex w16sdtdh w16sdtfl w16du wp14">
+  <w:abstractNum w:abstractNumId="0" w15:restartNumberingAfterBreak="0">
+    <w:nsid w:val="0A424067"/>
+    <w:multiLevelType w:val="hybridMultilevel"/>
+    <w:tmpl w:val="215E6544"/>
+    <w:lvl w:ilvl="0" w:tplc="B8565CB0">
+      <w:start w:val="1"/>
+      <w:numFmt w:val="decimal"/>
+      <w:lvlText w:val="%1-"/>
+      <w:lvlJc w:val="left"/>
+      <w:pPr>
+        <w:ind w:left="720" w:hanging="360"/>
+      </w:pPr>
+      <w:rPr>
+        <w:rFonts w:hint="default"/>
+      </w:rPr>
+    </w:lvl>
+    <w:lvl w:ilvl="1" w:tplc="04100019">
+      <w:start w:val="1"/>
+      <w:numFmt w:val="lowerLetter"/>
+      <w:lvlText w:val="%2."/>
+      <w:lvlJc w:val="left"/>
+      <w:pPr>
+        <w:ind w:left="1440" w:hanging="360"/>
+      </w:pPr>
+    </w:lvl>
+    <w:lvl w:ilvl="2" w:tplc="04100001">
+      <w:start w:val="1"/>
+      <w:numFmt w:val="bullet"/>
+      <w:lvlText w:val=""/>
+      <w:lvlJc w:val="left"/>
+      <w:pPr>
+        <w:ind w:left="2340" w:hanging="360"/>
+      </w:pPr>
+      <w:rPr>
+        <w:rFonts w:ascii="Symbol" w:hAnsi="Symbol" w:hint="default"/>
+      </w:rPr>
+    </w:lvl>
+    <w:lvl w:ilvl="3" w:tplc="0410000F" w:tentative="1">
+      <w:start w:val="1"/>
+      <w:numFmt w:val="decimal"/>
+      <w:lvlText w:val="%4."/>
+      <w:lvlJc w:val="left"/>
+      <w:pPr>
+        <w:ind w:left="2880" w:hanging="360"/>
+      </w:pPr>
+    </w:lvl>
+    <w:lvl w:ilvl="4" w:tplc="04100019" w:tentative="1">
+      <w:start w:val="1"/>
+      <w:numFmt w:val="lowerLetter"/>
+      <w:lvlText w:val="%5."/>
+      <w:lvlJc w:val="left"/>
+      <w:pPr>
+        <w:ind w:left="3600" w:hanging="360"/>
+      </w:pPr>
+    </w:lvl>
+    <w:lvl w:ilvl="5" w:tplc="0410001B" w:tentative="1">
+      <w:start w:val="1"/>
+      <w:numFmt w:val="lowerRoman"/>
+      <w:lvlText w:val="%6."/>
+      <w:lvlJc w:val="right"/>
+      <w:pPr>
+        <w:ind w:left="4320" w:hanging="180"/>
+      </w:pPr>
+    </w:lvl>
+    <w:lvl w:ilvl="6" w:tplc="0410000F" w:tentative="1">
+      <w:start w:val="1"/>
+      <w:numFmt w:val="decimal"/>
+      <w:lvlText w:val="%7."/>
+      <w:lvlJc w:val="left"/>
+      <w:pPr>
+        <w:ind w:left="5040" w:hanging="360"/>
+      </w:pPr>
+    </w:lvl>
+    <w:lvl w:ilvl="7" w:tplc="04100019" w:tentative="1">
+      <w:start w:val="1"/>
+      <w:numFmt w:val="lowerLetter"/>
+      <w:lvlText w:val="%8."/>
+      <w:lvlJc w:val="left"/>
+      <w:pPr>
+        <w:ind w:left="5760" w:hanging="360"/>
+      </w:pPr>
+    </w:lvl>
+    <w:lvl w:ilvl="8" w:tplc="0410001B" w:tentative="1">
+      <w:start w:val="1"/>
+      <w:numFmt w:val="lowerRoman"/>
+      <w:lvlText w:val="%9."/>
+      <w:lvlJc w:val="right"/>
+      <w:pPr>
+        <w:ind w:left="6480" w:hanging="180"/>
+      </w:pPr>
+    </w:lvl>
+  </w:abstractNum>
+  <w:abstractNum w:abstractNumId="1" w15:restartNumberingAfterBreak="0">
+    <w:nsid w:val="0F9A393F"/>
+    <w:multiLevelType w:val="hybridMultilevel"/>
+    <w:tmpl w:val="EE8AE3E0"/>
+    <w:lvl w:ilvl="0" w:tplc="04100001">
+      <w:start w:val="1"/>
+      <w:numFmt w:val="bullet"/>
+      <w:lvlText w:val=""/>
+      <w:lvlJc w:val="left"/>
+      <w:pPr>
+        <w:ind w:left="1440" w:hanging="360"/>
+      </w:pPr>
+      <w:rPr>
+        <w:rFonts w:ascii="Symbol" w:hAnsi="Symbol" w:hint="default"/>
+      </w:rPr>
+    </w:lvl>
+    <w:lvl w:ilvl="1" w:tplc="04100003" w:tentative="1">
+      <w:start w:val="1"/>
+      <w:numFmt w:val="bullet"/>
+      <w:lvlText w:val="o"/>
+      <w:lvlJc w:val="left"/>
+      <w:pPr>
+        <w:ind w:left="2160" w:hanging="360"/>
+      </w:pPr>
+      <w:rPr>
+        <w:rFonts w:ascii="Courier New" w:hAnsi="Courier New" w:cs="Courier New" w:hint="default"/>
+      </w:rPr>
+    </w:lvl>
+    <w:lvl w:ilvl="2" w:tplc="04100005" w:tentative="1">
+      <w:start w:val="1"/>
+      <w:numFmt w:val="bullet"/>
+      <w:lvlText w:val=""/>
+      <w:lvlJc w:val="left"/>
+      <w:pPr>
+        <w:ind w:left="2880" w:hanging="360"/>
+      </w:pPr>
+      <w:rPr>
+        <w:rFonts w:ascii="Wingdings" w:hAnsi="Wingdings" w:hint="default"/>
+      </w:rPr>
+    </w:lvl>
+    <w:lvl w:ilvl="3" w:tplc="04100001" w:tentative="1">
+      <w:start w:val="1"/>
+      <w:numFmt w:val="bullet"/>
+      <w:lvlText w:val=""/>
+      <w:lvlJc w:val="left"/>
+      <w:pPr>
+        <w:ind w:left="3600" w:hanging="360"/>
+      </w:pPr>
+      <w:rPr>
+        <w:rFonts w:ascii="Symbol" w:hAnsi="Symbol" w:hint="default"/>
+      </w:rPr>
+    </w:lvl>
+    <w:lvl w:ilvl="4" w:tplc="04100003" w:tentative="1">
+      <w:start w:val="1"/>
+      <w:numFmt w:val="bullet"/>
+      <w:lvlText w:val="o"/>
+      <w:lvlJc w:val="left"/>
+      <w:pPr>
+        <w:ind w:left="4320" w:hanging="360"/>
+      </w:pPr>
+      <w:rPr>
+        <w:rFonts w:ascii="Courier New" w:hAnsi="Courier New" w:cs="Courier New" w:hint="default"/>
+      </w:rPr>
+    </w:lvl>
+    <w:lvl w:ilvl="5" w:tplc="04100005" w:tentative="1">
+      <w:start w:val="1"/>
+      <w:numFmt w:val="bullet"/>
+      <w:lvlText w:val=""/>
+      <w:lvlJc w:val="left"/>
+      <w:pPr>
+        <w:ind w:left="5040" w:hanging="360"/>
+      </w:pPr>
+      <w:rPr>
+        <w:rFonts w:ascii="Wingdings" w:hAnsi="Wingdings" w:hint="default"/>
+      </w:rPr>
+    </w:lvl>
+    <w:lvl w:ilvl="6" w:tplc="04100001" w:tentative="1">
+      <w:start w:val="1"/>
+      <w:numFmt w:val="bullet"/>
+      <w:lvlText w:val=""/>
+      <w:lvlJc w:val="left"/>
+      <w:pPr>
+        <w:ind w:left="5760" w:hanging="360"/>
+      </w:pPr>
+      <w:rPr>
+        <w:rFonts w:ascii="Symbol" w:hAnsi="Symbol" w:hint="default"/>
+      </w:rPr>
+    </w:lvl>
+    <w:lvl w:ilvl="7" w:tplc="04100003" w:tentative="1">
+      <w:start w:val="1"/>
+      <w:numFmt w:val="bullet"/>
+      <w:lvlText w:val="o"/>
+      <w:lvlJc w:val="left"/>
+      <w:pPr>
+        <w:ind w:left="6480" w:hanging="360"/>
+      </w:pPr>
+      <w:rPr>
+        <w:rFonts w:ascii="Courier New" w:hAnsi="Courier New" w:cs="Courier New" w:hint="default"/>
+      </w:rPr>
+    </w:lvl>
+    <w:lvl w:ilvl="8" w:tplc="04100005" w:tentative="1">
+      <w:start w:val="1"/>
+      <w:numFmt w:val="bullet"/>
+      <w:lvlText w:val=""/>
+      <w:lvlJc w:val="left"/>
+      <w:pPr>
+        <w:ind w:left="7200" w:hanging="360"/>
+      </w:pPr>
+      <w:rPr>
+        <w:rFonts w:ascii="Wingdings" w:hAnsi="Wingdings" w:hint="default"/>
+      </w:rPr>
+    </w:lvl>
+  </w:abstractNum>
+  <w:abstractNum w:abstractNumId="2" w15:restartNumberingAfterBreak="0">
+    <w:nsid w:val="172176E1"/>
+    <w:multiLevelType w:val="multilevel"/>
+    <w:tmpl w:val="E30E1DF2"/>
+    <w:lvl w:ilvl="0">
+      <w:start w:val="1"/>
+      <w:numFmt w:val="bullet"/>
+      <w:lvlText w:val=""/>
+      <w:lvlJc w:val="left"/>
+      <w:pPr>
+        <w:tabs>
+          <w:tab w:val="num" w:pos="2484"/>
+        </w:tabs>
+        <w:ind w:left="2484" w:hanging="360"/>
+      </w:pPr>
+      <w:rPr>
+        <w:rFonts w:ascii="Symbol" w:hAnsi="Symbol" w:hint="default"/>
+        <w:sz w:val="20"/>
+      </w:rPr>
+    </w:lvl>
+    <w:lvl w:ilvl="1" w:tentative="1">
+      <w:start w:val="1"/>
+      <w:numFmt w:val="bullet"/>
+      <w:lvlText w:val="o"/>
+      <w:lvlJc w:val="left"/>
+      <w:pPr>
+        <w:tabs>
+          <w:tab w:val="num" w:pos="3204"/>
+        </w:tabs>
+        <w:ind w:left="3204" w:hanging="360"/>
+      </w:pPr>
+      <w:rPr>
+        <w:rFonts w:ascii="Courier New" w:hAnsi="Courier New" w:hint="default"/>
+        <w:sz w:val="20"/>
+      </w:rPr>
+    </w:lvl>
+    <w:lvl w:ilvl="2" w:tentative="1">
+      <w:start w:val="1"/>
+      <w:numFmt w:val="bullet"/>
+      <w:lvlText w:val=""/>
+      <w:lvlJc w:val="left"/>
+      <w:pPr>
+        <w:tabs>
+          <w:tab w:val="num" w:pos="3924"/>
+        </w:tabs>
+        <w:ind w:left="3924" w:hanging="360"/>
+      </w:pPr>
+      <w:rPr>
+        <w:rFonts w:ascii="Wingdings" w:hAnsi="Wingdings" w:hint="default"/>
+        <w:sz w:val="20"/>
+      </w:rPr>
+    </w:lvl>
+    <w:lvl w:ilvl="3" w:tentative="1">
+      <w:start w:val="1"/>
+      <w:numFmt w:val="bullet"/>
+      <w:lvlText w:val=""/>
+      <w:lvlJc w:val="left"/>
+      <w:pPr>
+        <w:tabs>
+          <w:tab w:val="num" w:pos="4644"/>
+        </w:tabs>
+        <w:ind w:left="4644" w:hanging="360"/>
+      </w:pPr>
+      <w:rPr>
+        <w:rFonts w:ascii="Wingdings" w:hAnsi="Wingdings" w:hint="default"/>
+        <w:sz w:val="20"/>
+      </w:rPr>
+    </w:lvl>
+    <w:lvl w:ilvl="4" w:tentative="1">
+      <w:start w:val="1"/>
+      <w:numFmt w:val="bullet"/>
+      <w:lvlText w:val=""/>
+      <w:lvlJc w:val="left"/>
+      <w:pPr>
+        <w:tabs>
+          <w:tab w:val="num" w:pos="5364"/>
+        </w:tabs>
+        <w:ind w:left="5364" w:hanging="360"/>
+      </w:pPr>
+      <w:rPr>
+        <w:rFonts w:ascii="Wingdings" w:hAnsi="Wingdings" w:hint="default"/>
+        <w:sz w:val="20"/>
+      </w:rPr>
+    </w:lvl>
+    <w:lvl w:ilvl="5" w:tentative="1">
+      <w:start w:val="1"/>
+      <w:numFmt w:val="bullet"/>
+      <w:lvlText w:val=""/>
+      <w:lvlJc w:val="left"/>
+      <w:pPr>
+        <w:tabs>
+          <w:tab w:val="num" w:pos="6084"/>
+        </w:tabs>
+        <w:ind w:left="6084" w:hanging="360"/>
+      </w:pPr>
+      <w:rPr>
+        <w:rFonts w:ascii="Wingdings" w:hAnsi="Wingdings" w:hint="default"/>
+        <w:sz w:val="20"/>
+      </w:rPr>
+    </w:lvl>
+    <w:lvl w:ilvl="6" w:tentative="1">
+      <w:start w:val="1"/>
+      <w:numFmt w:val="bullet"/>
+      <w:lvlText w:val=""/>
+      <w:lvlJc w:val="left"/>
+      <w:pPr>
+        <w:tabs>
+          <w:tab w:val="num" w:pos="6804"/>
+        </w:tabs>
+        <w:ind w:left="6804" w:hanging="360"/>
+      </w:pPr>
+      <w:rPr>
+        <w:rFonts w:ascii="Wingdings" w:hAnsi="Wingdings" w:hint="default"/>
+        <w:sz w:val="20"/>
+      </w:rPr>
+    </w:lvl>
+    <w:lvl w:ilvl="7" w:tentative="1">
+      <w:start w:val="1"/>
+      <w:numFmt w:val="bullet"/>
+      <w:lvlText w:val=""/>
+      <w:lvlJc w:val="left"/>
+      <w:pPr>
+        <w:tabs>
+          <w:tab w:val="num" w:pos="7524"/>
+        </w:tabs>
+        <w:ind w:left="7524" w:hanging="360"/>
+      </w:pPr>
+      <w:rPr>
+        <w:rFonts w:ascii="Wingdings" w:hAnsi="Wingdings" w:hint="default"/>
+        <w:sz w:val="20"/>
+      </w:rPr>
+    </w:lvl>
+    <w:lvl w:ilvl="8" w:tentative="1">
+      <w:start w:val="1"/>
+      <w:numFmt w:val="bullet"/>
+      <w:lvlText w:val=""/>
+      <w:lvlJc w:val="left"/>
+      <w:pPr>
+        <w:tabs>
+          <w:tab w:val="num" w:pos="8244"/>
+        </w:tabs>
+        <w:ind w:left="8244" w:hanging="360"/>
+      </w:pPr>
+      <w:rPr>
+        <w:rFonts w:ascii="Wingdings" w:hAnsi="Wingdings" w:hint="default"/>
+        <w:sz w:val="20"/>
+      </w:rPr>
+    </w:lvl>
+  </w:abstractNum>
+  <w:abstractNum w:abstractNumId="3" w15:restartNumberingAfterBreak="0">
+    <w:nsid w:val="2D943FEB"/>
+    <w:multiLevelType w:val="multilevel"/>
+    <w:tmpl w:val="E30E1DF2"/>
+    <w:lvl w:ilvl="0">
+      <w:start w:val="1"/>
+      <w:numFmt w:val="bullet"/>
+      <w:lvlText w:val=""/>
+      <w:lvlJc w:val="left"/>
+      <w:pPr>
+        <w:tabs>
+          <w:tab w:val="num" w:pos="2484"/>
+        </w:tabs>
+        <w:ind w:left="2484" w:hanging="360"/>
+      </w:pPr>
+      <w:rPr>
+        <w:rFonts w:ascii="Symbol" w:hAnsi="Symbol" w:hint="default"/>
+        <w:sz w:val="20"/>
+      </w:rPr>
+    </w:lvl>
+    <w:lvl w:ilvl="1" w:tentative="1">
+      <w:start w:val="1"/>
+      <w:numFmt w:val="bullet"/>
+      <w:lvlText w:val="o"/>
+      <w:lvlJc w:val="left"/>
+      <w:pPr>
+        <w:tabs>
+          <w:tab w:val="num" w:pos="3204"/>
+        </w:tabs>
+        <w:ind w:left="3204" w:hanging="360"/>
+      </w:pPr>
+      <w:rPr>
+        <w:rFonts w:ascii="Courier New" w:hAnsi="Courier New" w:hint="default"/>
+        <w:sz w:val="20"/>
+      </w:rPr>
+    </w:lvl>
+    <w:lvl w:ilvl="2" w:tentative="1">
+      <w:start w:val="1"/>
+      <w:numFmt w:val="bullet"/>
+      <w:lvlText w:val=""/>
+      <w:lvlJc w:val="left"/>
+      <w:pPr>
+        <w:tabs>
+          <w:tab w:val="num" w:pos="3924"/>
+        </w:tabs>
+        <w:ind w:left="3924" w:hanging="360"/>
+      </w:pPr>
+      <w:rPr>
+        <w:rFonts w:ascii="Wingdings" w:hAnsi="Wingdings" w:hint="default"/>
+        <w:sz w:val="20"/>
+      </w:rPr>
+    </w:lvl>
+    <w:lvl w:ilvl="3" w:tentative="1">
+      <w:start w:val="1"/>
+      <w:numFmt w:val="bullet"/>
+      <w:lvlText w:val=""/>
+      <w:lvlJc w:val="left"/>
+      <w:pPr>
+        <w:tabs>
+          <w:tab w:val="num" w:pos="4644"/>
+        </w:tabs>
+        <w:ind w:left="4644" w:hanging="360"/>
+      </w:pPr>
+      <w:rPr>
+        <w:rFonts w:ascii="Wingdings" w:hAnsi="Wingdings" w:hint="default"/>
+        <w:sz w:val="20"/>
+      </w:rPr>
+    </w:lvl>
+    <w:lvl w:ilvl="4" w:tentative="1">
+      <w:start w:val="1"/>
+      <w:numFmt w:val="bullet"/>
+      <w:lvlText w:val=""/>
+      <w:lvlJc w:val="left"/>
+      <w:pPr>
+        <w:tabs>
+          <w:tab w:val="num" w:pos="5364"/>
+        </w:tabs>
+        <w:ind w:left="5364" w:hanging="360"/>
+      </w:pPr>
+      <w:rPr>
+        <w:rFonts w:ascii="Wingdings" w:hAnsi="Wingdings" w:hint="default"/>
+        <w:sz w:val="20"/>
+      </w:rPr>
+    </w:lvl>
+    <w:lvl w:ilvl="5" w:tentative="1">
+      <w:start w:val="1"/>
+      <w:numFmt w:val="bullet"/>
+      <w:lvlText w:val=""/>
+      <w:lvlJc w:val="left"/>
+      <w:pPr>
+        <w:tabs>
+          <w:tab w:val="num" w:pos="6084"/>
+        </w:tabs>
+        <w:ind w:left="6084" w:hanging="360"/>
+      </w:pPr>
+      <w:rPr>
+        <w:rFonts w:ascii="Wingdings" w:hAnsi="Wingdings" w:hint="default"/>
+        <w:sz w:val="20"/>
+      </w:rPr>
+    </w:lvl>
+    <w:lvl w:ilvl="6" w:tentative="1">
+      <w:start w:val="1"/>
+      <w:numFmt w:val="bullet"/>
+      <w:lvlText w:val=""/>
+      <w:lvlJc w:val="left"/>
+      <w:pPr>
+        <w:tabs>
+          <w:tab w:val="num" w:pos="6804"/>
+        </w:tabs>
+        <w:ind w:left="6804" w:hanging="360"/>
+      </w:pPr>
+      <w:rPr>
+        <w:rFonts w:ascii="Wingdings" w:hAnsi="Wingdings" w:hint="default"/>
+        <w:sz w:val="20"/>
+      </w:rPr>
+    </w:lvl>
+    <w:lvl w:ilvl="7" w:tentative="1">
+      <w:start w:val="1"/>
+      <w:numFmt w:val="bullet"/>
+      <w:lvlText w:val=""/>
+      <w:lvlJc w:val="left"/>
+      <w:pPr>
+        <w:tabs>
+          <w:tab w:val="num" w:pos="7524"/>
+        </w:tabs>
+        <w:ind w:left="7524" w:hanging="360"/>
+      </w:pPr>
+      <w:rPr>
+        <w:rFonts w:ascii="Wingdings" w:hAnsi="Wingdings" w:hint="default"/>
+        <w:sz w:val="20"/>
+      </w:rPr>
+    </w:lvl>
+    <w:lvl w:ilvl="8" w:tentative="1">
+      <w:start w:val="1"/>
+      <w:numFmt w:val="bullet"/>
+      <w:lvlText w:val=""/>
+      <w:lvlJc w:val="left"/>
+      <w:pPr>
+        <w:tabs>
+          <w:tab w:val="num" w:pos="8244"/>
+        </w:tabs>
+        <w:ind w:left="8244" w:hanging="360"/>
+      </w:pPr>
+      <w:rPr>
+        <w:rFonts w:ascii="Wingdings" w:hAnsi="Wingdings" w:hint="default"/>
+        <w:sz w:val="20"/>
+      </w:rPr>
+    </w:lvl>
+  </w:abstractNum>
+  <w:abstractNum w:abstractNumId="4" w15:restartNumberingAfterBreak="0">
+    <w:nsid w:val="37C77CE8"/>
+    <w:multiLevelType w:val="hybridMultilevel"/>
+    <w:tmpl w:val="3370C034"/>
+    <w:lvl w:ilvl="0" w:tplc="04100005">
+      <w:start w:val="1"/>
+      <w:numFmt w:val="bullet"/>
+      <w:lvlText w:val=""/>
+      <w:lvlJc w:val="left"/>
+      <w:pPr>
+        <w:ind w:left="720" w:hanging="360"/>
+      </w:pPr>
+      <w:rPr>
+        <w:rFonts w:ascii="Wingdings" w:hAnsi="Wingdings" w:hint="default"/>
+      </w:rPr>
+    </w:lvl>
+    <w:lvl w:ilvl="1" w:tplc="04100003">
+      <w:start w:val="1"/>
+      <w:numFmt w:val="bullet"/>
+      <w:lvlText w:val="o"/>
+      <w:lvlJc w:val="left"/>
+      <w:pPr>
+        <w:ind w:left="1440" w:hanging="360"/>
+      </w:pPr>
+      <w:rPr>
+        <w:rFonts w:ascii="Courier New" w:hAnsi="Courier New" w:cs="Courier New" w:hint="default"/>
+      </w:rPr>
+    </w:lvl>
+    <w:lvl w:ilvl="2" w:tplc="04100005" w:tentative="1">
+      <w:start w:val="1"/>
+      <w:numFmt w:val="bullet"/>
+      <w:lvlText w:val=""/>
+      <w:lvlJc w:val="left"/>
+      <w:pPr>
+        <w:ind w:left="2160" w:hanging="360"/>
+      </w:pPr>
+      <w:rPr>
+        <w:rFonts w:ascii="Wingdings" w:hAnsi="Wingdings" w:hint="default"/>
+      </w:rPr>
+    </w:lvl>
+    <w:lvl w:ilvl="3" w:tplc="04100001" w:tentative="1">
+      <w:start w:val="1"/>
+      <w:numFmt w:val="bullet"/>
+      <w:lvlText w:val=""/>
+      <w:lvlJc w:val="left"/>
+      <w:pPr>
+        <w:ind w:left="2880" w:hanging="360"/>
+      </w:pPr>
+      <w:rPr>
+        <w:rFonts w:ascii="Symbol" w:hAnsi="Symbol" w:hint="default"/>
+      </w:rPr>
+    </w:lvl>
+    <w:lvl w:ilvl="4" w:tplc="04100003" w:tentative="1">
+      <w:start w:val="1"/>
+      <w:numFmt w:val="bullet"/>
+      <w:lvlText w:val="o"/>
+      <w:lvlJc w:val="left"/>
+      <w:pPr>
+        <w:ind w:left="3600" w:hanging="360"/>
+      </w:pPr>
+      <w:rPr>
+        <w:rFonts w:ascii="Courier New" w:hAnsi="Courier New" w:cs="Courier New" w:hint="default"/>
+      </w:rPr>
+    </w:lvl>
+    <w:lvl w:ilvl="5" w:tplc="04100005" w:tentative="1">
+      <w:start w:val="1"/>
+      <w:numFmt w:val="bullet"/>
+      <w:lvlText w:val=""/>
+      <w:lvlJc w:val="left"/>
+      <w:pPr>
+        <w:ind w:left="4320" w:hanging="360"/>
+      </w:pPr>
+      <w:rPr>
+        <w:rFonts w:ascii="Wingdings" w:hAnsi="Wingdings" w:hint="default"/>
+      </w:rPr>
+    </w:lvl>
+    <w:lvl w:ilvl="6" w:tplc="04100001" w:tentative="1">
+      <w:start w:val="1"/>
+      <w:numFmt w:val="bullet"/>
+      <w:lvlText w:val=""/>
+      <w:lvlJc w:val="left"/>
+      <w:pPr>
+        <w:ind w:left="5040" w:hanging="360"/>
+      </w:pPr>
+      <w:rPr>
+        <w:rFonts w:ascii="Symbol" w:hAnsi="Symbol" w:hint="default"/>
+      </w:rPr>
+    </w:lvl>
+    <w:lvl w:ilvl="7" w:tplc="04100003" w:tentative="1">
+      <w:start w:val="1"/>
+      <w:numFmt w:val="bullet"/>
+      <w:lvlText w:val="o"/>
+      <w:lvlJc w:val="left"/>
+      <w:pPr>
+        <w:ind w:left="5760" w:hanging="360"/>
+      </w:pPr>
+      <w:rPr>
+        <w:rFonts w:ascii="Courier New" w:hAnsi="Courier New" w:cs="Courier New" w:hint="default"/>
+      </w:rPr>
+    </w:lvl>
+    <w:lvl w:ilvl="8" w:tplc="04100005" w:tentative="1">
+      <w:start w:val="1"/>
+      <w:numFmt w:val="bullet"/>
+      <w:lvlText w:val=""/>
+      <w:lvlJc w:val="left"/>
+      <w:pPr>
+        <w:ind w:left="6480" w:hanging="360"/>
+      </w:pPr>
+      <w:rPr>
+        <w:rFonts w:ascii="Wingdings" w:hAnsi="Wingdings" w:hint="default"/>
+      </w:rPr>
+    </w:lvl>
+  </w:abstractNum>
+  <w:abstractNum w:abstractNumId="5" w15:restartNumberingAfterBreak="0">
+    <w:nsid w:val="37FD367E"/>
+    <w:multiLevelType w:val="multilevel"/>
+    <w:tmpl w:val="E30E1DF2"/>
+    <w:lvl w:ilvl="0">
+      <w:start w:val="1"/>
+      <w:numFmt w:val="bullet"/>
+      <w:lvlText w:val=""/>
+      <w:lvlJc w:val="left"/>
+      <w:pPr>
+        <w:tabs>
+          <w:tab w:val="num" w:pos="2484"/>
+        </w:tabs>
+        <w:ind w:left="2484" w:hanging="360"/>
+      </w:pPr>
+      <w:rPr>
+        <w:rFonts w:ascii="Symbol" w:hAnsi="Symbol" w:hint="default"/>
+        <w:sz w:val="20"/>
+      </w:rPr>
+    </w:lvl>
+    <w:lvl w:ilvl="1">
+      <w:start w:val="1"/>
+      <w:numFmt w:val="bullet"/>
+      <w:lvlText w:val="o"/>
+      <w:lvlJc w:val="left"/>
+      <w:pPr>
+        <w:tabs>
+          <w:tab w:val="num" w:pos="3204"/>
+        </w:tabs>
+        <w:ind w:left="3204" w:hanging="360"/>
+      </w:pPr>
+      <w:rPr>
+        <w:rFonts w:ascii="Courier New" w:hAnsi="Courier New" w:hint="default"/>
+        <w:sz w:val="20"/>
+      </w:rPr>
+    </w:lvl>
+    <w:lvl w:ilvl="2">
+      <w:start w:val="1"/>
+      <w:numFmt w:val="bullet"/>
+      <w:lvlText w:val=""/>
+      <w:lvlJc w:val="left"/>
+      <w:pPr>
+        <w:tabs>
+          <w:tab w:val="num" w:pos="3924"/>
+        </w:tabs>
+        <w:ind w:left="3924" w:hanging="360"/>
+      </w:pPr>
+      <w:rPr>
+        <w:rFonts w:ascii="Wingdings" w:hAnsi="Wingdings" w:hint="default"/>
+        <w:sz w:val="20"/>
+      </w:rPr>
+    </w:lvl>
+    <w:lvl w:ilvl="3" w:tentative="1">
+      <w:start w:val="1"/>
+      <w:numFmt w:val="bullet"/>
+      <w:lvlText w:val=""/>
+      <w:lvlJc w:val="left"/>
+      <w:pPr>
+        <w:tabs>
+          <w:tab w:val="num" w:pos="4644"/>
+        </w:tabs>
+        <w:ind w:left="4644" w:hanging="360"/>
+      </w:pPr>
+      <w:rPr>
+        <w:rFonts w:ascii="Wingdings" w:hAnsi="Wingdings" w:hint="default"/>
+        <w:sz w:val="20"/>
+      </w:rPr>
+    </w:lvl>
+    <w:lvl w:ilvl="4" w:tentative="1">
+      <w:start w:val="1"/>
+      <w:numFmt w:val="bullet"/>
+      <w:lvlText w:val=""/>
+      <w:lvlJc w:val="left"/>
+      <w:pPr>
+        <w:tabs>
+          <w:tab w:val="num" w:pos="5364"/>
+        </w:tabs>
+        <w:ind w:left="5364" w:hanging="360"/>
+      </w:pPr>
+      <w:rPr>
+        <w:rFonts w:ascii="Wingdings" w:hAnsi="Wingdings" w:hint="default"/>
+        <w:sz w:val="20"/>
+      </w:rPr>
+    </w:lvl>
+    <w:lvl w:ilvl="5" w:tentative="1">
+      <w:start w:val="1"/>
+      <w:numFmt w:val="bullet"/>
+      <w:lvlText w:val=""/>
+      <w:lvlJc w:val="left"/>
+      <w:pPr>
+        <w:tabs>
+          <w:tab w:val="num" w:pos="6084"/>
+        </w:tabs>
+        <w:ind w:left="6084" w:hanging="360"/>
+      </w:pPr>
+      <w:rPr>
+        <w:rFonts w:ascii="Wingdings" w:hAnsi="Wingdings" w:hint="default"/>
+        <w:sz w:val="20"/>
+      </w:rPr>
+    </w:lvl>
+    <w:lvl w:ilvl="6" w:tentative="1">
+      <w:start w:val="1"/>
+      <w:numFmt w:val="bullet"/>
+      <w:lvlText w:val=""/>
+      <w:lvlJc w:val="left"/>
+      <w:pPr>
+        <w:tabs>
+          <w:tab w:val="num" w:pos="6804"/>
+        </w:tabs>
+        <w:ind w:left="6804" w:hanging="360"/>
+      </w:pPr>
+      <w:rPr>
+        <w:rFonts w:ascii="Wingdings" w:hAnsi="Wingdings" w:hint="default"/>
+        <w:sz w:val="20"/>
+      </w:rPr>
+    </w:lvl>
+    <w:lvl w:ilvl="7" w:tentative="1">
+      <w:start w:val="1"/>
+      <w:numFmt w:val="bullet"/>
+      <w:lvlText w:val=""/>
+      <w:lvlJc w:val="left"/>
+      <w:pPr>
+        <w:tabs>
+          <w:tab w:val="num" w:pos="7524"/>
+        </w:tabs>
+        <w:ind w:left="7524" w:hanging="360"/>
+      </w:pPr>
+      <w:rPr>
+        <w:rFonts w:ascii="Wingdings" w:hAnsi="Wingdings" w:hint="default"/>
+        <w:sz w:val="20"/>
+      </w:rPr>
+    </w:lvl>
+    <w:lvl w:ilvl="8" w:tentative="1">
+      <w:start w:val="1"/>
+      <w:numFmt w:val="bullet"/>
+      <w:lvlText w:val=""/>
+      <w:lvlJc w:val="left"/>
+      <w:pPr>
+        <w:tabs>
+          <w:tab w:val="num" w:pos="8244"/>
+        </w:tabs>
+        <w:ind w:left="8244" w:hanging="360"/>
+      </w:pPr>
+      <w:rPr>
+        <w:rFonts w:ascii="Wingdings" w:hAnsi="Wingdings" w:hint="default"/>
+        <w:sz w:val="20"/>
+      </w:rPr>
+    </w:lvl>
+  </w:abstractNum>
+  <w:abstractNum w:abstractNumId="6" w15:restartNumberingAfterBreak="0">
+    <w:nsid w:val="3B6E340C"/>
+    <w:multiLevelType w:val="multilevel"/>
+    <w:tmpl w:val="E30E1DF2"/>
+    <w:lvl w:ilvl="0">
+      <w:start w:val="1"/>
+      <w:numFmt w:val="bullet"/>
+      <w:lvlText w:val=""/>
+      <w:lvlJc w:val="left"/>
+      <w:pPr>
+        <w:tabs>
+          <w:tab w:val="num" w:pos="2484"/>
+        </w:tabs>
+        <w:ind w:left="2484" w:hanging="360"/>
+      </w:pPr>
+      <w:rPr>
+        <w:rFonts w:ascii="Symbol" w:hAnsi="Symbol" w:hint="default"/>
+        <w:sz w:val="20"/>
+      </w:rPr>
+    </w:lvl>
+    <w:lvl w:ilvl="1" w:tentative="1">
+      <w:start w:val="1"/>
+      <w:numFmt w:val="bullet"/>
+      <w:lvlText w:val="o"/>
+      <w:lvlJc w:val="left"/>
+      <w:pPr>
+        <w:tabs>
+          <w:tab w:val="num" w:pos="3204"/>
+        </w:tabs>
+        <w:ind w:left="3204" w:hanging="360"/>
+      </w:pPr>
+      <w:rPr>
+        <w:rFonts w:ascii="Courier New" w:hAnsi="Courier New" w:hint="default"/>
+        <w:sz w:val="20"/>
+      </w:rPr>
+    </w:lvl>
+    <w:lvl w:ilvl="2" w:tentative="1">
+      <w:start w:val="1"/>
+      <w:numFmt w:val="bullet"/>
+      <w:lvlText w:val=""/>
+      <w:lvlJc w:val="left"/>
+      <w:pPr>
+        <w:tabs>
+          <w:tab w:val="num" w:pos="3924"/>
+        </w:tabs>
+        <w:ind w:left="3924" w:hanging="360"/>
+      </w:pPr>
+      <w:rPr>
+        <w:rFonts w:ascii="Wingdings" w:hAnsi="Wingdings" w:hint="default"/>
+        <w:sz w:val="20"/>
+      </w:rPr>
+    </w:lvl>
+    <w:lvl w:ilvl="3" w:tentative="1">
+      <w:start w:val="1"/>
+      <w:numFmt w:val="bullet"/>
+      <w:lvlText w:val=""/>
+      <w:lvlJc w:val="left"/>
+      <w:pPr>
+        <w:tabs>
+          <w:tab w:val="num" w:pos="4644"/>
+        </w:tabs>
+        <w:ind w:left="4644" w:hanging="360"/>
+      </w:pPr>
+      <w:rPr>
+        <w:rFonts w:ascii="Wingdings" w:hAnsi="Wingdings" w:hint="default"/>
+        <w:sz w:val="20"/>
+      </w:rPr>
+    </w:lvl>
+    <w:lvl w:ilvl="4" w:tentative="1">
+      <w:start w:val="1"/>
+      <w:numFmt w:val="bullet"/>
+      <w:lvlText w:val=""/>
+      <w:lvlJc w:val="left"/>
+      <w:pPr>
+        <w:tabs>
+          <w:tab w:val="num" w:pos="5364"/>
+        </w:tabs>
+        <w:ind w:left="5364" w:hanging="360"/>
+      </w:pPr>
+      <w:rPr>
+        <w:rFonts w:ascii="Wingdings" w:hAnsi="Wingdings" w:hint="default"/>
+        <w:sz w:val="20"/>
+      </w:rPr>
+    </w:lvl>
+    <w:lvl w:ilvl="5" w:tentative="1">
+      <w:start w:val="1"/>
+      <w:numFmt w:val="bullet"/>
+      <w:lvlText w:val=""/>
+      <w:lvlJc w:val="left"/>
+      <w:pPr>
+        <w:tabs>
+          <w:tab w:val="num" w:pos="6084"/>
+        </w:tabs>
+        <w:ind w:left="6084" w:hanging="360"/>
+      </w:pPr>
+      <w:rPr>
+        <w:rFonts w:ascii="Wingdings" w:hAnsi="Wingdings" w:hint="default"/>
+        <w:sz w:val="20"/>
+      </w:rPr>
+    </w:lvl>
+    <w:lvl w:ilvl="6" w:tentative="1">
+      <w:start w:val="1"/>
+      <w:numFmt w:val="bullet"/>
+      <w:lvlText w:val=""/>
+      <w:lvlJc w:val="left"/>
+      <w:pPr>
+        <w:tabs>
+          <w:tab w:val="num" w:pos="6804"/>
+        </w:tabs>
+        <w:ind w:left="6804" w:hanging="360"/>
+      </w:pPr>
+      <w:rPr>
+        <w:rFonts w:ascii="Wingdings" w:hAnsi="Wingdings" w:hint="default"/>
+        <w:sz w:val="20"/>
+      </w:rPr>
+    </w:lvl>
+    <w:lvl w:ilvl="7" w:tentative="1">
+      <w:start w:val="1"/>
+      <w:numFmt w:val="bullet"/>
+      <w:lvlText w:val=""/>
+      <w:lvlJc w:val="left"/>
+      <w:pPr>
+        <w:tabs>
+          <w:tab w:val="num" w:pos="7524"/>
+        </w:tabs>
+        <w:ind w:left="7524" w:hanging="360"/>
+      </w:pPr>
+      <w:rPr>
+        <w:rFonts w:ascii="Wingdings" w:hAnsi="Wingdings" w:hint="default"/>
+        <w:sz w:val="20"/>
+      </w:rPr>
+    </w:lvl>
+    <w:lvl w:ilvl="8" w:tentative="1">
+      <w:start w:val="1"/>
+      <w:numFmt w:val="bullet"/>
+      <w:lvlText w:val=""/>
+      <w:lvlJc w:val="left"/>
+      <w:pPr>
+        <w:tabs>
+          <w:tab w:val="num" w:pos="8244"/>
+        </w:tabs>
+        <w:ind w:left="8244" w:hanging="360"/>
+      </w:pPr>
+      <w:rPr>
+        <w:rFonts w:ascii="Wingdings" w:hAnsi="Wingdings" w:hint="default"/>
+        <w:sz w:val="20"/>
+      </w:rPr>
+    </w:lvl>
+  </w:abstractNum>
+  <w:abstractNum w:abstractNumId="7" w15:restartNumberingAfterBreak="0">
+    <w:nsid w:val="44900B77"/>
+    <w:multiLevelType w:val="hybridMultilevel"/>
+    <w:tmpl w:val="0080A08C"/>
+    <w:lvl w:ilvl="0" w:tplc="04100005">
+      <w:start w:val="1"/>
+      <w:numFmt w:val="bullet"/>
+      <w:lvlText w:val=""/>
+      <w:lvlJc w:val="left"/>
+      <w:pPr>
+        <w:ind w:left="720" w:hanging="360"/>
+      </w:pPr>
+      <w:rPr>
+        <w:rFonts w:ascii="Wingdings" w:hAnsi="Wingdings" w:hint="default"/>
+      </w:rPr>
+    </w:lvl>
+    <w:lvl w:ilvl="1" w:tplc="04100003">
+      <w:start w:val="1"/>
+      <w:numFmt w:val="bullet"/>
+      <w:lvlText w:val="o"/>
+      <w:lvlJc w:val="left"/>
+      <w:pPr>
+        <w:ind w:left="1440" w:hanging="360"/>
+      </w:pPr>
+      <w:rPr>
+        <w:rFonts w:ascii="Courier New" w:hAnsi="Courier New" w:cs="Courier New" w:hint="default"/>
+      </w:rPr>
+    </w:lvl>
+    <w:lvl w:ilvl="2" w:tplc="04100005" w:tentative="1">
+      <w:start w:val="1"/>
+      <w:numFmt w:val="bullet"/>
+      <w:lvlText w:val=""/>
+      <w:lvlJc w:val="left"/>
+      <w:pPr>
+        <w:ind w:left="2160" w:hanging="360"/>
+      </w:pPr>
+      <w:rPr>
+        <w:rFonts w:ascii="Wingdings" w:hAnsi="Wingdings" w:hint="default"/>
+      </w:rPr>
+    </w:lvl>
+    <w:lvl w:ilvl="3" w:tplc="04100001" w:tentative="1">
+      <w:start w:val="1"/>
+      <w:numFmt w:val="bullet"/>
+      <w:lvlText w:val=""/>
+      <w:lvlJc w:val="left"/>
+      <w:pPr>
+        <w:ind w:left="2880" w:hanging="360"/>
+      </w:pPr>
+      <w:rPr>
+        <w:rFonts w:ascii="Symbol" w:hAnsi="Symbol" w:hint="default"/>
+      </w:rPr>
+    </w:lvl>
+    <w:lvl w:ilvl="4" w:tplc="04100003" w:tentative="1">
+      <w:start w:val="1"/>
+      <w:numFmt w:val="bullet"/>
+      <w:lvlText w:val="o"/>
+      <w:lvlJc w:val="left"/>
+      <w:pPr>
+        <w:ind w:left="3600" w:hanging="360"/>
+      </w:pPr>
+      <w:rPr>
+        <w:rFonts w:ascii="Courier New" w:hAnsi="Courier New" w:cs="Courier New" w:hint="default"/>
+      </w:rPr>
+    </w:lvl>
+    <w:lvl w:ilvl="5" w:tplc="04100005" w:tentative="1">
+      <w:start w:val="1"/>
+      <w:numFmt w:val="bullet"/>
+      <w:lvlText w:val=""/>
+      <w:lvlJc w:val="left"/>
+      <w:pPr>
+        <w:ind w:left="4320" w:hanging="360"/>
+      </w:pPr>
+      <w:rPr>
+        <w:rFonts w:ascii="Wingdings" w:hAnsi="Wingdings" w:hint="default"/>
+      </w:rPr>
+    </w:lvl>
+    <w:lvl w:ilvl="6" w:tplc="04100001" w:tentative="1">
+      <w:start w:val="1"/>
+      <w:numFmt w:val="bullet"/>
+      <w:lvlText w:val=""/>
+      <w:lvlJc w:val="left"/>
+      <w:pPr>
+        <w:ind w:left="5040" w:hanging="360"/>
+      </w:pPr>
+      <w:rPr>
+        <w:rFonts w:ascii="Symbol" w:hAnsi="Symbol" w:hint="default"/>
+      </w:rPr>
+    </w:lvl>
+    <w:lvl w:ilvl="7" w:tplc="04100003" w:tentative="1">
+      <w:start w:val="1"/>
+      <w:numFmt w:val="bullet"/>
+      <w:lvlText w:val="o"/>
+      <w:lvlJc w:val="left"/>
+      <w:pPr>
+        <w:ind w:left="5760" w:hanging="360"/>
+      </w:pPr>
+      <w:rPr>
+        <w:rFonts w:ascii="Courier New" w:hAnsi="Courier New" w:cs="Courier New" w:hint="default"/>
+      </w:rPr>
+    </w:lvl>
+    <w:lvl w:ilvl="8" w:tplc="04100005" w:tentative="1">
+      <w:start w:val="1"/>
+      <w:numFmt w:val="bullet"/>
+      <w:lvlText w:val=""/>
+      <w:lvlJc w:val="left"/>
+      <w:pPr>
+        <w:ind w:left="6480" w:hanging="360"/>
+      </w:pPr>
+      <w:rPr>
+        <w:rFonts w:ascii="Wingdings" w:hAnsi="Wingdings" w:hint="default"/>
+      </w:rPr>
+    </w:lvl>
+  </w:abstractNum>
+  <w:abstractNum w:abstractNumId="8" w15:restartNumberingAfterBreak="0">
+    <w:nsid w:val="45841EB6"/>
+    <w:multiLevelType w:val="multilevel"/>
+    <w:tmpl w:val="B79A3854"/>
+    <w:lvl w:ilvl="0">
+      <w:start w:val="1"/>
+      <w:numFmt w:val="bullet"/>
+      <w:lvlText w:val=""/>
+      <w:lvlJc w:val="left"/>
+      <w:pPr>
+        <w:tabs>
+          <w:tab w:val="num" w:pos="720"/>
+        </w:tabs>
+        <w:ind w:left="720" w:hanging="360"/>
+      </w:pPr>
+      <w:rPr>
+        <w:rFonts w:ascii="Symbol" w:hAnsi="Symbol" w:hint="default"/>
+        <w:sz w:val="20"/>
+      </w:rPr>
+    </w:lvl>
+    <w:lvl w:ilvl="1" w:tentative="1">
+      <w:start w:val="1"/>
+      <w:numFmt w:val="bullet"/>
+      <w:lvlText w:val="o"/>
+      <w:lvlJc w:val="left"/>
+      <w:pPr>
+        <w:tabs>
+          <w:tab w:val="num" w:pos="1440"/>
+        </w:tabs>
+        <w:ind w:left="1440" w:hanging="360"/>
+      </w:pPr>
+      <w:rPr>
+        <w:rFonts w:ascii="Courier New" w:hAnsi="Courier New" w:hint="default"/>
+        <w:sz w:val="20"/>
+      </w:rPr>
+    </w:lvl>
+    <w:lvl w:ilvl="2" w:tentative="1">
+      <w:start w:val="1"/>
+      <w:numFmt w:val="bullet"/>
+      <w:lvlText w:val=""/>
+      <w:lvlJc w:val="left"/>
+      <w:pPr>
+        <w:tabs>
+          <w:tab w:val="num" w:pos="2160"/>
+        </w:tabs>
+        <w:ind w:left="2160" w:hanging="360"/>
+      </w:pPr>
+      <w:rPr>
+        <w:rFonts w:ascii="Wingdings" w:hAnsi="Wingdings" w:hint="default"/>
+        <w:sz w:val="20"/>
+      </w:rPr>
+    </w:lvl>
+    <w:lvl w:ilvl="3" w:tentative="1">
+      <w:start w:val="1"/>
+      <w:numFmt w:val="bullet"/>
+      <w:lvlText w:val=""/>
+      <w:lvlJc w:val="left"/>
+      <w:pPr>
+        <w:tabs>
+          <w:tab w:val="num" w:pos="2880"/>
+        </w:tabs>
+        <w:ind w:left="2880" w:hanging="360"/>
+      </w:pPr>
+      <w:rPr>
+        <w:rFonts w:ascii="Wingdings" w:hAnsi="Wingdings" w:hint="default"/>
+        <w:sz w:val="20"/>
+      </w:rPr>
+    </w:lvl>
+    <w:lvl w:ilvl="4" w:tentative="1">
+      <w:start w:val="1"/>
+      <w:numFmt w:val="bullet"/>
+      <w:lvlText w:val=""/>
+      <w:lvlJc w:val="left"/>
+      <w:pPr>
+        <w:tabs>
+          <w:tab w:val="num" w:pos="3600"/>
+        </w:tabs>
+        <w:ind w:left="3600" w:hanging="360"/>
+      </w:pPr>
+      <w:rPr>
+        <w:rFonts w:ascii="Wingdings" w:hAnsi="Wingdings" w:hint="default"/>
+        <w:sz w:val="20"/>
+      </w:rPr>
+    </w:lvl>
+    <w:lvl w:ilvl="5" w:tentative="1">
+      <w:start w:val="1"/>
+      <w:numFmt w:val="bullet"/>
+      <w:lvlText w:val=""/>
+      <w:lvlJc w:val="left"/>
+      <w:pPr>
+        <w:tabs>
+          <w:tab w:val="num" w:pos="4320"/>
+        </w:tabs>
+        <w:ind w:left="4320" w:hanging="360"/>
+      </w:pPr>
+      <w:rPr>
+        <w:rFonts w:ascii="Wingdings" w:hAnsi="Wingdings" w:hint="default"/>
+        <w:sz w:val="20"/>
+      </w:rPr>
+    </w:lvl>
+    <w:lvl w:ilvl="6" w:tentative="1">
+      <w:start w:val="1"/>
+      <w:numFmt w:val="bullet"/>
+      <w:lvlText w:val=""/>
+      <w:lvlJc w:val="left"/>
+      <w:pPr>
+        <w:tabs>
+          <w:tab w:val="num" w:pos="5040"/>
+        </w:tabs>
+        <w:ind w:left="5040" w:hanging="360"/>
+      </w:pPr>
+      <w:rPr>
+        <w:rFonts w:ascii="Wingdings" w:hAnsi="Wingdings" w:hint="default"/>
+        <w:sz w:val="20"/>
+      </w:rPr>
+    </w:lvl>
+    <w:lvl w:ilvl="7" w:tentative="1">
+      <w:start w:val="1"/>
+      <w:numFmt w:val="bullet"/>
+      <w:lvlText w:val=""/>
+      <w:lvlJc w:val="left"/>
+      <w:pPr>
+        <w:tabs>
+          <w:tab w:val="num" w:pos="5760"/>
+        </w:tabs>
+        <w:ind w:left="5760" w:hanging="360"/>
+      </w:pPr>
+      <w:rPr>
+        <w:rFonts w:ascii="Wingdings" w:hAnsi="Wingdings" w:hint="default"/>
+        <w:sz w:val="20"/>
+      </w:rPr>
+    </w:lvl>
+    <w:lvl w:ilvl="8" w:tentative="1">
+      <w:start w:val="1"/>
+      <w:numFmt w:val="bullet"/>
+      <w:lvlText w:val=""/>
+      <w:lvlJc w:val="left"/>
+      <w:pPr>
+        <w:tabs>
+          <w:tab w:val="num" w:pos="6480"/>
+        </w:tabs>
+        <w:ind w:left="6480" w:hanging="360"/>
+      </w:pPr>
+      <w:rPr>
+        <w:rFonts w:ascii="Wingdings" w:hAnsi="Wingdings" w:hint="default"/>
+        <w:sz w:val="20"/>
+      </w:rPr>
+    </w:lvl>
+  </w:abstractNum>
+  <w:abstractNum w:abstractNumId="9" w15:restartNumberingAfterBreak="0">
+    <w:nsid w:val="48C60DE8"/>
+    <w:multiLevelType w:val="hybridMultilevel"/>
+    <w:tmpl w:val="6B725770"/>
+    <w:lvl w:ilvl="0" w:tplc="04100001">
+      <w:start w:val="1"/>
+      <w:numFmt w:val="bullet"/>
+      <w:lvlText w:val=""/>
+      <w:lvlJc w:val="left"/>
+      <w:pPr>
+        <w:ind w:left="720" w:hanging="360"/>
+      </w:pPr>
+      <w:rPr>
+        <w:rFonts w:ascii="Symbol" w:hAnsi="Symbol" w:hint="default"/>
+      </w:rPr>
+    </w:lvl>
+    <w:lvl w:ilvl="1" w:tplc="04100003" w:tentative="1">
+      <w:start w:val="1"/>
+      <w:numFmt w:val="bullet"/>
+      <w:lvlText w:val="o"/>
+      <w:lvlJc w:val="left"/>
+      <w:pPr>
+        <w:ind w:left="1440" w:hanging="360"/>
+      </w:pPr>
+      <w:rPr>
+        <w:rFonts w:ascii="Courier New" w:hAnsi="Courier New" w:cs="Courier New" w:hint="default"/>
+      </w:rPr>
+    </w:lvl>
+    <w:lvl w:ilvl="2" w:tplc="04100005" w:tentative="1">
+      <w:start w:val="1"/>
+      <w:numFmt w:val="bullet"/>
+      <w:lvlText w:val=""/>
+      <w:lvlJc w:val="left"/>
+      <w:pPr>
+        <w:ind w:left="2160" w:hanging="360"/>
+      </w:pPr>
+      <w:rPr>
+        <w:rFonts w:ascii="Wingdings" w:hAnsi="Wingdings" w:hint="default"/>
+      </w:rPr>
+    </w:lvl>
+    <w:lvl w:ilvl="3" w:tplc="04100001" w:tentative="1">
+      <w:start w:val="1"/>
+      <w:numFmt w:val="bullet"/>
+      <w:lvlText w:val=""/>
+      <w:lvlJc w:val="left"/>
+      <w:pPr>
+        <w:ind w:left="2880" w:hanging="360"/>
+      </w:pPr>
+      <w:rPr>
+        <w:rFonts w:ascii="Symbol" w:hAnsi="Symbol" w:hint="default"/>
+      </w:rPr>
+    </w:lvl>
+    <w:lvl w:ilvl="4" w:tplc="04100003" w:tentative="1">
+      <w:start w:val="1"/>
+      <w:numFmt w:val="bullet"/>
+      <w:lvlText w:val="o"/>
+      <w:lvlJc w:val="left"/>
+      <w:pPr>
+        <w:ind w:left="3600" w:hanging="360"/>
+      </w:pPr>
+      <w:rPr>
+        <w:rFonts w:ascii="Courier New" w:hAnsi="Courier New" w:cs="Courier New" w:hint="default"/>
+      </w:rPr>
+    </w:lvl>
+    <w:lvl w:ilvl="5" w:tplc="04100005" w:tentative="1">
+      <w:start w:val="1"/>
+      <w:numFmt w:val="bullet"/>
+      <w:lvlText w:val=""/>
+      <w:lvlJc w:val="left"/>
+      <w:pPr>
+        <w:ind w:left="4320" w:hanging="360"/>
+      </w:pPr>
+      <w:rPr>
+        <w:rFonts w:ascii="Wingdings" w:hAnsi="Wingdings" w:hint="default"/>
+      </w:rPr>
+    </w:lvl>
+    <w:lvl w:ilvl="6" w:tplc="04100001" w:tentative="1">
+      <w:start w:val="1"/>
+      <w:numFmt w:val="bullet"/>
+      <w:lvlText w:val=""/>
+      <w:lvlJc w:val="left"/>
+      <w:pPr>
+        <w:ind w:left="5040" w:hanging="360"/>
+      </w:pPr>
+      <w:rPr>
+        <w:rFonts w:ascii="Symbol" w:hAnsi="Symbol" w:hint="default"/>
+      </w:rPr>
+    </w:lvl>
+    <w:lvl w:ilvl="7" w:tplc="04100003" w:tentative="1">
+      <w:start w:val="1"/>
+      <w:numFmt w:val="bullet"/>
+      <w:lvlText w:val="o"/>
+      <w:lvlJc w:val="left"/>
+      <w:pPr>
+        <w:ind w:left="5760" w:hanging="360"/>
+      </w:pPr>
+      <w:rPr>
+        <w:rFonts w:ascii="Courier New" w:hAnsi="Courier New" w:cs="Courier New" w:hint="default"/>
+      </w:rPr>
+    </w:lvl>
+    <w:lvl w:ilvl="8" w:tplc="04100005" w:tentative="1">
+      <w:start w:val="1"/>
+      <w:numFmt w:val="bullet"/>
+      <w:lvlText w:val=""/>
+      <w:lvlJc w:val="left"/>
+      <w:pPr>
+        <w:ind w:left="6480" w:hanging="360"/>
+      </w:pPr>
+      <w:rPr>
+        <w:rFonts w:ascii="Wingdings" w:hAnsi="Wingdings" w:hint="default"/>
+      </w:rPr>
+    </w:lvl>
+  </w:abstractNum>
+  <w:abstractNum w:abstractNumId="10" w15:restartNumberingAfterBreak="0">
+    <w:nsid w:val="4BD622EC"/>
+    <w:multiLevelType w:val="hybridMultilevel"/>
+    <w:tmpl w:val="F348BBB0"/>
+    <w:lvl w:ilvl="0" w:tplc="04100001">
+      <w:start w:val="1"/>
+      <w:numFmt w:val="bullet"/>
+      <w:lvlText w:val=""/>
+      <w:lvlJc w:val="left"/>
+      <w:pPr>
+        <w:ind w:left="720" w:hanging="360"/>
+      </w:pPr>
+      <w:rPr>
+        <w:rFonts w:ascii="Symbol" w:hAnsi="Symbol" w:hint="default"/>
+      </w:rPr>
+    </w:lvl>
+    <w:lvl w:ilvl="1" w:tplc="04100003" w:tentative="1">
+      <w:start w:val="1"/>
+      <w:numFmt w:val="bullet"/>
+      <w:lvlText w:val="o"/>
+      <w:lvlJc w:val="left"/>
+      <w:pPr>
+        <w:ind w:left="1440" w:hanging="360"/>
+      </w:pPr>
+      <w:rPr>
+        <w:rFonts w:ascii="Courier New" w:hAnsi="Courier New" w:cs="Courier New" w:hint="default"/>
+      </w:rPr>
+    </w:lvl>
+    <w:lvl w:ilvl="2" w:tplc="04100005" w:tentative="1">
+      <w:start w:val="1"/>
+      <w:numFmt w:val="bullet"/>
+      <w:lvlText w:val=""/>
+      <w:lvlJc w:val="left"/>
+      <w:pPr>
+        <w:ind w:left="2160" w:hanging="360"/>
+      </w:pPr>
+      <w:rPr>
+        <w:rFonts w:ascii="Wingdings" w:hAnsi="Wingdings" w:hint="default"/>
+      </w:rPr>
+    </w:lvl>
+    <w:lvl w:ilvl="3" w:tplc="04100001" w:tentative="1">
+      <w:start w:val="1"/>
+      <w:numFmt w:val="bullet"/>
+      <w:lvlText w:val=""/>
+      <w:lvlJc w:val="left"/>
+      <w:pPr>
+        <w:ind w:left="2880" w:hanging="360"/>
+      </w:pPr>
+      <w:rPr>
+        <w:rFonts w:ascii="Symbol" w:hAnsi="Symbol" w:hint="default"/>
+      </w:rPr>
+    </w:lvl>
+    <w:lvl w:ilvl="4" w:tplc="04100003" w:tentative="1">
+      <w:start w:val="1"/>
+      <w:numFmt w:val="bullet"/>
+      <w:lvlText w:val="o"/>
+      <w:lvlJc w:val="left"/>
+      <w:pPr>
+        <w:ind w:left="3600" w:hanging="360"/>
+      </w:pPr>
+      <w:rPr>
+        <w:rFonts w:ascii="Courier New" w:hAnsi="Courier New" w:cs="Courier New" w:hint="default"/>
+      </w:rPr>
+    </w:lvl>
+    <w:lvl w:ilvl="5" w:tplc="04100005" w:tentative="1">
+      <w:start w:val="1"/>
+      <w:numFmt w:val="bullet"/>
+      <w:lvlText w:val=""/>
+      <w:lvlJc w:val="left"/>
+      <w:pPr>
+        <w:ind w:left="4320" w:hanging="360"/>
+      </w:pPr>
+      <w:rPr>
+        <w:rFonts w:ascii="Wingdings" w:hAnsi="Wingdings" w:hint="default"/>
+      </w:rPr>
+    </w:lvl>
+    <w:lvl w:ilvl="6" w:tplc="04100001" w:tentative="1">
+      <w:start w:val="1"/>
+      <w:numFmt w:val="bullet"/>
+      <w:lvlText w:val=""/>
+      <w:lvlJc w:val="left"/>
+      <w:pPr>
+        <w:ind w:left="5040" w:hanging="360"/>
+      </w:pPr>
+      <w:rPr>
+        <w:rFonts w:ascii="Symbol" w:hAnsi="Symbol" w:hint="default"/>
+      </w:rPr>
+    </w:lvl>
+    <w:lvl w:ilvl="7" w:tplc="04100003" w:tentative="1">
+      <w:start w:val="1"/>
+      <w:numFmt w:val="bullet"/>
+      <w:lvlText w:val="o"/>
+      <w:lvlJc w:val="left"/>
+      <w:pPr>
+        <w:ind w:left="5760" w:hanging="360"/>
+      </w:pPr>
+      <w:rPr>
+        <w:rFonts w:ascii="Courier New" w:hAnsi="Courier New" w:cs="Courier New" w:hint="default"/>
+      </w:rPr>
+    </w:lvl>
+    <w:lvl w:ilvl="8" w:tplc="04100005" w:tentative="1">
+      <w:start w:val="1"/>
+      <w:numFmt w:val="bullet"/>
+      <w:lvlText w:val=""/>
+      <w:lvlJc w:val="left"/>
+      <w:pPr>
+        <w:ind w:left="6480" w:hanging="360"/>
+      </w:pPr>
+      <w:rPr>
+        <w:rFonts w:ascii="Wingdings" w:hAnsi="Wingdings" w:hint="default"/>
+      </w:rPr>
+    </w:lvl>
+  </w:abstractNum>
+  <w:abstractNum w:abstractNumId="11" w15:restartNumberingAfterBreak="0">
+    <w:nsid w:val="538F635A"/>
+    <w:multiLevelType w:val="multilevel"/>
+    <w:tmpl w:val="E30E1DF2"/>
+    <w:lvl w:ilvl="0">
+      <w:start w:val="1"/>
+      <w:numFmt w:val="bullet"/>
+      <w:lvlText w:val=""/>
+      <w:lvlJc w:val="left"/>
+      <w:pPr>
+        <w:tabs>
+          <w:tab w:val="num" w:pos="2484"/>
+        </w:tabs>
+        <w:ind w:left="2484" w:hanging="360"/>
+      </w:pPr>
+      <w:rPr>
+        <w:rFonts w:ascii="Symbol" w:hAnsi="Symbol" w:hint="default"/>
+        <w:sz w:val="20"/>
+      </w:rPr>
+    </w:lvl>
+    <w:lvl w:ilvl="1">
+      <w:start w:val="1"/>
+      <w:numFmt w:val="bullet"/>
+      <w:lvlText w:val="o"/>
+      <w:lvlJc w:val="left"/>
+      <w:pPr>
+        <w:tabs>
+          <w:tab w:val="num" w:pos="3204"/>
+        </w:tabs>
+        <w:ind w:left="3204" w:hanging="360"/>
+      </w:pPr>
+      <w:rPr>
+        <w:rFonts w:ascii="Courier New" w:hAnsi="Courier New" w:hint="default"/>
+        <w:sz w:val="20"/>
+      </w:rPr>
+    </w:lvl>
+    <w:lvl w:ilvl="2">
+      <w:start w:val="1"/>
+      <w:numFmt w:val="bullet"/>
+      <w:lvlText w:val=""/>
+      <w:lvlJc w:val="left"/>
+      <w:pPr>
+        <w:tabs>
+          <w:tab w:val="num" w:pos="3924"/>
+        </w:tabs>
+        <w:ind w:left="3924" w:hanging="360"/>
+      </w:pPr>
+      <w:rPr>
+        <w:rFonts w:ascii="Wingdings" w:hAnsi="Wingdings" w:hint="default"/>
+        <w:sz w:val="20"/>
+      </w:rPr>
+    </w:lvl>
+    <w:lvl w:ilvl="3" w:tentative="1">
+      <w:start w:val="1"/>
+      <w:numFmt w:val="bullet"/>
+      <w:lvlText w:val=""/>
+      <w:lvlJc w:val="left"/>
+      <w:pPr>
+        <w:tabs>
+          <w:tab w:val="num" w:pos="4644"/>
+        </w:tabs>
+        <w:ind w:left="4644" w:hanging="360"/>
+      </w:pPr>
+      <w:rPr>
+        <w:rFonts w:ascii="Wingdings" w:hAnsi="Wingdings" w:hint="default"/>
+        <w:sz w:val="20"/>
+      </w:rPr>
+    </w:lvl>
+    <w:lvl w:ilvl="4" w:tentative="1">
+      <w:start w:val="1"/>
+      <w:numFmt w:val="bullet"/>
+      <w:lvlText w:val=""/>
+      <w:lvlJc w:val="left"/>
+      <w:pPr>
+        <w:tabs>
+          <w:tab w:val="num" w:pos="5364"/>
+        </w:tabs>
+        <w:ind w:left="5364" w:hanging="360"/>
+      </w:pPr>
+      <w:rPr>
+        <w:rFonts w:ascii="Wingdings" w:hAnsi="Wingdings" w:hint="default"/>
+        <w:sz w:val="20"/>
+      </w:rPr>
+    </w:lvl>
+    <w:lvl w:ilvl="5" w:tentative="1">
+      <w:start w:val="1"/>
+      <w:numFmt w:val="bullet"/>
+      <w:lvlText w:val=""/>
+      <w:lvlJc w:val="left"/>
+      <w:pPr>
+        <w:tabs>
+          <w:tab w:val="num" w:pos="6084"/>
+        </w:tabs>
+        <w:ind w:left="6084" w:hanging="360"/>
+      </w:pPr>
+      <w:rPr>
+        <w:rFonts w:ascii="Wingdings" w:hAnsi="Wingdings" w:hint="default"/>
+        <w:sz w:val="20"/>
+      </w:rPr>
+    </w:lvl>
+    <w:lvl w:ilvl="6" w:tentative="1">
+      <w:start w:val="1"/>
+      <w:numFmt w:val="bullet"/>
+      <w:lvlText w:val=""/>
+      <w:lvlJc w:val="left"/>
+      <w:pPr>
+        <w:tabs>
+          <w:tab w:val="num" w:pos="6804"/>
+        </w:tabs>
+        <w:ind w:left="6804" w:hanging="360"/>
+      </w:pPr>
+      <w:rPr>
+        <w:rFonts w:ascii="Wingdings" w:hAnsi="Wingdings" w:hint="default"/>
+        <w:sz w:val="20"/>
+      </w:rPr>
+    </w:lvl>
+    <w:lvl w:ilvl="7" w:tentative="1">
+      <w:start w:val="1"/>
+      <w:numFmt w:val="bullet"/>
+      <w:lvlText w:val=""/>
+      <w:lvlJc w:val="left"/>
+      <w:pPr>
+        <w:tabs>
+          <w:tab w:val="num" w:pos="7524"/>
+        </w:tabs>
+        <w:ind w:left="7524" w:hanging="360"/>
+      </w:pPr>
+      <w:rPr>
+        <w:rFonts w:ascii="Wingdings" w:hAnsi="Wingdings" w:hint="default"/>
+        <w:sz w:val="20"/>
+      </w:rPr>
+    </w:lvl>
+    <w:lvl w:ilvl="8" w:tentative="1">
+      <w:start w:val="1"/>
+      <w:numFmt w:val="bullet"/>
+      <w:lvlText w:val=""/>
+      <w:lvlJc w:val="left"/>
+      <w:pPr>
+        <w:tabs>
+          <w:tab w:val="num" w:pos="8244"/>
+        </w:tabs>
+        <w:ind w:left="8244" w:hanging="360"/>
+      </w:pPr>
+      <w:rPr>
+        <w:rFonts w:ascii="Wingdings" w:hAnsi="Wingdings" w:hint="default"/>
+        <w:sz w:val="20"/>
+      </w:rPr>
+    </w:lvl>
+  </w:abstractNum>
+  <w:abstractNum w:abstractNumId="12" w15:restartNumberingAfterBreak="0">
+    <w:nsid w:val="57D4187F"/>
+    <w:multiLevelType w:val="hybridMultilevel"/>
+    <w:tmpl w:val="F4841A34"/>
+    <w:lvl w:ilvl="0" w:tplc="04100009">
+      <w:start w:val="1"/>
+      <w:numFmt w:val="bullet"/>
+      <w:lvlText w:val=""/>
+      <w:lvlJc w:val="left"/>
+      <w:pPr>
+        <w:ind w:left="720" w:hanging="360"/>
+      </w:pPr>
+      <w:rPr>
+        <w:rFonts w:ascii="Wingdings" w:hAnsi="Wingdings" w:hint="default"/>
+      </w:rPr>
+    </w:lvl>
+    <w:lvl w:ilvl="1" w:tplc="04100003">
+      <w:start w:val="1"/>
+      <w:numFmt w:val="bullet"/>
+      <w:lvlText w:val="o"/>
+      <w:lvlJc w:val="left"/>
+      <w:pPr>
+        <w:ind w:left="1440" w:hanging="360"/>
+      </w:pPr>
+      <w:rPr>
+        <w:rFonts w:ascii="Courier New" w:hAnsi="Courier New" w:cs="Courier New" w:hint="default"/>
+      </w:rPr>
+    </w:lvl>
+    <w:lvl w:ilvl="2" w:tplc="04100005" w:tentative="1">
+      <w:start w:val="1"/>
+      <w:numFmt w:val="bullet"/>
+      <w:lvlText w:val=""/>
+      <w:lvlJc w:val="left"/>
+      <w:pPr>
+        <w:ind w:left="2160" w:hanging="360"/>
+      </w:pPr>
+      <w:rPr>
+        <w:rFonts w:ascii="Wingdings" w:hAnsi="Wingdings" w:hint="default"/>
+      </w:rPr>
+    </w:lvl>
+    <w:lvl w:ilvl="3" w:tplc="04100001" w:tentative="1">
+      <w:start w:val="1"/>
+      <w:numFmt w:val="bullet"/>
+      <w:lvlText w:val=""/>
+      <w:lvlJc w:val="left"/>
+      <w:pPr>
+        <w:ind w:left="2880" w:hanging="360"/>
+      </w:pPr>
+      <w:rPr>
+        <w:rFonts w:ascii="Symbol" w:hAnsi="Symbol" w:hint="default"/>
+      </w:rPr>
+    </w:lvl>
+    <w:lvl w:ilvl="4" w:tplc="04100003" w:tentative="1">
+      <w:start w:val="1"/>
+      <w:numFmt w:val="bullet"/>
+      <w:lvlText w:val="o"/>
+      <w:lvlJc w:val="left"/>
+      <w:pPr>
+        <w:ind w:left="3600" w:hanging="360"/>
+      </w:pPr>
+      <w:rPr>
+        <w:rFonts w:ascii="Courier New" w:hAnsi="Courier New" w:cs="Courier New" w:hint="default"/>
+      </w:rPr>
+    </w:lvl>
+    <w:lvl w:ilvl="5" w:tplc="04100005" w:tentative="1">
+      <w:start w:val="1"/>
+      <w:numFmt w:val="bullet"/>
+      <w:lvlText w:val=""/>
+      <w:lvlJc w:val="left"/>
+      <w:pPr>
+        <w:ind w:left="4320" w:hanging="360"/>
+      </w:pPr>
+      <w:rPr>
+        <w:rFonts w:ascii="Wingdings" w:hAnsi="Wingdings" w:hint="default"/>
+      </w:rPr>
+    </w:lvl>
+    <w:lvl w:ilvl="6" w:tplc="04100001" w:tentative="1">
+      <w:start w:val="1"/>
+      <w:numFmt w:val="bullet"/>
+      <w:lvlText w:val=""/>
+      <w:lvlJc w:val="left"/>
+      <w:pPr>
+        <w:ind w:left="5040" w:hanging="360"/>
+      </w:pPr>
+      <w:rPr>
+        <w:rFonts w:ascii="Symbol" w:hAnsi="Symbol" w:hint="default"/>
+      </w:rPr>
+    </w:lvl>
+    <w:lvl w:ilvl="7" w:tplc="04100003" w:tentative="1">
+      <w:start w:val="1"/>
+      <w:numFmt w:val="bullet"/>
+      <w:lvlText w:val="o"/>
+      <w:lvlJc w:val="left"/>
+      <w:pPr>
+        <w:ind w:left="5760" w:hanging="360"/>
+      </w:pPr>
+      <w:rPr>
+        <w:rFonts w:ascii="Courier New" w:hAnsi="Courier New" w:cs="Courier New" w:hint="default"/>
+      </w:rPr>
+    </w:lvl>
+    <w:lvl w:ilvl="8" w:tplc="04100005" w:tentative="1">
+      <w:start w:val="1"/>
+      <w:numFmt w:val="bullet"/>
+      <w:lvlText w:val=""/>
+      <w:lvlJc w:val="left"/>
+      <w:pPr>
+        <w:ind w:left="6480" w:hanging="360"/>
+      </w:pPr>
+      <w:rPr>
+        <w:rFonts w:ascii="Wingdings" w:hAnsi="Wingdings" w:hint="default"/>
+      </w:rPr>
+    </w:lvl>
+  </w:abstractNum>
+  <w:num w:numId="1" w16cid:durableId="344792734">
+    <w:abstractNumId w:val="0"/>
+  </w:num>
+  <w:num w:numId="2" w16cid:durableId="568349122">
+    <w:abstractNumId w:val="2"/>
+  </w:num>
+  <w:num w:numId="3" w16cid:durableId="811294443">
+    <w:abstractNumId w:val="3"/>
+  </w:num>
+  <w:num w:numId="4" w16cid:durableId="1973899524">
+    <w:abstractNumId w:val="6"/>
+  </w:num>
+  <w:num w:numId="5" w16cid:durableId="89545462">
+    <w:abstractNumId w:val="11"/>
+  </w:num>
+  <w:num w:numId="6" w16cid:durableId="1540388402">
+    <w:abstractNumId w:val="5"/>
+  </w:num>
+  <w:num w:numId="7" w16cid:durableId="284893279">
+    <w:abstractNumId w:val="1"/>
+  </w:num>
+  <w:num w:numId="8" w16cid:durableId="2131973897">
+    <w:abstractNumId w:val="10"/>
+  </w:num>
+  <w:num w:numId="9" w16cid:durableId="669021043">
+    <w:abstractNumId w:val="8"/>
+  </w:num>
+  <w:num w:numId="10" w16cid:durableId="755326793">
+    <w:abstractNumId w:val="9"/>
+  </w:num>
+  <w:num w:numId="11" w16cid:durableId="667902229">
+    <w:abstractNumId w:val="4"/>
+  </w:num>
+  <w:num w:numId="12" w16cid:durableId="742096692">
+    <w:abstractNumId w:val="7"/>
+  </w:num>
+  <w:num w:numId="13" w16cid:durableId="1752964556">
+    <w:abstractNumId w:val="12"/>
+  </w:num>
+</w:numbering>
 </file>
 
 <file path=word/styles.xml><?xml version="1.0" encoding="utf-8"?>

</xml_diff>

<commit_message>
Iniziato implementazione di file su Manutenzione
Modifiche secondarie a file Design, Gestione e Requisiti. Creato una prima bozza del file di manutenzione con divisione tra modello seguito, refactoring e utilizzo di reverse engineering.
</commit_message>
<xml_diff>
--- a/documentazione/Design.docx
+++ b/documentazione/Design.docx
@@ -938,17 +938,33 @@
           <w:bCs/>
         </w:rPr>
       </w:pPr>
-      <w:r>
+    </w:p>
+    <w:p>
+      <w:pPr>
         <w:rPr>
           <w:b/>
           <w:bCs/>
         </w:rPr>
+      </w:pPr>
+    </w:p>
+    <w:p>
+      <w:pPr>
+        <w:rPr>
+          <w:b/>
+          <w:bCs/>
+        </w:rPr>
+      </w:pPr>
+      <w:r>
+        <w:rPr>
+          <w:b/>
+          <w:bCs/>
+        </w:rPr>
+        <w:lastRenderedPageBreak/>
         <w:t>Software Desing</w:t>
       </w:r>
     </w:p>
     <w:p>
       <w:r>
-        <w:lastRenderedPageBreak/>
         <w:t xml:space="preserve">DEVE contenere una descrizione del design (mediante i diagrammi UML va bene) POTREBBE contenere un calcolo di complessità (ad esempio con McCabe) di una piccola parte DOVREBBE contenere qualche misurazione del codice, (con qualche metrica che abbiamo visto). Alcuni tools che vedremo a lezione: </w:t>
       </w:r>
       <w:proofErr w:type="spellStart"/>

</xml_diff>

<commit_message>
Aggiornamento documenti, aggiunta elementi mancanti
</commit_message>
<xml_diff>
--- a/documentazione/Design.docx
+++ b/documentazione/Design.docx
@@ -14,7 +14,6 @@
           <w:bCs/>
         </w:rPr>
       </w:pPr>
-      <w:proofErr w:type="spellStart"/>
       <w:r>
         <w:rPr>
           <w:b/>
@@ -22,7 +21,6 @@
         </w:rPr>
         <w:t>Modelling</w:t>
       </w:r>
-      <w:proofErr w:type="spellEnd"/>
     </w:p>
     <w:p>
       <w:r>
@@ -31,189 +29,37 @@
     </w:p>
     <w:p>
       <w:r>
-        <w:t xml:space="preserve">use case </w:t>
-      </w:r>
-      <w:proofErr w:type="spellStart"/>
-      <w:r>
-        <w:t>diagram</w:t>
-      </w:r>
-      <w:proofErr w:type="spellEnd"/>
-      <w:r>
-        <w:t xml:space="preserve"> (si consiglia di metterlo nella sezione dei requisiti) class </w:t>
-      </w:r>
-      <w:proofErr w:type="spellStart"/>
-      <w:r>
-        <w:t>diagram</w:t>
-      </w:r>
-      <w:proofErr w:type="spellEnd"/>
-      <w:r>
-        <w:t xml:space="preserve"> (dal quale si DEVE generare una prima versione del codice in Java usando </w:t>
-      </w:r>
-      <w:proofErr w:type="spellStart"/>
-      <w:r>
-        <w:t>Papyrus</w:t>
-      </w:r>
-      <w:proofErr w:type="spellEnd"/>
-      <w:r>
-        <w:t xml:space="preserve"> Designer - si consiglia di metterlo nella sezione software design) </w:t>
-      </w:r>
-    </w:p>
-    <w:p>
-      <w:r>
-        <w:t xml:space="preserve">ALMENO UNO state machine </w:t>
-      </w:r>
-      <w:proofErr w:type="spellStart"/>
-      <w:r>
-        <w:t>diagram</w:t>
-      </w:r>
-      <w:proofErr w:type="spellEnd"/>
-      <w:r>
-        <w:t xml:space="preserve"> (NON DEVE essere troppo semplice, si deve cercare di usare la maggior parte degli elementi che costituiscono uno state </w:t>
-      </w:r>
-      <w:proofErr w:type="spellStart"/>
-      <w:r>
-        <w:t>diagram</w:t>
-      </w:r>
-      <w:proofErr w:type="spellEnd"/>
-      <w:r>
-        <w:t xml:space="preserve"> come visto a lezione) </w:t>
-      </w:r>
-    </w:p>
-    <w:p>
-      <w:r>
-        <w:t xml:space="preserve">ALMENO UN </w:t>
-      </w:r>
-      <w:proofErr w:type="spellStart"/>
-      <w:r>
-        <w:t>sequence</w:t>
-      </w:r>
-      <w:proofErr w:type="spellEnd"/>
-      <w:r>
-        <w:t xml:space="preserve"> </w:t>
-      </w:r>
-      <w:proofErr w:type="spellStart"/>
-      <w:r>
-        <w:t>diagram</w:t>
-      </w:r>
-      <w:proofErr w:type="spellEnd"/>
-      <w:r>
-        <w:t xml:space="preserve"> (NON DEVE essere troppo semplice, si deve cercare di usare la maggior parte degli elementi che costituiscono un </w:t>
-      </w:r>
-      <w:proofErr w:type="spellStart"/>
-      <w:r>
-        <w:t>sequence</w:t>
-      </w:r>
-      <w:proofErr w:type="spellEnd"/>
-      <w:r>
-        <w:t xml:space="preserve"> </w:t>
-      </w:r>
-      <w:proofErr w:type="spellStart"/>
-      <w:r>
-        <w:t>diagram</w:t>
-      </w:r>
-      <w:proofErr w:type="spellEnd"/>
-      <w:r>
-        <w:t xml:space="preserve"> come visto a lezione). </w:t>
-      </w:r>
-    </w:p>
-    <w:p>
-      <w:r>
-        <w:t xml:space="preserve">UN diagramma TRA </w:t>
-      </w:r>
-      <w:proofErr w:type="spellStart"/>
-      <w:r>
-        <w:t>communication</w:t>
-      </w:r>
-      <w:proofErr w:type="spellEnd"/>
-      <w:r>
-        <w:t xml:space="preserve"> </w:t>
-      </w:r>
-      <w:proofErr w:type="spellStart"/>
-      <w:r>
-        <w:t>diagram</w:t>
-      </w:r>
-      <w:proofErr w:type="spellEnd"/>
-      <w:r>
-        <w:t xml:space="preserve"> e timing </w:t>
-      </w:r>
-      <w:proofErr w:type="spellStart"/>
-      <w:r>
-        <w:t>diagram</w:t>
-      </w:r>
-      <w:proofErr w:type="spellEnd"/>
-      <w:r>
-        <w:t xml:space="preserve"> </w:t>
-      </w:r>
-    </w:p>
-    <w:p>
-      <w:r>
-        <w:t xml:space="preserve">ALMENO UN activity </w:t>
-      </w:r>
-      <w:proofErr w:type="spellStart"/>
-      <w:r>
-        <w:t>diagram</w:t>
-      </w:r>
-      <w:proofErr w:type="spellEnd"/>
-      <w:r>
-        <w:t xml:space="preserve"> (NON DEVE essere troppo semplice, si deve cercare di usare la maggior parte degli elementi che costituiscono un activity </w:t>
-      </w:r>
-      <w:proofErr w:type="spellStart"/>
-      <w:r>
-        <w:t>diagram</w:t>
-      </w:r>
-      <w:proofErr w:type="spellEnd"/>
-      <w:r>
-        <w:t xml:space="preserve"> come visto a lezione) </w:t>
-      </w:r>
-    </w:p>
-    <w:p>
-      <w:r>
-        <w:t xml:space="preserve">component </w:t>
-      </w:r>
-      <w:proofErr w:type="spellStart"/>
-      <w:r>
-        <w:t>diagram</w:t>
-      </w:r>
-      <w:proofErr w:type="spellEnd"/>
-      <w:r>
-        <w:t xml:space="preserve"> (si consiglia di metterlo nella sezione in cui si presenta la software </w:t>
-      </w:r>
-      <w:proofErr w:type="spellStart"/>
-      <w:r>
-        <w:t>architecture</w:t>
-      </w:r>
-      <w:proofErr w:type="spellEnd"/>
-      <w:r>
-        <w:t xml:space="preserve">) </w:t>
-      </w:r>
-    </w:p>
-    <w:p>
-      <w:r>
-        <w:t xml:space="preserve">package </w:t>
-      </w:r>
-      <w:proofErr w:type="spellStart"/>
-      <w:r>
-        <w:t>diagram</w:t>
-      </w:r>
-      <w:proofErr w:type="spellEnd"/>
-      <w:r>
-        <w:t xml:space="preserve"> (si consiglia di metterlo nella sezione in cui si presenta la software </w:t>
-      </w:r>
-      <w:proofErr w:type="spellStart"/>
-      <w:r>
-        <w:t>architecture</w:t>
-      </w:r>
-      <w:proofErr w:type="spellEnd"/>
-      <w:r>
-        <w:t xml:space="preserve"> o insieme al class </w:t>
-      </w:r>
-      <w:proofErr w:type="spellStart"/>
-      <w:r>
-        <w:t>diagram</w:t>
-      </w:r>
-      <w:proofErr w:type="spellEnd"/>
-      <w:r>
-        <w:t>)</w:t>
+        <w:t xml:space="preserve">use case diagram (si consiglia di metterlo nella sezione dei requisiti) class diagram (dal quale si DEVE generare una prima versione del codice in Java usando Papyrus Designer - si consiglia di metterlo nella sezione software design) </w:t>
+      </w:r>
+    </w:p>
+    <w:p>
+      <w:r>
+        <w:t xml:space="preserve">ALMENO UNO state machine diagram (NON DEVE essere troppo semplice, si deve cercare di usare la maggior parte degli elementi che costituiscono uno state diagram come visto a lezione) </w:t>
+      </w:r>
+    </w:p>
+    <w:p>
+      <w:r>
+        <w:t xml:space="preserve">ALMENO UN sequence diagram (NON DEVE essere troppo semplice, si deve cercare di usare la maggior parte degli elementi che costituiscono un sequence diagram come visto a lezione). </w:t>
+      </w:r>
+    </w:p>
+    <w:p>
+      <w:r>
+        <w:t xml:space="preserve">UN diagramma TRA communication diagram e timing diagram </w:t>
+      </w:r>
+    </w:p>
+    <w:p>
+      <w:r>
+        <w:t xml:space="preserve">ALMENO UN activity diagram (NON DEVE essere troppo semplice, si deve cercare di usare la maggior parte degli elementi che costituiscono un activity diagram come visto a lezione) </w:t>
+      </w:r>
+    </w:p>
+    <w:p>
+      <w:r>
+        <w:t xml:space="preserve">component diagram (si consiglia di metterlo nella sezione in cui si presenta la software architecture) </w:t>
+      </w:r>
+    </w:p>
+    <w:p>
+      <w:r>
+        <w:t>package diagram (si consiglia di metterlo nella sezione in cui si presenta la software architecture o insieme al class diagram)</w:t>
       </w:r>
     </w:p>
     <w:p>
@@ -229,7 +75,6 @@
           <w:u w:val="single"/>
         </w:rPr>
       </w:pPr>
-      <w:proofErr w:type="spellStart"/>
       <w:r>
         <w:rPr>
           <w:i/>
@@ -238,7 +83,6 @@
         </w:rPr>
         <w:t>Modelling</w:t>
       </w:r>
-      <w:proofErr w:type="spellEnd"/>
     </w:p>
     <w:p>
       <w:r>
@@ -258,15 +102,7 @@
         <w:spacing w:after="0"/>
       </w:pPr>
       <w:r>
-        <w:t xml:space="preserve">Use case </w:t>
-      </w:r>
-      <w:proofErr w:type="spellStart"/>
-      <w:r>
-        <w:t>Diagram</w:t>
-      </w:r>
-      <w:proofErr w:type="spellEnd"/>
-      <w:r>
-        <w:t xml:space="preserve"> : definisce i confini del sistema e le interazioni degli attori Utente ed Admin</w:t>
+        <w:t>Use case Diagram : definisce i confini del sistema e le interazioni degli attori Utente ed Admin</w:t>
       </w:r>
     </w:p>
     <w:p>
@@ -287,16 +123,11 @@
       <w:r>
         <w:t xml:space="preserve">Class </w:t>
       </w:r>
-      <w:proofErr w:type="spellStart"/>
       <w:r>
         <w:t>D</w:t>
       </w:r>
       <w:r>
-        <w:t>iagram</w:t>
-      </w:r>
-      <w:proofErr w:type="spellEnd"/>
-      <w:r>
-        <w:t xml:space="preserve"> : rappr</w:t>
+        <w:t>iagram : rappr</w:t>
       </w:r>
       <w:r>
         <w:t>ese</w:t>
@@ -327,15 +158,7 @@
         <w:t>e</w:t>
       </w:r>
       <w:r>
-        <w:t xml:space="preserve"> </w:t>
-      </w:r>
-      <w:proofErr w:type="spellStart"/>
-      <w:r>
-        <w:t>Diagram</w:t>
-      </w:r>
-      <w:proofErr w:type="spellEnd"/>
-      <w:r>
-        <w:t>: modellato il flusso dell’accesso e della prenotazione</w:t>
+        <w:t xml:space="preserve"> Diagram: modellato il flusso dell’accesso e della prenotazione</w:t>
       </w:r>
     </w:p>
     <w:p>
@@ -353,24 +176,14 @@
         </w:numPr>
         <w:spacing w:after="0"/>
       </w:pPr>
-      <w:proofErr w:type="spellStart"/>
-      <w:r>
-        <w:t>Sequence</w:t>
-      </w:r>
-      <w:proofErr w:type="spellEnd"/>
-      <w:r>
-        <w:t xml:space="preserve"> </w:t>
-      </w:r>
-      <w:proofErr w:type="spellStart"/>
+      <w:r>
+        <w:t xml:space="preserve">Sequence </w:t>
+      </w:r>
       <w:r>
         <w:t>D</w:t>
       </w:r>
       <w:r>
-        <w:t>iagram</w:t>
-      </w:r>
-      <w:proofErr w:type="spellEnd"/>
-      <w:r>
-        <w:t>: rappresenta flusso di messaggi dal ten</w:t>
+        <w:t>iagram: rappresenta flusso di messaggi dal ten</w:t>
       </w:r>
       <w:r>
         <w:t>t</w:t>
@@ -393,21 +206,8 @@
         </w:numPr>
         <w:spacing w:after="0"/>
       </w:pPr>
-      <w:proofErr w:type="spellStart"/>
-      <w:r>
-        <w:t>Communication</w:t>
-      </w:r>
-      <w:proofErr w:type="spellEnd"/>
-      <w:r>
-        <w:t xml:space="preserve"> </w:t>
-      </w:r>
-      <w:proofErr w:type="spellStart"/>
-      <w:r>
-        <w:t>Diagram</w:t>
-      </w:r>
-      <w:proofErr w:type="spellEnd"/>
-      <w:r>
-        <w:t>: rappresenta flusso di messaggi dal ten</w:t>
+      <w:r>
+        <w:t>Communication Diagram: rappresenta flusso di messaggi dal ten</w:t>
       </w:r>
       <w:r>
         <w:t>t</w:t>
@@ -433,14 +233,12 @@
       <w:r>
         <w:t xml:space="preserve">Activity </w:t>
       </w:r>
-      <w:proofErr w:type="spellStart"/>
       <w:r>
         <w:t>D</w:t>
       </w:r>
       <w:r>
         <w:t>iagram</w:t>
       </w:r>
-      <w:proofErr w:type="spellEnd"/>
     </w:p>
     <w:p>
       <w:pPr>
@@ -459,14 +257,12 @@
       <w:r>
         <w:t xml:space="preserve">Component </w:t>
       </w:r>
-      <w:proofErr w:type="spellStart"/>
       <w:r>
         <w:t>D</w:t>
       </w:r>
       <w:r>
         <w:t>iagram</w:t>
       </w:r>
-      <w:proofErr w:type="spellEnd"/>
     </w:p>
     <w:p>
       <w:pPr>
@@ -485,14 +281,12 @@
       <w:r>
         <w:t xml:space="preserve">Package </w:t>
       </w:r>
-      <w:proofErr w:type="spellStart"/>
       <w:r>
         <w:t>D</w:t>
       </w:r>
       <w:r>
         <w:t>iagram</w:t>
       </w:r>
-      <w:proofErr w:type="spellEnd"/>
     </w:p>
     <w:p>
       <w:pPr>
@@ -504,29 +298,11 @@
         <w:spacing w:after="0"/>
       </w:pPr>
       <w:r>
-        <w:t>I file presenti in questo documento sono ritrovabili anche all’interno della cartella del codice (</w:t>
-      </w:r>
-      <w:proofErr w:type="spellStart"/>
-      <w:r>
-        <w:t>find</w:t>
-      </w:r>
-      <w:proofErr w:type="spellEnd"/>
-      <w:r>
-        <w:t>-n-</w:t>
-      </w:r>
-      <w:proofErr w:type="spellStart"/>
-      <w:r>
-        <w:t>charge</w:t>
-      </w:r>
-      <w:proofErr w:type="spellEnd"/>
-      <w:r>
-        <w:t>/</w:t>
-      </w:r>
-      <w:proofErr w:type="spellStart"/>
-      <w:r>
-        <w:t>diagrammiUML</w:t>
-      </w:r>
-      <w:proofErr w:type="spellEnd"/>
+        <w:t>I file presenti in questo documento sono ritrovabili anche all’interno della cartella del codice (find-n-charge/diagrammiUML</w:t>
+      </w:r>
+      <w:r>
+        <w:t>)</w:t>
+      </w:r>
     </w:p>
     <w:p>
       <w:pPr>
@@ -560,31 +336,7 @@
     </w:p>
     <w:p>
       <w:r>
-        <w:t xml:space="preserve">DEVE contenere la descrizione dell’architettura con almeno un paio di </w:t>
-      </w:r>
-      <w:proofErr w:type="spellStart"/>
-      <w:r>
-        <w:t>architectural</w:t>
-      </w:r>
-      <w:proofErr w:type="spellEnd"/>
-      <w:r>
-        <w:t xml:space="preserve"> </w:t>
-      </w:r>
-      <w:proofErr w:type="spellStart"/>
-      <w:r>
-        <w:t>views</w:t>
-      </w:r>
-      <w:proofErr w:type="spellEnd"/>
-      <w:r>
-        <w:t xml:space="preserve"> (per differenti punti di vista) DOVREBBE avere almeno una vista con connettori e componenti con la descrizione dello stile architetturale (11.4) DEVE utilizzare almeno una libreria esterna con </w:t>
-      </w:r>
-      <w:proofErr w:type="spellStart"/>
-      <w:r>
-        <w:t>maven</w:t>
-      </w:r>
-      <w:proofErr w:type="spellEnd"/>
-      <w:r>
-        <w:t>. Ad esempio l’uso di log4j è molto consigliata.</w:t>
+        <w:t>DEVE contenere la descrizione dell’architettura con almeno un paio di architectural views (per differenti punti di vista) DOVREBBE avere almeno una vista con connettori e componenti con la descrizione dello stile architetturale (11.4) DEVE utilizzare almeno una libreria esterna con maven. Ad esempio l’uso di log4j è molto consigliata.</w:t>
       </w:r>
     </w:p>
     <w:p>
@@ -615,28 +367,12 @@
     </w:p>
     <w:p>
       <w:r>
-        <w:t>Stile architetturale: il software utilizza un architettura a strati (</w:t>
-      </w:r>
-      <w:proofErr w:type="spellStart"/>
-      <w:r>
-        <w:t>layered</w:t>
-      </w:r>
-      <w:proofErr w:type="spellEnd"/>
-      <w:r>
-        <w:t>) per garantire la separazione delle responsabilità e facilitare la manutenibilità.</w:t>
-      </w:r>
-    </w:p>
-    <w:p>
-      <w:r>
-        <w:t xml:space="preserve">Il sistema è diviso in tre </w:t>
-      </w:r>
-      <w:proofErr w:type="spellStart"/>
-      <w:r>
-        <w:t>layer</w:t>
-      </w:r>
-      <w:proofErr w:type="spellEnd"/>
-      <w:r>
-        <w:t xml:space="preserve"> principali:</w:t>
+        <w:t>Stile architetturale: il software utilizza un architettura a strati (layered) per garantire la separazione delle responsabilità e facilitare la manutenibilità.</w:t>
+      </w:r>
+    </w:p>
+    <w:p>
+      <w:r>
+        <w:t>Il sistema è diviso in tre layer principali:</w:t>
       </w:r>
     </w:p>
     <w:p>
@@ -649,23 +385,7 @@
         <w:spacing w:line="360" w:lineRule="auto"/>
       </w:pPr>
       <w:r>
-        <w:t>Presentation Layer (</w:t>
-      </w:r>
-      <w:proofErr w:type="spellStart"/>
-      <w:r>
-        <w:t>Views</w:t>
-      </w:r>
-      <w:proofErr w:type="spellEnd"/>
-      <w:r>
-        <w:t>): Gestione dell'interfaccia utente (</w:t>
-      </w:r>
-      <w:proofErr w:type="spellStart"/>
-      <w:r>
-        <w:t>Vaadin</w:t>
-      </w:r>
-      <w:proofErr w:type="spellEnd"/>
-      <w:r>
-        <w:t>)</w:t>
+        <w:t>Presentation Layer (Views): Gestione dell'interfaccia utente (Vaadin)</w:t>
       </w:r>
       <w:r>
         <w:t xml:space="preserve">. </w:t>
@@ -694,15 +414,7 @@
         <w:spacing w:line="360" w:lineRule="auto"/>
       </w:pPr>
       <w:r>
-        <w:t xml:space="preserve">Data Access Layer (Interface + </w:t>
-      </w:r>
-      <w:proofErr w:type="spellStart"/>
-      <w:r>
-        <w:t>FirebaseService</w:t>
-      </w:r>
-      <w:proofErr w:type="spellEnd"/>
-      <w:r>
-        <w:t>): Gestione dati.</w:t>
+        <w:t>Data Access Layer (Interface + FirebaseService): Gestione dati.</w:t>
       </w:r>
     </w:p>
     <w:p>
@@ -728,21 +440,8 @@
         <w:spacing w:line="360" w:lineRule="auto"/>
       </w:pPr>
       <w:r>
-        <w:t xml:space="preserve">Componenti principali: oggetti, Firebase, Client Browser, Spring, </w:t>
-      </w:r>
-      <w:proofErr w:type="spellStart"/>
-      <w:r>
-        <w:t>backend</w:t>
-      </w:r>
-      <w:proofErr w:type="spellEnd"/>
-      <w:r>
-        <w:t xml:space="preserve"> </w:t>
-      </w:r>
-      <w:proofErr w:type="spellStart"/>
-      <w:r>
-        <w:t>Vaadin</w:t>
-      </w:r>
-      <w:proofErr w:type="spellEnd"/>
+        <w:t>Componenti principali: oggetti, Firebase, Client Browser, Spring, backend Vaadin</w:t>
+      </w:r>
     </w:p>
     <w:p>
       <w:pPr>
@@ -796,15 +495,7 @@
         <w:spacing w:line="360" w:lineRule="auto"/>
       </w:pPr>
       <w:r>
-        <w:t xml:space="preserve">Dipendenze Spring – per il corretto funzionamento di </w:t>
-      </w:r>
-      <w:proofErr w:type="spellStart"/>
-      <w:r>
-        <w:t>SpringBoot</w:t>
-      </w:r>
-      <w:proofErr w:type="spellEnd"/>
-      <w:r>
-        <w:t xml:space="preserve"> e Tomcat</w:t>
+        <w:t>Dipendenze Spring – per il corretto funzionamento di SpringBoot e Tomcat</w:t>
       </w:r>
     </w:p>
     <w:p>
@@ -817,15 +508,7 @@
         <w:spacing w:line="360" w:lineRule="auto"/>
       </w:pPr>
       <w:r>
-        <w:t xml:space="preserve">Dipendenze </w:t>
-      </w:r>
-      <w:proofErr w:type="spellStart"/>
-      <w:r>
-        <w:t>Zxing</w:t>
-      </w:r>
-      <w:proofErr w:type="spellEnd"/>
-      <w:r>
-        <w:t xml:space="preserve"> – per la generazione dei QR code</w:t>
+        <w:t>Dipendenze Zxing – per la generazione dei QR code</w:t>
       </w:r>
     </w:p>
     <w:p>
@@ -838,15 +521,7 @@
         <w:spacing w:line="360" w:lineRule="auto"/>
       </w:pPr>
       <w:r>
-        <w:t xml:space="preserve">Dipendenze </w:t>
-      </w:r>
-      <w:proofErr w:type="spellStart"/>
-      <w:r>
-        <w:t>BCrypt</w:t>
-      </w:r>
-      <w:proofErr w:type="spellEnd"/>
-      <w:r>
-        <w:t xml:space="preserve"> – per la gestione di password criptate</w:t>
+        <w:t>Dipendenze BCrypt – per la gestione di password criptate</w:t>
       </w:r>
     </w:p>
     <w:p>
@@ -858,13 +533,8 @@
         </w:numPr>
         <w:spacing w:line="360" w:lineRule="auto"/>
       </w:pPr>
-      <w:proofErr w:type="spellStart"/>
-      <w:r>
-        <w:t>ApexCharts</w:t>
-      </w:r>
-      <w:proofErr w:type="spellEnd"/>
-      <w:r>
-        <w:t xml:space="preserve"> – per grafici e statistiche</w:t>
+      <w:r>
+        <w:t>ApexCharts – per grafici e statistiche</w:t>
       </w:r>
     </w:p>
     <w:p>
@@ -876,19 +546,9 @@
         </w:numPr>
         <w:spacing w:line="360" w:lineRule="auto"/>
       </w:pPr>
-      <w:proofErr w:type="spellStart"/>
-      <w:r>
-        <w:t>Vaadin</w:t>
-      </w:r>
-      <w:proofErr w:type="spellEnd"/>
-      <w:r>
-        <w:t xml:space="preserve"> – per completa gestione </w:t>
-      </w:r>
-      <w:proofErr w:type="spellStart"/>
-      <w:r>
-        <w:t>frontend</w:t>
-      </w:r>
-      <w:proofErr w:type="spellEnd"/>
+      <w:r>
+        <w:t>Vaadin – per completa gestione frontend</w:t>
+      </w:r>
     </w:p>
     <w:p>
       <w:pPr>
@@ -965,31 +625,7 @@
     </w:p>
     <w:p>
       <w:r>
-        <w:t xml:space="preserve">DEVE contenere una descrizione del design (mediante i diagrammi UML va bene) POTREBBE contenere un calcolo di complessità (ad esempio con McCabe) di una piccola parte DOVREBBE contenere qualche misurazione del codice, (con qualche metrica che abbiamo visto). Alcuni tools che vedremo a lezione: </w:t>
-      </w:r>
-      <w:proofErr w:type="spellStart"/>
-      <w:r>
-        <w:t>stanide</w:t>
-      </w:r>
-      <w:proofErr w:type="spellEnd"/>
-      <w:r>
-        <w:t xml:space="preserve">, </w:t>
-      </w:r>
-      <w:proofErr w:type="spellStart"/>
-      <w:r>
-        <w:t>jdepend</w:t>
-      </w:r>
-      <w:proofErr w:type="spellEnd"/>
-      <w:r>
-        <w:t xml:space="preserve">, struture101, </w:t>
-      </w:r>
-      <w:proofErr w:type="spellStart"/>
-      <w:r>
-        <w:t>sonarlint</w:t>
-      </w:r>
-      <w:proofErr w:type="spellEnd"/>
-      <w:r>
-        <w:t>, PMD … DEVE applicare un paio di design pattern visti a lezione Documentazione: Documentare l’architettura e il design in documento.</w:t>
+        <w:t>DEVE contenere una descrizione del design (mediante i diagrammi UML va bene) POTREBBE contenere un calcolo di complessità (ad esempio con McCabe) di una piccola parte DOVREBBE contenere qualche misurazione del codice, (con qualche metrica che abbiamo visto). Alcuni tools che vedremo a lezione: stanide, jdepend, struture101, sonarlint, PMD … DEVE applicare un paio di design pattern visti a lezione Documentazione: Documentare l’architettura e il design in documento.</w:t>
       </w:r>
     </w:p>
     <w:p/>
@@ -1063,37 +699,8 @@
         <w:t xml:space="preserve"> Pattern</w:t>
       </w:r>
       <w:r>
-        <w:t xml:space="preserve">: utilizzo di </w:t>
-      </w:r>
-      <w:proofErr w:type="spellStart"/>
-      <w:r>
-        <w:t>addClickListener</w:t>
-      </w:r>
-      <w:proofErr w:type="spellEnd"/>
-      <w:r>
-        <w:t xml:space="preserve"> per </w:t>
-      </w:r>
-      <w:proofErr w:type="spellStart"/>
-      <w:r>
-        <w:t>frontend</w:t>
-      </w:r>
-      <w:proofErr w:type="spellEnd"/>
-      <w:r>
-        <w:t xml:space="preserve"> e </w:t>
-      </w:r>
-      <w:proofErr w:type="spellStart"/>
-      <w:r>
-        <w:t>ValueEventListener</w:t>
-      </w:r>
-      <w:proofErr w:type="spellEnd"/>
-      <w:r>
-        <w:t xml:space="preserve"> per </w:t>
-      </w:r>
-      <w:proofErr w:type="spellStart"/>
-      <w:r>
-        <w:t>backend</w:t>
-      </w:r>
-      <w:proofErr w:type="spellEnd"/>
+        <w:t>: utilizzo di addClickListener per frontend e ValueEventListener per backend</w:t>
+      </w:r>
     </w:p>
     <w:p/>
     <w:p>
@@ -1115,7 +722,10 @@
     </w:p>
     <w:p>
       <w:r>
-        <w:t>È stata effettuata un’analisi del codice e sono emersi i seguenti dati.</w:t>
+        <w:t>È stata effettuata un’analisi del codice e sono emersi i seguenti dati</w:t>
+      </w:r>
+      <w:r>
+        <w:t xml:space="preserve"> (aggiornato al 27/01/2026).</w:t>
       </w:r>
     </w:p>
     <w:p>
@@ -1154,15 +764,7 @@
         <w:spacing w:line="360" w:lineRule="auto"/>
       </w:pPr>
       <w:r>
-        <w:t xml:space="preserve">Complessità </w:t>
-      </w:r>
-      <w:proofErr w:type="spellStart"/>
-      <w:r>
-        <w:t>ciclomatica</w:t>
-      </w:r>
-      <w:proofErr w:type="spellEnd"/>
-      <w:r>
-        <w:t xml:space="preserve"> (McCabe): </w:t>
+        <w:t xml:space="preserve">Complessità ciclomatica (McCabe): </w:t>
       </w:r>
     </w:p>
     <w:p>
@@ -1174,13 +776,8 @@
         </w:numPr>
         <w:spacing w:line="360" w:lineRule="auto"/>
       </w:pPr>
-      <w:proofErr w:type="spellStart"/>
-      <w:r>
-        <w:t>Pollution</w:t>
-      </w:r>
-      <w:proofErr w:type="spellEnd"/>
-      <w:r>
-        <w:t xml:space="preserve"> alla consegna: </w:t>
+      <w:r>
+        <w:t xml:space="preserve">Pollution alla consegna: </w:t>
       </w:r>
     </w:p>
     <w:p/>

</xml_diff>

<commit_message>
Modifiche file requisiti, gestione e design
Coretto errori e aggiunto parti mancanti. In file design aggiunto metriche aggiornate con tabella. Aggiunto diagramma in pdf.
</commit_message>
<xml_diff>
--- a/documentazione/Design.docx
+++ b/documentazione/Design.docx
@@ -23,51 +23,6 @@
       </w:r>
     </w:p>
     <w:p>
-      <w:r>
-        <w:t xml:space="preserve">DEVE contenere i diagrammi UML visti a lezione, se non già presentati in altre sezioni della documentazione: </w:t>
-      </w:r>
-    </w:p>
-    <w:p>
-      <w:r>
-        <w:t xml:space="preserve">use case diagram (si consiglia di metterlo nella sezione dei requisiti) class diagram (dal quale si DEVE generare una prima versione del codice in Java usando Papyrus Designer - si consiglia di metterlo nella sezione software design) </w:t>
-      </w:r>
-    </w:p>
-    <w:p>
-      <w:r>
-        <w:t xml:space="preserve">ALMENO UNO state machine diagram (NON DEVE essere troppo semplice, si deve cercare di usare la maggior parte degli elementi che costituiscono uno state diagram come visto a lezione) </w:t>
-      </w:r>
-    </w:p>
-    <w:p>
-      <w:r>
-        <w:t xml:space="preserve">ALMENO UN sequence diagram (NON DEVE essere troppo semplice, si deve cercare di usare la maggior parte degli elementi che costituiscono un sequence diagram come visto a lezione). </w:t>
-      </w:r>
-    </w:p>
-    <w:p>
-      <w:r>
-        <w:t xml:space="preserve">UN diagramma TRA communication diagram e timing diagram </w:t>
-      </w:r>
-    </w:p>
-    <w:p>
-      <w:r>
-        <w:t xml:space="preserve">ALMENO UN activity diagram (NON DEVE essere troppo semplice, si deve cercare di usare la maggior parte degli elementi che costituiscono un activity diagram come visto a lezione) </w:t>
-      </w:r>
-    </w:p>
-    <w:p>
-      <w:r>
-        <w:t xml:space="preserve">component diagram (si consiglia di metterlo nella sezione in cui si presenta la software architecture) </w:t>
-      </w:r>
-    </w:p>
-    <w:p>
-      <w:r>
-        <w:t>package diagram (si consiglia di metterlo nella sezione in cui si presenta la software architecture o insieme al class diagram)</w:t>
-      </w:r>
-    </w:p>
-    <w:p>
-      <w:r>
-        <w:t>Documentazione: immagini nel documento o in una cartella separata (specificare qui quale è la cartella)</w:t>
-      </w:r>
-    </w:p>
-    <w:p>
       <w:pPr>
         <w:rPr>
           <w:i/>
@@ -81,7 +36,7 @@
           <w:iCs/>
           <w:u w:val="single"/>
         </w:rPr>
-        <w:t>Modelling</w:t>
+        <w:t>Diagrammi UML</w:t>
       </w:r>
     </w:p>
     <w:p>
@@ -89,7 +44,10 @@
         <w:t>Il team ha modellato il sistema utilizzando i diagrammi UML citati</w:t>
       </w:r>
       <w:r>
-        <w:t xml:space="preserve"> di seguito. AGGIUNGERE IMMAGINI DIAGRAMMI</w:t>
+        <w:t xml:space="preserve"> di seguito. </w:t>
+      </w:r>
+      <w:r>
+        <w:t xml:space="preserve"> IMMAGINI!!!</w:t>
       </w:r>
     </w:p>
     <w:p>
@@ -102,7 +60,13 @@
         <w:spacing w:after="0"/>
       </w:pPr>
       <w:r>
-        <w:t>Use case Diagram : definisce i confini del sistema e le interazioni degli attori Utente ed Admin</w:t>
+        <w:t xml:space="preserve">Use case </w:t>
+      </w:r>
+      <w:r>
+        <w:t>d</w:t>
+      </w:r>
+      <w:r>
+        <w:t>iagram : definisce i confini del sistema e le interazioni degli attori Utente ed Admin</w:t>
       </w:r>
     </w:p>
     <w:p>
@@ -124,16 +88,22 @@
         <w:t xml:space="preserve">Class </w:t>
       </w:r>
       <w:r>
-        <w:t>D</w:t>
-      </w:r>
-      <w:r>
-        <w:t>iagram : rappr</w:t>
+        <w:t>diagram</w:t>
+      </w:r>
+      <w:r>
+        <w:t xml:space="preserve"> : rappr</w:t>
       </w:r>
       <w:r>
         <w:t>ese</w:t>
       </w:r>
       <w:r>
-        <w:t xml:space="preserve">nta l struttura del sistema e le interazioni tra le varie componenti </w:t>
+        <w:t xml:space="preserve">nta l struttura del sistema e le interazioni tra le varie </w:t>
+      </w:r>
+      <w:r>
+        <w:t>classi ed oggetti</w:t>
+      </w:r>
+      <w:r>
+        <w:t xml:space="preserve"> </w:t>
       </w:r>
     </w:p>
     <w:p>
@@ -158,7 +128,13 @@
         <w:t>e</w:t>
       </w:r>
       <w:r>
-        <w:t xml:space="preserve"> Diagram: modellato il flusso dell’accesso e della prenotazione</w:t>
+        <w:t xml:space="preserve"> </w:t>
+      </w:r>
+      <w:r>
+        <w:t>diagram</w:t>
+      </w:r>
+      <w:r>
+        <w:t>: modellato il flusso dell’accesso e della prenotazione</w:t>
       </w:r>
     </w:p>
     <w:p>
@@ -180,16 +156,19 @@
         <w:t xml:space="preserve">Sequence </w:t>
       </w:r>
       <w:r>
-        <w:t>D</w:t>
-      </w:r>
-      <w:r>
-        <w:t>iagram: rappresenta flusso di messaggi dal ten</w:t>
+        <w:t>diagram</w:t>
+      </w:r>
+      <w:r>
+        <w:t>: rappresenta flusso di messaggi dal ten</w:t>
       </w:r>
       <w:r>
         <w:t>t</w:t>
       </w:r>
       <w:r>
         <w:t>ativo di prenotazione alla sua conferma</w:t>
+      </w:r>
+      <w:r>
+        <w:t xml:space="preserve"> </w:t>
       </w:r>
     </w:p>
     <w:p>
@@ -207,13 +186,25 @@
         <w:spacing w:after="0"/>
       </w:pPr>
       <w:r>
-        <w:t>Communication Diagram: rappresenta flusso di messaggi dal ten</w:t>
+        <w:t xml:space="preserve">Communication </w:t>
+      </w:r>
+      <w:r>
+        <w:t>diagram</w:t>
+      </w:r>
+      <w:r>
+        <w:t>: rappresenta flusso di messaggi dal ten</w:t>
       </w:r>
       <w:r>
         <w:t>t</w:t>
       </w:r>
       <w:r>
         <w:t>ativo di prenotazione alla sua conferma</w:t>
+      </w:r>
+      <w:r>
+        <w:t xml:space="preserve"> </w:t>
+      </w:r>
+      <w:r>
+        <w:t>in maniera alternativa al sequence diagram</w:t>
       </w:r>
     </w:p>
     <w:p>
@@ -239,10 +230,13 @@
       <w:r>
         <w:t>iagram</w:t>
       </w:r>
-    </w:p>
-    <w:p>
-      <w:pPr>
-        <w:pStyle w:val="Paragrafoelenco"/>
+      <w:r>
+        <w:t>: descrive il flusso completo dell’utente all’interno dell’applicazione, dall’accesso sino alla conferma della prenotazione</w:t>
+      </w:r>
+    </w:p>
+    <w:p>
+      <w:pPr>
+        <w:spacing w:after="0"/>
       </w:pPr>
     </w:p>
     <w:p>
@@ -263,6 +257,9 @@
       <w:r>
         <w:t>iagram</w:t>
       </w:r>
+      <w:r>
+        <w:t>: illustra l’architettura del sistema e le dipendenze tra le varie componenti, sia interne che esterne</w:t>
+      </w:r>
     </w:p>
     <w:p>
       <w:pPr>
@@ -287,10 +284,20 @@
       <w:r>
         <w:t>iagram</w:t>
       </w:r>
-    </w:p>
-    <w:p>
-      <w:pPr>
+      <w:r>
+        <w:t>: visualizza l’organizzazione dei pacchetti java, senza creare cicli per garantire un codice pulito e manutenibile</w:t>
+      </w:r>
+    </w:p>
+    <w:p>
+      <w:pPr>
+        <w:pStyle w:val="Paragrafoelenco"/>
+      </w:pPr>
+    </w:p>
+    <w:p>
+      <w:pPr>
+        <w:pStyle w:val="Paragrafoelenco"/>
         <w:spacing w:after="0"/>
+        <w:ind w:left="1440"/>
       </w:pPr>
     </w:p>
     <w:p>
@@ -303,6 +310,94 @@
       <w:r>
         <w:t>)</w:t>
       </w:r>
+      <w:r>
+        <w:t xml:space="preserve"> ed in versione pdf nella cartella  “diagrammi pdf”.</w:t>
+      </w:r>
+    </w:p>
+    <w:p>
+      <w:pPr>
+        <w:spacing w:after="0"/>
+      </w:pPr>
+    </w:p>
+    <w:p>
+      <w:pPr>
+        <w:spacing w:after="0"/>
+      </w:pPr>
+    </w:p>
+    <w:p>
+      <w:pPr>
+        <w:spacing w:after="0"/>
+      </w:pPr>
+    </w:p>
+    <w:p>
+      <w:pPr>
+        <w:spacing w:after="0"/>
+      </w:pPr>
+    </w:p>
+    <w:p>
+      <w:pPr>
+        <w:spacing w:after="0"/>
+      </w:pPr>
+    </w:p>
+    <w:p>
+      <w:pPr>
+        <w:spacing w:after="0"/>
+      </w:pPr>
+    </w:p>
+    <w:p>
+      <w:pPr>
+        <w:spacing w:after="0"/>
+      </w:pPr>
+    </w:p>
+    <w:p>
+      <w:pPr>
+        <w:spacing w:after="0"/>
+      </w:pPr>
+    </w:p>
+    <w:p>
+      <w:pPr>
+        <w:spacing w:after="0"/>
+      </w:pPr>
+    </w:p>
+    <w:p>
+      <w:pPr>
+        <w:spacing w:after="0"/>
+      </w:pPr>
+    </w:p>
+    <w:p>
+      <w:pPr>
+        <w:spacing w:after="0"/>
+      </w:pPr>
+    </w:p>
+    <w:p>
+      <w:pPr>
+        <w:spacing w:after="0"/>
+      </w:pPr>
+    </w:p>
+    <w:p>
+      <w:pPr>
+        <w:spacing w:after="0"/>
+      </w:pPr>
+    </w:p>
+    <w:p>
+      <w:pPr>
+        <w:spacing w:after="0"/>
+      </w:pPr>
+    </w:p>
+    <w:p>
+      <w:pPr>
+        <w:spacing w:after="0"/>
+      </w:pPr>
+    </w:p>
+    <w:p>
+      <w:pPr>
+        <w:spacing w:after="0"/>
+      </w:pPr>
+    </w:p>
+    <w:p>
+      <w:pPr>
+        <w:spacing w:after="0"/>
+      </w:pPr>
     </w:p>
     <w:p>
       <w:pPr>
@@ -335,11 +430,6 @@
       </w:r>
     </w:p>
     <w:p>
-      <w:r>
-        <w:t>DEVE contenere la descrizione dell’architettura con almeno un paio di architectural views (per differenti punti di vista) DOVREBBE avere almeno una vista con connettori e componenti con la descrizione dello stile architetturale (11.4) DEVE utilizzare almeno una libreria esterna con maven. Ad esempio l’uso di log4j è molto consigliata.</w:t>
-      </w:r>
-    </w:p>
-    <w:p>
       <w:pPr>
         <w:rPr>
           <w:i/>
@@ -347,22 +437,13 @@
           <w:u w:val="single"/>
         </w:rPr>
       </w:pPr>
-    </w:p>
-    <w:p>
-      <w:pPr>
+      <w:r>
         <w:rPr>
           <w:i/>
           <w:iCs/>
           <w:u w:val="single"/>
         </w:rPr>
-      </w:pPr>
-      <w:r>
-        <w:rPr>
-          <w:i/>
-          <w:iCs/>
-          <w:u w:val="single"/>
-        </w:rPr>
-        <w:t>Software Architecture</w:t>
+        <w:t>Stile architetturale</w:t>
       </w:r>
     </w:p>
     <w:p>
@@ -587,18 +668,15 @@
       </w:pPr>
     </w:p>
     <w:p>
-      <w:r>
-        <w:tab/>
-      </w:r>
-    </w:p>
-    <w:p>
-      <w:pPr>
-        <w:rPr>
-          <w:b/>
-          <w:bCs/>
-        </w:rPr>
-      </w:pPr>
-    </w:p>
+      <w:pPr>
+        <w:ind w:left="720"/>
+      </w:pPr>
+    </w:p>
+    <w:p/>
+    <w:p/>
+    <w:p/>
+    <w:p/>
+    <w:p/>
     <w:p>
       <w:pPr>
         <w:rPr>
@@ -620,15 +698,16 @@
           <w:bCs/>
         </w:rPr>
         <w:lastRenderedPageBreak/>
-        <w:t>Software Desing</w:t>
-      </w:r>
-    </w:p>
-    <w:p>
-      <w:r>
-        <w:t>DEVE contenere una descrizione del design (mediante i diagrammi UML va bene) POTREBBE contenere un calcolo di complessità (ad esempio con McCabe) di una piccola parte DOVREBBE contenere qualche misurazione del codice, (con qualche metrica che abbiamo visto). Alcuni tools che vedremo a lezione: stanide, jdepend, struture101, sonarlint, PMD … DEVE applicare un paio di design pattern visti a lezione Documentazione: Documentare l’architettura e il design in documento.</w:t>
-      </w:r>
-    </w:p>
-    <w:p/>
+        <w:t>Software Desi</w:t>
+      </w:r>
+      <w:r>
+        <w:rPr>
+          <w:b/>
+          <w:bCs/>
+        </w:rPr>
+        <w:t>gn</w:t>
+      </w:r>
+    </w:p>
     <w:p>
       <w:pPr>
         <w:rPr>
@@ -725,62 +804,981 @@
         <w:t>È stata effettuata un’analisi del codice e sono emersi i seguenti dati</w:t>
       </w:r>
       <w:r>
-        <w:t xml:space="preserve"> (aggiornato al 27/01/2026).</w:t>
-      </w:r>
-    </w:p>
-    <w:p>
-      <w:pPr>
-        <w:pStyle w:val="Paragrafoelenco"/>
-        <w:numPr>
-          <w:ilvl w:val="0"/>
-          <w:numId w:val="10"/>
-        </w:numPr>
-        <w:spacing w:line="360" w:lineRule="auto"/>
-      </w:pPr>
-      <w:r>
-        <w:t xml:space="preserve">Lines of Code (LOC) : </w:t>
-      </w:r>
-    </w:p>
-    <w:p>
-      <w:pPr>
-        <w:pStyle w:val="Paragrafoelenco"/>
-        <w:numPr>
-          <w:ilvl w:val="0"/>
-          <w:numId w:val="10"/>
-        </w:numPr>
-        <w:spacing w:line="360" w:lineRule="auto"/>
-      </w:pPr>
-      <w:r>
-        <w:t xml:space="preserve">Numero classi: </w:t>
-      </w:r>
-    </w:p>
-    <w:p>
-      <w:pPr>
-        <w:pStyle w:val="Paragrafoelenco"/>
-        <w:numPr>
-          <w:ilvl w:val="0"/>
-          <w:numId w:val="10"/>
-        </w:numPr>
-        <w:spacing w:line="360" w:lineRule="auto"/>
-      </w:pPr>
-      <w:r>
-        <w:t xml:space="preserve">Complessità ciclomatica (McCabe): </w:t>
-      </w:r>
-    </w:p>
-    <w:p>
-      <w:pPr>
-        <w:pStyle w:val="Paragrafoelenco"/>
-        <w:numPr>
-          <w:ilvl w:val="0"/>
-          <w:numId w:val="10"/>
-        </w:numPr>
-        <w:spacing w:line="360" w:lineRule="auto"/>
-      </w:pPr>
-      <w:r>
-        <w:t xml:space="preserve">Pollution alla consegna: </w:t>
+        <w:t xml:space="preserve"> (aggiornato al </w:t>
+      </w:r>
+      <w:r>
+        <w:t>01</w:t>
+      </w:r>
+      <w:r>
+        <w:t>/0</w:t>
+      </w:r>
+      <w:r>
+        <w:t>2</w:t>
+      </w:r>
+      <w:r>
+        <w:t>/2026</w:t>
+      </w:r>
+      <w:r>
+        <w:t>)</w:t>
+      </w:r>
+    </w:p>
+    <w:tbl>
+      <w:tblPr>
+        <w:tblStyle w:val="Grigliatabella"/>
+        <w:tblW w:w="0" w:type="auto"/>
+        <w:tblLook w:val="04A0" w:firstRow="1" w:lastRow="0" w:firstColumn="1" w:lastColumn="0" w:noHBand="0" w:noVBand="1"/>
+      </w:tblPr>
+      <w:tblGrid>
+        <w:gridCol w:w="1372"/>
+        <w:gridCol w:w="2774"/>
+        <w:gridCol w:w="802"/>
+        <w:gridCol w:w="4680"/>
+      </w:tblGrid>
+      <w:tr>
+        <w:tc>
+          <w:tcPr>
+            <w:tcW w:w="0" w:type="auto"/>
+            <w:hideMark/>
+          </w:tcPr>
+          <w:p>
+            <w:pPr>
+              <w:spacing w:after="160" w:line="259" w:lineRule="auto"/>
+            </w:pPr>
+            <w:r>
+              <w:rPr>
+                <w:b/>
+                <w:bCs/>
+              </w:rPr>
+              <w:t>Categoria</w:t>
+            </w:r>
+          </w:p>
+        </w:tc>
+        <w:tc>
+          <w:tcPr>
+            <w:tcW w:w="0" w:type="auto"/>
+            <w:hideMark/>
+          </w:tcPr>
+          <w:p>
+            <w:pPr>
+              <w:spacing w:after="160" w:line="259" w:lineRule="auto"/>
+            </w:pPr>
+            <w:r>
+              <w:rPr>
+                <w:b/>
+                <w:bCs/>
+              </w:rPr>
+              <w:t>Metrica</w:t>
+            </w:r>
+          </w:p>
+        </w:tc>
+        <w:tc>
+          <w:tcPr>
+            <w:tcW w:w="0" w:type="auto"/>
+            <w:hideMark/>
+          </w:tcPr>
+          <w:p>
+            <w:pPr>
+              <w:spacing w:after="160" w:line="259" w:lineRule="auto"/>
+            </w:pPr>
+            <w:r>
+              <w:rPr>
+                <w:b/>
+                <w:bCs/>
+              </w:rPr>
+              <w:t>Valore</w:t>
+            </w:r>
+          </w:p>
+        </w:tc>
+        <w:tc>
+          <w:tcPr>
+            <w:tcW w:w="0" w:type="auto"/>
+            <w:hideMark/>
+          </w:tcPr>
+          <w:p>
+            <w:pPr>
+              <w:spacing w:after="160" w:line="259" w:lineRule="auto"/>
+            </w:pPr>
+            <w:r>
+              <w:rPr>
+                <w:b/>
+                <w:bCs/>
+              </w:rPr>
+              <w:t>Note</w:t>
+            </w:r>
+          </w:p>
+        </w:tc>
+      </w:tr>
+      <w:tr>
+        <w:tc>
+          <w:tcPr>
+            <w:tcW w:w="0" w:type="auto"/>
+            <w:hideMark/>
+          </w:tcPr>
+          <w:p>
+            <w:pPr>
+              <w:spacing w:after="160" w:line="259" w:lineRule="auto"/>
+            </w:pPr>
+            <w:r>
+              <w:rPr>
+                <w:b/>
+                <w:bCs/>
+              </w:rPr>
+              <w:t>Volume</w:t>
+            </w:r>
+          </w:p>
+        </w:tc>
+        <w:tc>
+          <w:tcPr>
+            <w:tcW w:w="0" w:type="auto"/>
+            <w:hideMark/>
+          </w:tcPr>
+          <w:p>
+            <w:pPr>
+              <w:spacing w:after="160" w:line="259" w:lineRule="auto"/>
+            </w:pPr>
+            <w:r>
+              <w:rPr>
+                <w:b/>
+                <w:bCs/>
+              </w:rPr>
+              <w:t>ELOC</w:t>
+            </w:r>
+            <w:r>
+              <w:t xml:space="preserve"> (Estimated Lines of Code)</w:t>
+            </w:r>
+          </w:p>
+        </w:tc>
+        <w:tc>
+          <w:tcPr>
+            <w:tcW w:w="0" w:type="auto"/>
+            <w:hideMark/>
+          </w:tcPr>
+          <w:p>
+            <w:pPr>
+              <w:spacing w:after="160" w:line="259" w:lineRule="auto"/>
+            </w:pPr>
+            <w:r>
+              <w:rPr>
+                <w:b/>
+                <w:bCs/>
+              </w:rPr>
+              <w:t>3.505</w:t>
+            </w:r>
+          </w:p>
+        </w:tc>
+        <w:tc>
+          <w:tcPr>
+            <w:tcW w:w="0" w:type="auto"/>
+            <w:hideMark/>
+          </w:tcPr>
+          <w:p>
+            <w:pPr>
+              <w:spacing w:after="160" w:line="259" w:lineRule="auto"/>
+            </w:pPr>
+            <w:r>
+              <w:t>Valore consono per progetto universitario.</w:t>
+            </w:r>
+          </w:p>
+        </w:tc>
+      </w:tr>
+      <w:tr>
+        <w:tc>
+          <w:tcPr>
+            <w:tcW w:w="0" w:type="auto"/>
+            <w:hideMark/>
+          </w:tcPr>
+          <w:p>
+            <w:pPr>
+              <w:spacing w:after="160" w:line="259" w:lineRule="auto"/>
+            </w:pPr>
+          </w:p>
+        </w:tc>
+        <w:tc>
+          <w:tcPr>
+            <w:tcW w:w="0" w:type="auto"/>
+            <w:hideMark/>
+          </w:tcPr>
+          <w:p>
+            <w:pPr>
+              <w:spacing w:after="160" w:line="259" w:lineRule="auto"/>
+            </w:pPr>
+            <w:r>
+              <w:rPr>
+                <w:b/>
+                <w:bCs/>
+              </w:rPr>
+              <w:t>Numero Unità</w:t>
+            </w:r>
+          </w:p>
+        </w:tc>
+        <w:tc>
+          <w:tcPr>
+            <w:tcW w:w="0" w:type="auto"/>
+            <w:hideMark/>
+          </w:tcPr>
+          <w:p>
+            <w:pPr>
+              <w:spacing w:after="160" w:line="259" w:lineRule="auto"/>
+            </w:pPr>
+            <w:r>
+              <w:rPr>
+                <w:b/>
+                <w:bCs/>
+              </w:rPr>
+              <w:t>51</w:t>
+            </w:r>
+          </w:p>
+        </w:tc>
+        <w:tc>
+          <w:tcPr>
+            <w:tcW w:w="0" w:type="auto"/>
+            <w:hideMark/>
+          </w:tcPr>
+          <w:p>
+            <w:pPr>
+              <w:spacing w:after="160" w:line="259" w:lineRule="auto"/>
+            </w:pPr>
+            <w:r>
+              <w:t>Distribuite su 12 pacchetti (Media 4,25 classi/package).</w:t>
+            </w:r>
+          </w:p>
+        </w:tc>
+      </w:tr>
+      <w:tr>
+        <w:tc>
+          <w:tcPr>
+            <w:tcW w:w="0" w:type="auto"/>
+            <w:hideMark/>
+          </w:tcPr>
+          <w:p>
+            <w:pPr>
+              <w:spacing w:after="160" w:line="259" w:lineRule="auto"/>
+            </w:pPr>
+            <w:r>
+              <w:rPr>
+                <w:b/>
+                <w:bCs/>
+              </w:rPr>
+              <w:t>Complessità</w:t>
+            </w:r>
+          </w:p>
+        </w:tc>
+        <w:tc>
+          <w:tcPr>
+            <w:tcW w:w="0" w:type="auto"/>
+            <w:hideMark/>
+          </w:tcPr>
+          <w:p>
+            <w:pPr>
+              <w:spacing w:after="160" w:line="259" w:lineRule="auto"/>
+            </w:pPr>
+            <w:r>
+              <w:rPr>
+                <w:b/>
+                <w:bCs/>
+              </w:rPr>
+              <w:t>McCabe</w:t>
+            </w:r>
+            <w:r>
+              <w:t xml:space="preserve"> (Complessità Ciclomatica)</w:t>
+            </w:r>
+          </w:p>
+        </w:tc>
+        <w:tc>
+          <w:tcPr>
+            <w:tcW w:w="0" w:type="auto"/>
+            <w:hideMark/>
+          </w:tcPr>
+          <w:p>
+            <w:pPr>
+              <w:spacing w:after="160" w:line="259" w:lineRule="auto"/>
+            </w:pPr>
+            <w:r>
+              <w:rPr>
+                <w:b/>
+                <w:bCs/>
+              </w:rPr>
+              <w:t>1,25</w:t>
+            </w:r>
+          </w:p>
+        </w:tc>
+        <w:tc>
+          <w:tcPr>
+            <w:tcW w:w="0" w:type="auto"/>
+            <w:hideMark/>
+          </w:tcPr>
+          <w:p>
+            <w:pPr>
+              <w:spacing w:after="160" w:line="259" w:lineRule="auto"/>
+            </w:pPr>
+            <w:r>
+              <w:t>Codice lineare se il valore di complessità è minore di 10.</w:t>
+            </w:r>
+          </w:p>
+        </w:tc>
+      </w:tr>
+      <w:tr>
+        <w:tc>
+          <w:tcPr>
+            <w:tcW w:w="0" w:type="auto"/>
+            <w:hideMark/>
+          </w:tcPr>
+          <w:p>
+            <w:pPr>
+              <w:spacing w:after="160" w:line="259" w:lineRule="auto"/>
+            </w:pPr>
+          </w:p>
+        </w:tc>
+        <w:tc>
+          <w:tcPr>
+            <w:tcW w:w="0" w:type="auto"/>
+            <w:hideMark/>
+          </w:tcPr>
+          <w:p>
+            <w:pPr>
+              <w:spacing w:after="160" w:line="259" w:lineRule="auto"/>
+            </w:pPr>
+            <w:r>
+              <w:rPr>
+                <w:b/>
+                <w:bCs/>
+              </w:rPr>
+              <w:t>Pollution</w:t>
+            </w:r>
+          </w:p>
+        </w:tc>
+        <w:tc>
+          <w:tcPr>
+            <w:tcW w:w="0" w:type="auto"/>
+            <w:hideMark/>
+          </w:tcPr>
+          <w:p>
+            <w:pPr>
+              <w:spacing w:after="160" w:line="259" w:lineRule="auto"/>
+            </w:pPr>
+            <w:r>
+              <w:rPr>
+                <w:b/>
+                <w:bCs/>
+              </w:rPr>
+              <w:t>0,51</w:t>
+            </w:r>
+          </w:p>
+        </w:tc>
+        <w:tc>
+          <w:tcPr>
+            <w:tcW w:w="0" w:type="auto"/>
+            <w:hideMark/>
+          </w:tcPr>
+          <w:p>
+            <w:pPr>
+              <w:spacing w:after="160" w:line="259" w:lineRule="auto"/>
+            </w:pPr>
+            <w:r>
+              <w:rPr>
+                <w:i/>
+                <w:iCs/>
+              </w:rPr>
+              <w:t>Vedi grafico sottostante.</w:t>
+            </w:r>
+            <w:r>
+              <w:t xml:space="preserve"> Valore influenzato </w:t>
+            </w:r>
+            <w:r>
+              <w:t>dall’utilizzo di Vaadin.</w:t>
+            </w:r>
+          </w:p>
+        </w:tc>
+      </w:tr>
+      <w:tr>
+        <w:tc>
+          <w:tcPr>
+            <w:tcW w:w="0" w:type="auto"/>
+            <w:hideMark/>
+          </w:tcPr>
+          <w:p>
+            <w:pPr>
+              <w:spacing w:after="160" w:line="259" w:lineRule="auto"/>
+            </w:pPr>
+            <w:r>
+              <w:rPr>
+                <w:b/>
+                <w:bCs/>
+              </w:rPr>
+              <w:t>Struttura</w:t>
+            </w:r>
+          </w:p>
+        </w:tc>
+        <w:tc>
+          <w:tcPr>
+            <w:tcW w:w="0" w:type="auto"/>
+            <w:hideMark/>
+          </w:tcPr>
+          <w:p>
+            <w:pPr>
+              <w:spacing w:after="160" w:line="259" w:lineRule="auto"/>
+            </w:pPr>
+            <w:r>
+              <w:rPr>
+                <w:b/>
+                <w:bCs/>
+              </w:rPr>
+              <w:t>Tangled Libraries</w:t>
+            </w:r>
+          </w:p>
+        </w:tc>
+        <w:tc>
+          <w:tcPr>
+            <w:tcW w:w="0" w:type="auto"/>
+            <w:hideMark/>
+          </w:tcPr>
+          <w:p>
+            <w:pPr>
+              <w:spacing w:after="160" w:line="259" w:lineRule="auto"/>
+            </w:pPr>
+            <w:r>
+              <w:rPr>
+                <w:b/>
+                <w:bCs/>
+              </w:rPr>
+              <w:t>0%</w:t>
+            </w:r>
+          </w:p>
+        </w:tc>
+        <w:tc>
+          <w:tcPr>
+            <w:tcW w:w="0" w:type="auto"/>
+            <w:hideMark/>
+          </w:tcPr>
+          <w:p>
+            <w:pPr>
+              <w:spacing w:after="160" w:line="259" w:lineRule="auto"/>
+            </w:pPr>
+            <w:r>
+              <w:t>Assenza totale di cicli tra i pacchetti</w:t>
+            </w:r>
+            <w:r>
+              <w:t>.</w:t>
+            </w:r>
+          </w:p>
+        </w:tc>
+      </w:tr>
+      <w:tr>
+        <w:tc>
+          <w:tcPr>
+            <w:tcW w:w="0" w:type="auto"/>
+            <w:hideMark/>
+          </w:tcPr>
+          <w:p>
+            <w:pPr>
+              <w:spacing w:after="160" w:line="259" w:lineRule="auto"/>
+            </w:pPr>
+          </w:p>
+        </w:tc>
+        <w:tc>
+          <w:tcPr>
+            <w:tcW w:w="0" w:type="auto"/>
+            <w:hideMark/>
+          </w:tcPr>
+          <w:p>
+            <w:pPr>
+              <w:spacing w:after="160" w:line="259" w:lineRule="auto"/>
+            </w:pPr>
+            <w:r>
+              <w:rPr>
+                <w:b/>
+                <w:bCs/>
+              </w:rPr>
+              <w:t>Metrica di Martin (|D|)</w:t>
+            </w:r>
+          </w:p>
+        </w:tc>
+        <w:tc>
+          <w:tcPr>
+            <w:tcW w:w="0" w:type="auto"/>
+            <w:hideMark/>
+          </w:tcPr>
+          <w:p>
+            <w:pPr>
+              <w:spacing w:after="160" w:line="259" w:lineRule="auto"/>
+            </w:pPr>
+            <w:r>
+              <w:rPr>
+                <w:b/>
+                <w:bCs/>
+              </w:rPr>
+              <w:t>0,37</w:t>
+            </w:r>
+          </w:p>
+        </w:tc>
+        <w:tc>
+          <w:tcPr>
+            <w:tcW w:w="0" w:type="auto"/>
+            <w:hideMark/>
+          </w:tcPr>
+          <w:p>
+            <w:pPr>
+              <w:spacing w:after="160" w:line="259" w:lineRule="auto"/>
+            </w:pPr>
+            <w:r>
+              <w:t>Progetto bilanciato nella "Main Sequence" (Stabilità vs Astrazione).</w:t>
+            </w:r>
+          </w:p>
+        </w:tc>
+      </w:tr>
+      <w:tr>
+        <w:tc>
+          <w:tcPr>
+            <w:tcW w:w="0" w:type="auto"/>
+            <w:hideMark/>
+          </w:tcPr>
+          <w:p>
+            <w:pPr>
+              <w:spacing w:after="160" w:line="259" w:lineRule="auto"/>
+            </w:pPr>
+            <w:r>
+              <w:rPr>
+                <w:b/>
+                <w:bCs/>
+              </w:rPr>
+              <w:t>Metriche OO</w:t>
+            </w:r>
+          </w:p>
+        </w:tc>
+        <w:tc>
+          <w:tcPr>
+            <w:tcW w:w="0" w:type="auto"/>
+            <w:hideMark/>
+          </w:tcPr>
+          <w:p>
+            <w:pPr>
+              <w:spacing w:after="160" w:line="259" w:lineRule="auto"/>
+            </w:pPr>
+            <w:r>
+              <w:rPr>
+                <w:b/>
+                <w:bCs/>
+              </w:rPr>
+              <w:t>CBO</w:t>
+            </w:r>
+            <w:r>
+              <w:t xml:space="preserve"> (Coupling Between Objects)</w:t>
+            </w:r>
+          </w:p>
+        </w:tc>
+        <w:tc>
+          <w:tcPr>
+            <w:tcW w:w="0" w:type="auto"/>
+            <w:hideMark/>
+          </w:tcPr>
+          <w:p>
+            <w:pPr>
+              <w:spacing w:after="160" w:line="259" w:lineRule="auto"/>
+            </w:pPr>
+            <w:r>
+              <w:rPr>
+                <w:b/>
+                <w:bCs/>
+              </w:rPr>
+              <w:t>2,27</w:t>
+            </w:r>
+          </w:p>
+        </w:tc>
+        <w:tc>
+          <w:tcPr>
+            <w:tcW w:w="0" w:type="auto"/>
+            <w:hideMark/>
+          </w:tcPr>
+          <w:p>
+            <w:pPr>
+              <w:spacing w:after="160" w:line="259" w:lineRule="auto"/>
+            </w:pPr>
+            <w:r>
+              <w:t>Basso accoppiamento: le classi sono indipendenti e modulari.</w:t>
+            </w:r>
+          </w:p>
+        </w:tc>
+      </w:tr>
+      <w:tr>
+        <w:tc>
+          <w:tcPr>
+            <w:tcW w:w="0" w:type="auto"/>
+            <w:hideMark/>
+          </w:tcPr>
+          <w:p>
+            <w:pPr>
+              <w:spacing w:after="160" w:line="259" w:lineRule="auto"/>
+            </w:pPr>
+          </w:p>
+        </w:tc>
+        <w:tc>
+          <w:tcPr>
+            <w:tcW w:w="0" w:type="auto"/>
+            <w:hideMark/>
+          </w:tcPr>
+          <w:p>
+            <w:pPr>
+              <w:spacing w:after="160" w:line="259" w:lineRule="auto"/>
+            </w:pPr>
+            <w:r>
+              <w:rPr>
+                <w:b/>
+                <w:bCs/>
+              </w:rPr>
+              <w:t>WMC</w:t>
+            </w:r>
+            <w:r>
+              <w:t xml:space="preserve"> (Weighted Methods per Class)</w:t>
+            </w:r>
+          </w:p>
+        </w:tc>
+        <w:tc>
+          <w:tcPr>
+            <w:tcW w:w="0" w:type="auto"/>
+            <w:hideMark/>
+          </w:tcPr>
+          <w:p>
+            <w:pPr>
+              <w:spacing w:after="160" w:line="259" w:lineRule="auto"/>
+            </w:pPr>
+            <w:r>
+              <w:rPr>
+                <w:b/>
+                <w:bCs/>
+              </w:rPr>
+              <w:t>7,08</w:t>
+            </w:r>
+          </w:p>
+        </w:tc>
+        <w:tc>
+          <w:tcPr>
+            <w:tcW w:w="0" w:type="auto"/>
+            <w:hideMark/>
+          </w:tcPr>
+          <w:p>
+            <w:pPr>
+              <w:spacing w:after="160" w:line="259" w:lineRule="auto"/>
+            </w:pPr>
+            <w:r>
+              <w:t>Complessità interna contenuta. Assenza di "God Class".</w:t>
+            </w:r>
+          </w:p>
+        </w:tc>
+      </w:tr>
+      <w:tr>
+        <w:tc>
+          <w:tcPr>
+            <w:tcW w:w="0" w:type="auto"/>
+            <w:hideMark/>
+          </w:tcPr>
+          <w:p>
+            <w:pPr>
+              <w:spacing w:after="160" w:line="259" w:lineRule="auto"/>
+            </w:pPr>
+          </w:p>
+        </w:tc>
+        <w:tc>
+          <w:tcPr>
+            <w:tcW w:w="0" w:type="auto"/>
+            <w:hideMark/>
+          </w:tcPr>
+          <w:p>
+            <w:pPr>
+              <w:spacing w:after="160" w:line="259" w:lineRule="auto"/>
+            </w:pPr>
+            <w:r>
+              <w:rPr>
+                <w:b/>
+                <w:bCs/>
+              </w:rPr>
+              <w:t>DIT</w:t>
+            </w:r>
+            <w:r>
+              <w:t xml:space="preserve"> (Depth of Inheritance Tree)</w:t>
+            </w:r>
+          </w:p>
+        </w:tc>
+        <w:tc>
+          <w:tcPr>
+            <w:tcW w:w="0" w:type="auto"/>
+            <w:hideMark/>
+          </w:tcPr>
+          <w:p>
+            <w:pPr>
+              <w:spacing w:after="160" w:line="259" w:lineRule="auto"/>
+            </w:pPr>
+            <w:r>
+              <w:rPr>
+                <w:b/>
+                <w:bCs/>
+              </w:rPr>
+              <w:t>0,94</w:t>
+            </w:r>
+          </w:p>
+        </w:tc>
+        <w:tc>
+          <w:tcPr>
+            <w:tcW w:w="0" w:type="auto"/>
+            <w:hideMark/>
+          </w:tcPr>
+          <w:p>
+            <w:pPr>
+              <w:spacing w:after="160" w:line="259" w:lineRule="auto"/>
+            </w:pPr>
+            <w:r>
+              <w:t>Valore ridotto</w:t>
+            </w:r>
+          </w:p>
+        </w:tc>
+      </w:tr>
+      <w:tr>
+        <w:tc>
+          <w:tcPr>
+            <w:tcW w:w="0" w:type="auto"/>
+            <w:hideMark/>
+          </w:tcPr>
+          <w:p>
+            <w:pPr>
+              <w:spacing w:after="160" w:line="259" w:lineRule="auto"/>
+            </w:pPr>
+          </w:p>
+        </w:tc>
+        <w:tc>
+          <w:tcPr>
+            <w:tcW w:w="0" w:type="auto"/>
+            <w:hideMark/>
+          </w:tcPr>
+          <w:p>
+            <w:pPr>
+              <w:spacing w:after="160" w:line="259" w:lineRule="auto"/>
+            </w:pPr>
+            <w:r>
+              <w:rPr>
+                <w:b/>
+                <w:bCs/>
+              </w:rPr>
+              <w:t>RFC</w:t>
+            </w:r>
+            <w:r>
+              <w:t xml:space="preserve"> (Response For a Class)</w:t>
+            </w:r>
+          </w:p>
+        </w:tc>
+        <w:tc>
+          <w:tcPr>
+            <w:tcW w:w="0" w:type="auto"/>
+            <w:hideMark/>
+          </w:tcPr>
+          <w:p>
+            <w:pPr>
+              <w:spacing w:after="160" w:line="259" w:lineRule="auto"/>
+            </w:pPr>
+            <w:r>
+              <w:rPr>
+                <w:b/>
+                <w:bCs/>
+              </w:rPr>
+              <w:t>7,86</w:t>
+            </w:r>
+          </w:p>
+        </w:tc>
+        <w:tc>
+          <w:tcPr>
+            <w:tcW w:w="0" w:type="auto"/>
+            <w:hideMark/>
+          </w:tcPr>
+          <w:p>
+            <w:pPr>
+              <w:spacing w:after="160" w:line="259" w:lineRule="auto"/>
+            </w:pPr>
+            <w:r>
+              <w:t>Numero limitato di metodi eseguiti per chiamata (Alta testabilità).</w:t>
+            </w:r>
+          </w:p>
+        </w:tc>
+      </w:tr>
+    </w:tbl>
+    <w:p>
+      <w:pPr>
+        <w:rPr>
+          <w:i/>
+          <w:iCs/>
+          <w:u w:val="single"/>
+        </w:rPr>
+      </w:pPr>
+    </w:p>
+    <w:p>
+      <w:pPr>
+        <w:rPr>
+          <w:i/>
+          <w:iCs/>
+          <w:u w:val="single"/>
+        </w:rPr>
+      </w:pPr>
+    </w:p>
+    <w:p>
+      <w:pPr>
+        <w:rPr>
+          <w:i/>
+          <w:iCs/>
+          <w:u w:val="single"/>
+        </w:rPr>
+      </w:pPr>
+    </w:p>
+    <w:p>
+      <w:pPr>
+        <w:rPr>
+          <w:i/>
+          <w:iCs/>
+          <w:u w:val="single"/>
+        </w:rPr>
+      </w:pPr>
+    </w:p>
+    <w:p>
+      <w:pPr>
+        <w:rPr>
+          <w:i/>
+          <w:iCs/>
+          <w:u w:val="single"/>
+        </w:rPr>
+      </w:pPr>
+    </w:p>
+    <w:p>
+      <w:pPr>
+        <w:rPr>
+          <w:i/>
+          <w:iCs/>
+          <w:u w:val="single"/>
+        </w:rPr>
+      </w:pPr>
+      <w:r>
+        <w:rPr>
+          <w:i/>
+          <w:iCs/>
+          <w:u w:val="single"/>
+        </w:rPr>
+        <w:lastRenderedPageBreak/>
+        <w:t>Grafici</w:t>
+      </w:r>
+      <w:r>
+        <w:rPr>
+          <w:i/>
+          <w:iCs/>
+          <w:u w:val="single"/>
+        </w:rPr>
+        <w:t xml:space="preserve"> e dati</w:t>
+      </w:r>
+    </w:p>
+    <w:p>
+      <w:pPr>
+        <w:jc w:val="both"/>
+      </w:pPr>
+      <w:r>
+        <w:t>Po</w:t>
+      </w:r>
+      <w:r>
+        <w:t xml:space="preserve">llution: </w:t>
+      </w:r>
+    </w:p>
+    <w:p>
+      <w:pPr>
+        <w:jc w:val="center"/>
+      </w:pPr>
+      <w:r>
+        <w:drawing>
+          <wp:inline distT="0" distB="0" distL="0" distR="0" wp14:anchorId="38D33023" wp14:editId="5A7401F8">
+            <wp:extent cx="4824730" cy="3157250"/>
+            <wp:effectExtent l="0" t="0" r="0" b="5080"/>
+            <wp:docPr id="1288582219" name="Immagine 1"/>
+            <wp:cNvGraphicFramePr>
+              <a:graphicFrameLocks xmlns:a="http://schemas.openxmlformats.org/drawingml/2006/main" noChangeAspect="1"/>
+            </wp:cNvGraphicFramePr>
+            <a:graphic xmlns:a="http://schemas.openxmlformats.org/drawingml/2006/main">
+              <a:graphicData uri="http://schemas.openxmlformats.org/drawingml/2006/picture">
+                <pic:pic xmlns:pic="http://schemas.openxmlformats.org/drawingml/2006/picture">
+                  <pic:nvPicPr>
+                    <pic:cNvPr id="1288582219" name=""/>
+                    <pic:cNvPicPr/>
+                  </pic:nvPicPr>
+                  <pic:blipFill>
+                    <a:blip r:embed="rId5"/>
+                    <a:stretch>
+                      <a:fillRect/>
+                    </a:stretch>
+                  </pic:blipFill>
+                  <pic:spPr>
+                    <a:xfrm>
+                      <a:off x="0" y="0"/>
+                      <a:ext cx="4828865" cy="3159956"/>
+                    </a:xfrm>
+                    <a:prstGeom prst="rect">
+                      <a:avLst/>
+                    </a:prstGeom>
+                  </pic:spPr>
+                </pic:pic>
+              </a:graphicData>
+            </a:graphic>
+          </wp:inline>
+        </w:drawing>
+      </w:r>
+    </w:p>
+    <w:p>
+      <w:r>
+        <w:t>Metriche presenti in tabella:</w:t>
       </w:r>
     </w:p>
     <w:p/>
+    <w:p>
+      <w:pPr>
+        <w:jc w:val="center"/>
+      </w:pPr>
+      <w:r>
+        <w:drawing>
+          <wp:inline distT="0" distB="0" distL="0" distR="0" wp14:anchorId="03F85FE6" wp14:editId="6BD1C30F">
+            <wp:extent cx="4508500" cy="4279900"/>
+            <wp:effectExtent l="0" t="0" r="6350" b="6350"/>
+            <wp:docPr id="684648714" name="Immagine 1"/>
+            <wp:cNvGraphicFramePr>
+              <a:graphicFrameLocks xmlns:a="http://schemas.openxmlformats.org/drawingml/2006/main" noChangeAspect="1"/>
+            </wp:cNvGraphicFramePr>
+            <a:graphic xmlns:a="http://schemas.openxmlformats.org/drawingml/2006/main">
+              <a:graphicData uri="http://schemas.openxmlformats.org/drawingml/2006/picture">
+                <pic:pic xmlns:pic="http://schemas.openxmlformats.org/drawingml/2006/picture">
+                  <pic:nvPicPr>
+                    <pic:cNvPr id="684648714" name=""/>
+                    <pic:cNvPicPr/>
+                  </pic:nvPicPr>
+                  <pic:blipFill rotWithShape="1">
+                    <a:blip r:embed="rId6"/>
+                    <a:srcRect r="560" b="8968"/>
+                    <a:stretch>
+                      <a:fillRect/>
+                    </a:stretch>
+                  </pic:blipFill>
+                  <pic:spPr bwMode="auto">
+                    <a:xfrm>
+                      <a:off x="0" y="0"/>
+                      <a:ext cx="4508891" cy="4280271"/>
+                    </a:xfrm>
+                    <a:prstGeom prst="rect">
+                      <a:avLst/>
+                    </a:prstGeom>
+                    <a:ln>
+                      <a:noFill/>
+                    </a:ln>
+                    <a:extLst>
+                      <a:ext uri="{53640926-AAD7-44D8-BBD7-CCE9431645EC}">
+                        <a14:shadowObscured xmlns:a14="http://schemas.microsoft.com/office/drawing/2010/main"/>
+                      </a:ext>
+                    </a:extLst>
+                  </pic:spPr>
+                </pic:pic>
+              </a:graphicData>
+            </a:graphic>
+          </wp:inline>
+        </w:drawing>
+      </w:r>
+    </w:p>
     <w:sectPr>
       <w:pgSz w:w="11906" w:h="16838"/>
       <w:pgMar w:top="1417" w:right="1134" w:bottom="1134" w:left="1134" w:header="708" w:footer="708" w:gutter="0"/>
@@ -1148,6 +2146,232 @@
     </w:lvl>
   </w:abstractNum>
   <w:abstractNum w:abstractNumId="3" w15:restartNumberingAfterBreak="0">
+    <w:nsid w:val="199357EB"/>
+    <w:multiLevelType w:val="hybridMultilevel"/>
+    <w:tmpl w:val="25104252"/>
+    <w:lvl w:ilvl="0" w:tplc="04100001">
+      <w:start w:val="1"/>
+      <w:numFmt w:val="bullet"/>
+      <w:lvlText w:val=""/>
+      <w:lvlJc w:val="left"/>
+      <w:pPr>
+        <w:ind w:left="720" w:hanging="360"/>
+      </w:pPr>
+      <w:rPr>
+        <w:rFonts w:ascii="Symbol" w:hAnsi="Symbol" w:hint="default"/>
+      </w:rPr>
+    </w:lvl>
+    <w:lvl w:ilvl="1" w:tplc="04100003" w:tentative="1">
+      <w:start w:val="1"/>
+      <w:numFmt w:val="bullet"/>
+      <w:lvlText w:val="o"/>
+      <w:lvlJc w:val="left"/>
+      <w:pPr>
+        <w:ind w:left="1440" w:hanging="360"/>
+      </w:pPr>
+      <w:rPr>
+        <w:rFonts w:ascii="Courier New" w:hAnsi="Courier New" w:cs="Courier New" w:hint="default"/>
+      </w:rPr>
+    </w:lvl>
+    <w:lvl w:ilvl="2" w:tplc="04100005" w:tentative="1">
+      <w:start w:val="1"/>
+      <w:numFmt w:val="bullet"/>
+      <w:lvlText w:val=""/>
+      <w:lvlJc w:val="left"/>
+      <w:pPr>
+        <w:ind w:left="2160" w:hanging="360"/>
+      </w:pPr>
+      <w:rPr>
+        <w:rFonts w:ascii="Wingdings" w:hAnsi="Wingdings" w:hint="default"/>
+      </w:rPr>
+    </w:lvl>
+    <w:lvl w:ilvl="3" w:tplc="04100001" w:tentative="1">
+      <w:start w:val="1"/>
+      <w:numFmt w:val="bullet"/>
+      <w:lvlText w:val=""/>
+      <w:lvlJc w:val="left"/>
+      <w:pPr>
+        <w:ind w:left="2880" w:hanging="360"/>
+      </w:pPr>
+      <w:rPr>
+        <w:rFonts w:ascii="Symbol" w:hAnsi="Symbol" w:hint="default"/>
+      </w:rPr>
+    </w:lvl>
+    <w:lvl w:ilvl="4" w:tplc="04100003" w:tentative="1">
+      <w:start w:val="1"/>
+      <w:numFmt w:val="bullet"/>
+      <w:lvlText w:val="o"/>
+      <w:lvlJc w:val="left"/>
+      <w:pPr>
+        <w:ind w:left="3600" w:hanging="360"/>
+      </w:pPr>
+      <w:rPr>
+        <w:rFonts w:ascii="Courier New" w:hAnsi="Courier New" w:cs="Courier New" w:hint="default"/>
+      </w:rPr>
+    </w:lvl>
+    <w:lvl w:ilvl="5" w:tplc="04100005" w:tentative="1">
+      <w:start w:val="1"/>
+      <w:numFmt w:val="bullet"/>
+      <w:lvlText w:val=""/>
+      <w:lvlJc w:val="left"/>
+      <w:pPr>
+        <w:ind w:left="4320" w:hanging="360"/>
+      </w:pPr>
+      <w:rPr>
+        <w:rFonts w:ascii="Wingdings" w:hAnsi="Wingdings" w:hint="default"/>
+      </w:rPr>
+    </w:lvl>
+    <w:lvl w:ilvl="6" w:tplc="04100001" w:tentative="1">
+      <w:start w:val="1"/>
+      <w:numFmt w:val="bullet"/>
+      <w:lvlText w:val=""/>
+      <w:lvlJc w:val="left"/>
+      <w:pPr>
+        <w:ind w:left="5040" w:hanging="360"/>
+      </w:pPr>
+      <w:rPr>
+        <w:rFonts w:ascii="Symbol" w:hAnsi="Symbol" w:hint="default"/>
+      </w:rPr>
+    </w:lvl>
+    <w:lvl w:ilvl="7" w:tplc="04100003" w:tentative="1">
+      <w:start w:val="1"/>
+      <w:numFmt w:val="bullet"/>
+      <w:lvlText w:val="o"/>
+      <w:lvlJc w:val="left"/>
+      <w:pPr>
+        <w:ind w:left="5760" w:hanging="360"/>
+      </w:pPr>
+      <w:rPr>
+        <w:rFonts w:ascii="Courier New" w:hAnsi="Courier New" w:cs="Courier New" w:hint="default"/>
+      </w:rPr>
+    </w:lvl>
+    <w:lvl w:ilvl="8" w:tplc="04100005" w:tentative="1">
+      <w:start w:val="1"/>
+      <w:numFmt w:val="bullet"/>
+      <w:lvlText w:val=""/>
+      <w:lvlJc w:val="left"/>
+      <w:pPr>
+        <w:ind w:left="6480" w:hanging="360"/>
+      </w:pPr>
+      <w:rPr>
+        <w:rFonts w:ascii="Wingdings" w:hAnsi="Wingdings" w:hint="default"/>
+      </w:rPr>
+    </w:lvl>
+  </w:abstractNum>
+  <w:abstractNum w:abstractNumId="4" w15:restartNumberingAfterBreak="0">
+    <w:nsid w:val="1F2C1761"/>
+    <w:multiLevelType w:val="hybridMultilevel"/>
+    <w:tmpl w:val="231C715C"/>
+    <w:lvl w:ilvl="0" w:tplc="04100001">
+      <w:start w:val="1"/>
+      <w:numFmt w:val="bullet"/>
+      <w:lvlText w:val=""/>
+      <w:lvlJc w:val="left"/>
+      <w:pPr>
+        <w:ind w:left="720" w:hanging="360"/>
+      </w:pPr>
+      <w:rPr>
+        <w:rFonts w:ascii="Symbol" w:hAnsi="Symbol" w:hint="default"/>
+      </w:rPr>
+    </w:lvl>
+    <w:lvl w:ilvl="1" w:tplc="04100003" w:tentative="1">
+      <w:start w:val="1"/>
+      <w:numFmt w:val="bullet"/>
+      <w:lvlText w:val="o"/>
+      <w:lvlJc w:val="left"/>
+      <w:pPr>
+        <w:ind w:left="1440" w:hanging="360"/>
+      </w:pPr>
+      <w:rPr>
+        <w:rFonts w:ascii="Courier New" w:hAnsi="Courier New" w:cs="Courier New" w:hint="default"/>
+      </w:rPr>
+    </w:lvl>
+    <w:lvl w:ilvl="2" w:tplc="04100005" w:tentative="1">
+      <w:start w:val="1"/>
+      <w:numFmt w:val="bullet"/>
+      <w:lvlText w:val=""/>
+      <w:lvlJc w:val="left"/>
+      <w:pPr>
+        <w:ind w:left="2160" w:hanging="360"/>
+      </w:pPr>
+      <w:rPr>
+        <w:rFonts w:ascii="Wingdings" w:hAnsi="Wingdings" w:hint="default"/>
+      </w:rPr>
+    </w:lvl>
+    <w:lvl w:ilvl="3" w:tplc="04100001" w:tentative="1">
+      <w:start w:val="1"/>
+      <w:numFmt w:val="bullet"/>
+      <w:lvlText w:val=""/>
+      <w:lvlJc w:val="left"/>
+      <w:pPr>
+        <w:ind w:left="2880" w:hanging="360"/>
+      </w:pPr>
+      <w:rPr>
+        <w:rFonts w:ascii="Symbol" w:hAnsi="Symbol" w:hint="default"/>
+      </w:rPr>
+    </w:lvl>
+    <w:lvl w:ilvl="4" w:tplc="04100003" w:tentative="1">
+      <w:start w:val="1"/>
+      <w:numFmt w:val="bullet"/>
+      <w:lvlText w:val="o"/>
+      <w:lvlJc w:val="left"/>
+      <w:pPr>
+        <w:ind w:left="3600" w:hanging="360"/>
+      </w:pPr>
+      <w:rPr>
+        <w:rFonts w:ascii="Courier New" w:hAnsi="Courier New" w:cs="Courier New" w:hint="default"/>
+      </w:rPr>
+    </w:lvl>
+    <w:lvl w:ilvl="5" w:tplc="04100005" w:tentative="1">
+      <w:start w:val="1"/>
+      <w:numFmt w:val="bullet"/>
+      <w:lvlText w:val=""/>
+      <w:lvlJc w:val="left"/>
+      <w:pPr>
+        <w:ind w:left="4320" w:hanging="360"/>
+      </w:pPr>
+      <w:rPr>
+        <w:rFonts w:ascii="Wingdings" w:hAnsi="Wingdings" w:hint="default"/>
+      </w:rPr>
+    </w:lvl>
+    <w:lvl w:ilvl="6" w:tplc="04100001" w:tentative="1">
+      <w:start w:val="1"/>
+      <w:numFmt w:val="bullet"/>
+      <w:lvlText w:val=""/>
+      <w:lvlJc w:val="left"/>
+      <w:pPr>
+        <w:ind w:left="5040" w:hanging="360"/>
+      </w:pPr>
+      <w:rPr>
+        <w:rFonts w:ascii="Symbol" w:hAnsi="Symbol" w:hint="default"/>
+      </w:rPr>
+    </w:lvl>
+    <w:lvl w:ilvl="7" w:tplc="04100003" w:tentative="1">
+      <w:start w:val="1"/>
+      <w:numFmt w:val="bullet"/>
+      <w:lvlText w:val="o"/>
+      <w:lvlJc w:val="left"/>
+      <w:pPr>
+        <w:ind w:left="5760" w:hanging="360"/>
+      </w:pPr>
+      <w:rPr>
+        <w:rFonts w:ascii="Courier New" w:hAnsi="Courier New" w:cs="Courier New" w:hint="default"/>
+      </w:rPr>
+    </w:lvl>
+    <w:lvl w:ilvl="8" w:tplc="04100005" w:tentative="1">
+      <w:start w:val="1"/>
+      <w:numFmt w:val="bullet"/>
+      <w:lvlText w:val=""/>
+      <w:lvlJc w:val="left"/>
+      <w:pPr>
+        <w:ind w:left="6480" w:hanging="360"/>
+      </w:pPr>
+      <w:rPr>
+        <w:rFonts w:ascii="Wingdings" w:hAnsi="Wingdings" w:hint="default"/>
+      </w:rPr>
+    </w:lvl>
+  </w:abstractNum>
+  <w:abstractNum w:abstractNumId="5" w15:restartNumberingAfterBreak="0">
     <w:nsid w:val="2D943FEB"/>
     <w:multiLevelType w:val="multilevel"/>
     <w:tmpl w:val="E30E1DF2"/>
@@ -1296,7 +2520,7 @@
       </w:rPr>
     </w:lvl>
   </w:abstractNum>
-  <w:abstractNum w:abstractNumId="4" w15:restartNumberingAfterBreak="0">
+  <w:abstractNum w:abstractNumId="6" w15:restartNumberingAfterBreak="0">
     <w:nsid w:val="37C77CE8"/>
     <w:multiLevelType w:val="hybridMultilevel"/>
     <w:tmpl w:val="3370C034"/>
@@ -1409,7 +2633,7 @@
       </w:rPr>
     </w:lvl>
   </w:abstractNum>
-  <w:abstractNum w:abstractNumId="5" w15:restartNumberingAfterBreak="0">
+  <w:abstractNum w:abstractNumId="7" w15:restartNumberingAfterBreak="0">
     <w:nsid w:val="37FD367E"/>
     <w:multiLevelType w:val="multilevel"/>
     <w:tmpl w:val="E30E1DF2"/>
@@ -1558,7 +2782,7 @@
       </w:rPr>
     </w:lvl>
   </w:abstractNum>
-  <w:abstractNum w:abstractNumId="6" w15:restartNumberingAfterBreak="0">
+  <w:abstractNum w:abstractNumId="8" w15:restartNumberingAfterBreak="0">
     <w:nsid w:val="3B6E340C"/>
     <w:multiLevelType w:val="multilevel"/>
     <w:tmpl w:val="E30E1DF2"/>
@@ -1707,7 +2931,7 @@
       </w:rPr>
     </w:lvl>
   </w:abstractNum>
-  <w:abstractNum w:abstractNumId="7" w15:restartNumberingAfterBreak="0">
+  <w:abstractNum w:abstractNumId="9" w15:restartNumberingAfterBreak="0">
     <w:nsid w:val="44900B77"/>
     <w:multiLevelType w:val="hybridMultilevel"/>
     <w:tmpl w:val="0080A08C"/>
@@ -1820,7 +3044,7 @@
       </w:rPr>
     </w:lvl>
   </w:abstractNum>
-  <w:abstractNum w:abstractNumId="8" w15:restartNumberingAfterBreak="0">
+  <w:abstractNum w:abstractNumId="10" w15:restartNumberingAfterBreak="0">
     <w:nsid w:val="45841EB6"/>
     <w:multiLevelType w:val="multilevel"/>
     <w:tmpl w:val="B79A3854"/>
@@ -1969,7 +3193,7 @@
       </w:rPr>
     </w:lvl>
   </w:abstractNum>
-  <w:abstractNum w:abstractNumId="9" w15:restartNumberingAfterBreak="0">
+  <w:abstractNum w:abstractNumId="11" w15:restartNumberingAfterBreak="0">
     <w:nsid w:val="48C60DE8"/>
     <w:multiLevelType w:val="hybridMultilevel"/>
     <w:tmpl w:val="6B725770"/>
@@ -2082,7 +3306,7 @@
       </w:rPr>
     </w:lvl>
   </w:abstractNum>
-  <w:abstractNum w:abstractNumId="10" w15:restartNumberingAfterBreak="0">
+  <w:abstractNum w:abstractNumId="12" w15:restartNumberingAfterBreak="0">
     <w:nsid w:val="4BD622EC"/>
     <w:multiLevelType w:val="hybridMultilevel"/>
     <w:tmpl w:val="F348BBB0"/>
@@ -2195,7 +3419,7 @@
       </w:rPr>
     </w:lvl>
   </w:abstractNum>
-  <w:abstractNum w:abstractNumId="11" w15:restartNumberingAfterBreak="0">
+  <w:abstractNum w:abstractNumId="13" w15:restartNumberingAfterBreak="0">
     <w:nsid w:val="538F635A"/>
     <w:multiLevelType w:val="multilevel"/>
     <w:tmpl w:val="E30E1DF2"/>
@@ -2344,7 +3568,7 @@
       </w:rPr>
     </w:lvl>
   </w:abstractNum>
-  <w:abstractNum w:abstractNumId="12" w15:restartNumberingAfterBreak="0">
+  <w:abstractNum w:abstractNumId="14" w15:restartNumberingAfterBreak="0">
     <w:nsid w:val="57D4187F"/>
     <w:multiLevelType w:val="hybridMultilevel"/>
     <w:tmpl w:val="F4841A34"/>
@@ -2457,7 +3681,7 @@
       </w:rPr>
     </w:lvl>
   </w:abstractNum>
-  <w:abstractNum w:abstractNumId="13" w15:restartNumberingAfterBreak="0">
+  <w:abstractNum w:abstractNumId="15" w15:restartNumberingAfterBreak="0">
     <w:nsid w:val="70C33045"/>
     <w:multiLevelType w:val="hybridMultilevel"/>
     <w:tmpl w:val="21B22AC8"/>
@@ -2570,7 +3794,7 @@
       </w:rPr>
     </w:lvl>
   </w:abstractNum>
-  <w:abstractNum w:abstractNumId="14" w15:restartNumberingAfterBreak="0">
+  <w:abstractNum w:abstractNumId="16" w15:restartNumberingAfterBreak="0">
     <w:nsid w:val="78844349"/>
     <w:multiLevelType w:val="hybridMultilevel"/>
     <w:tmpl w:val="04B61042"/>
@@ -2676,6 +3900,119 @@
       <w:lvlJc w:val="left"/>
       <w:pPr>
         <w:ind w:left="7200" w:hanging="360"/>
+      </w:pPr>
+      <w:rPr>
+        <w:rFonts w:ascii="Wingdings" w:hAnsi="Wingdings" w:hint="default"/>
+      </w:rPr>
+    </w:lvl>
+  </w:abstractNum>
+  <w:abstractNum w:abstractNumId="17" w15:restartNumberingAfterBreak="0">
+    <w:nsid w:val="7C243AC0"/>
+    <w:multiLevelType w:val="hybridMultilevel"/>
+    <w:tmpl w:val="FC669D04"/>
+    <w:lvl w:ilvl="0" w:tplc="04100001">
+      <w:start w:val="1"/>
+      <w:numFmt w:val="bullet"/>
+      <w:lvlText w:val=""/>
+      <w:lvlJc w:val="left"/>
+      <w:pPr>
+        <w:ind w:left="1424" w:hanging="360"/>
+      </w:pPr>
+      <w:rPr>
+        <w:rFonts w:ascii="Symbol" w:hAnsi="Symbol" w:hint="default"/>
+      </w:rPr>
+    </w:lvl>
+    <w:lvl w:ilvl="1" w:tplc="04100003" w:tentative="1">
+      <w:start w:val="1"/>
+      <w:numFmt w:val="bullet"/>
+      <w:lvlText w:val="o"/>
+      <w:lvlJc w:val="left"/>
+      <w:pPr>
+        <w:ind w:left="2144" w:hanging="360"/>
+      </w:pPr>
+      <w:rPr>
+        <w:rFonts w:ascii="Courier New" w:hAnsi="Courier New" w:cs="Courier New" w:hint="default"/>
+      </w:rPr>
+    </w:lvl>
+    <w:lvl w:ilvl="2" w:tplc="04100005" w:tentative="1">
+      <w:start w:val="1"/>
+      <w:numFmt w:val="bullet"/>
+      <w:lvlText w:val=""/>
+      <w:lvlJc w:val="left"/>
+      <w:pPr>
+        <w:ind w:left="2864" w:hanging="360"/>
+      </w:pPr>
+      <w:rPr>
+        <w:rFonts w:ascii="Wingdings" w:hAnsi="Wingdings" w:hint="default"/>
+      </w:rPr>
+    </w:lvl>
+    <w:lvl w:ilvl="3" w:tplc="04100001" w:tentative="1">
+      <w:start w:val="1"/>
+      <w:numFmt w:val="bullet"/>
+      <w:lvlText w:val=""/>
+      <w:lvlJc w:val="left"/>
+      <w:pPr>
+        <w:ind w:left="3584" w:hanging="360"/>
+      </w:pPr>
+      <w:rPr>
+        <w:rFonts w:ascii="Symbol" w:hAnsi="Symbol" w:hint="default"/>
+      </w:rPr>
+    </w:lvl>
+    <w:lvl w:ilvl="4" w:tplc="04100003" w:tentative="1">
+      <w:start w:val="1"/>
+      <w:numFmt w:val="bullet"/>
+      <w:lvlText w:val="o"/>
+      <w:lvlJc w:val="left"/>
+      <w:pPr>
+        <w:ind w:left="4304" w:hanging="360"/>
+      </w:pPr>
+      <w:rPr>
+        <w:rFonts w:ascii="Courier New" w:hAnsi="Courier New" w:cs="Courier New" w:hint="default"/>
+      </w:rPr>
+    </w:lvl>
+    <w:lvl w:ilvl="5" w:tplc="04100005" w:tentative="1">
+      <w:start w:val="1"/>
+      <w:numFmt w:val="bullet"/>
+      <w:lvlText w:val=""/>
+      <w:lvlJc w:val="left"/>
+      <w:pPr>
+        <w:ind w:left="5024" w:hanging="360"/>
+      </w:pPr>
+      <w:rPr>
+        <w:rFonts w:ascii="Wingdings" w:hAnsi="Wingdings" w:hint="default"/>
+      </w:rPr>
+    </w:lvl>
+    <w:lvl w:ilvl="6" w:tplc="04100001" w:tentative="1">
+      <w:start w:val="1"/>
+      <w:numFmt w:val="bullet"/>
+      <w:lvlText w:val=""/>
+      <w:lvlJc w:val="left"/>
+      <w:pPr>
+        <w:ind w:left="5744" w:hanging="360"/>
+      </w:pPr>
+      <w:rPr>
+        <w:rFonts w:ascii="Symbol" w:hAnsi="Symbol" w:hint="default"/>
+      </w:rPr>
+    </w:lvl>
+    <w:lvl w:ilvl="7" w:tplc="04100003" w:tentative="1">
+      <w:start w:val="1"/>
+      <w:numFmt w:val="bullet"/>
+      <w:lvlText w:val="o"/>
+      <w:lvlJc w:val="left"/>
+      <w:pPr>
+        <w:ind w:left="6464" w:hanging="360"/>
+      </w:pPr>
+      <w:rPr>
+        <w:rFonts w:ascii="Courier New" w:hAnsi="Courier New" w:cs="Courier New" w:hint="default"/>
+      </w:rPr>
+    </w:lvl>
+    <w:lvl w:ilvl="8" w:tplc="04100005" w:tentative="1">
+      <w:start w:val="1"/>
+      <w:numFmt w:val="bullet"/>
+      <w:lvlText w:val=""/>
+      <w:lvlJc w:val="left"/>
+      <w:pPr>
+        <w:ind w:left="7184" w:hanging="360"/>
       </w:pPr>
       <w:rPr>
         <w:rFonts w:ascii="Wingdings" w:hAnsi="Wingdings" w:hint="default"/>
@@ -2689,43 +4026,52 @@
     <w:abstractNumId w:val="2"/>
   </w:num>
   <w:num w:numId="3" w16cid:durableId="811294443">
-    <w:abstractNumId w:val="3"/>
+    <w:abstractNumId w:val="5"/>
   </w:num>
   <w:num w:numId="4" w16cid:durableId="1973899524">
-    <w:abstractNumId w:val="6"/>
+    <w:abstractNumId w:val="8"/>
   </w:num>
   <w:num w:numId="5" w16cid:durableId="89545462">
-    <w:abstractNumId w:val="11"/>
+    <w:abstractNumId w:val="13"/>
   </w:num>
   <w:num w:numId="6" w16cid:durableId="1540388402">
-    <w:abstractNumId w:val="5"/>
+    <w:abstractNumId w:val="7"/>
   </w:num>
   <w:num w:numId="7" w16cid:durableId="284893279">
     <w:abstractNumId w:val="1"/>
   </w:num>
   <w:num w:numId="8" w16cid:durableId="2131973897">
+    <w:abstractNumId w:val="12"/>
+  </w:num>
+  <w:num w:numId="9" w16cid:durableId="669021043">
     <w:abstractNumId w:val="10"/>
   </w:num>
-  <w:num w:numId="9" w16cid:durableId="669021043">
-    <w:abstractNumId w:val="8"/>
+  <w:num w:numId="10" w16cid:durableId="755326793">
+    <w:abstractNumId w:val="11"/>
   </w:num>
-  <w:num w:numId="10" w16cid:durableId="755326793">
+  <w:num w:numId="11" w16cid:durableId="667902229">
+    <w:abstractNumId w:val="6"/>
+  </w:num>
+  <w:num w:numId="12" w16cid:durableId="742096692">
     <w:abstractNumId w:val="9"/>
   </w:num>
-  <w:num w:numId="11" w16cid:durableId="667902229">
+  <w:num w:numId="13" w16cid:durableId="1752964556">
+    <w:abstractNumId w:val="14"/>
+  </w:num>
+  <w:num w:numId="14" w16cid:durableId="17588416">
+    <w:abstractNumId w:val="16"/>
+  </w:num>
+  <w:num w:numId="15" w16cid:durableId="510026564">
+    <w:abstractNumId w:val="15"/>
+  </w:num>
+  <w:num w:numId="16" w16cid:durableId="452403198">
+    <w:abstractNumId w:val="17"/>
+  </w:num>
+  <w:num w:numId="17" w16cid:durableId="1561863984">
     <w:abstractNumId w:val="4"/>
   </w:num>
-  <w:num w:numId="12" w16cid:durableId="742096692">
-    <w:abstractNumId w:val="7"/>
-  </w:num>
-  <w:num w:numId="13" w16cid:durableId="1752964556">
-    <w:abstractNumId w:val="12"/>
-  </w:num>
-  <w:num w:numId="14" w16cid:durableId="17588416">
-    <w:abstractNumId w:val="14"/>
-  </w:num>
-  <w:num w:numId="15" w16cid:durableId="510026564">
-    <w:abstractNumId w:val="13"/>
+  <w:num w:numId="18" w16cid:durableId="804616317">
+    <w:abstractNumId w:val="3"/>
   </w:num>
 </w:numbering>
 </file>
@@ -3333,7 +4679,6 @@
   <w:style w:type="character" w:default="1" w:styleId="Carpredefinitoparagrafo">
     <w:name w:val="Default Paragraph Font"/>
     <w:uiPriority w:val="1"/>
-    <w:semiHidden/>
     <w:unhideWhenUsed/>
   </w:style>
   <w:style w:type="table" w:default="1" w:styleId="Tabellanormale">
@@ -3647,6 +4992,44 @@
       <w:spacing w:val="5"/>
     </w:rPr>
   </w:style>
+  <w:style w:type="table" w:styleId="Grigliatabellachiara">
+    <w:name w:val="Grid Table Light"/>
+    <w:basedOn w:val="Tabellanormale"/>
+    <w:uiPriority w:val="40"/>
+    <w:rsid w:val="00F760AB"/>
+    <w:pPr>
+      <w:spacing w:after="0" w:line="240" w:lineRule="auto"/>
+    </w:pPr>
+    <w:tblPr>
+      <w:tblBorders>
+        <w:top w:val="single" w:sz="4" w:space="0" w:color="BFBFBF" w:themeColor="background1" w:themeShade="BF"/>
+        <w:left w:val="single" w:sz="4" w:space="0" w:color="BFBFBF" w:themeColor="background1" w:themeShade="BF"/>
+        <w:bottom w:val="single" w:sz="4" w:space="0" w:color="BFBFBF" w:themeColor="background1" w:themeShade="BF"/>
+        <w:right w:val="single" w:sz="4" w:space="0" w:color="BFBFBF" w:themeColor="background1" w:themeShade="BF"/>
+        <w:insideH w:val="single" w:sz="4" w:space="0" w:color="BFBFBF" w:themeColor="background1" w:themeShade="BF"/>
+        <w:insideV w:val="single" w:sz="4" w:space="0" w:color="BFBFBF" w:themeColor="background1" w:themeShade="BF"/>
+      </w:tblBorders>
+    </w:tblPr>
+  </w:style>
+  <w:style w:type="table" w:styleId="Grigliatabella">
+    <w:name w:val="Table Grid"/>
+    <w:basedOn w:val="Tabellanormale"/>
+    <w:uiPriority w:val="39"/>
+    <w:rsid w:val="00F760AB"/>
+    <w:pPr>
+      <w:spacing w:after="0" w:line="240" w:lineRule="auto"/>
+    </w:pPr>
+    <w:tblPr>
+      <w:tblBorders>
+        <w:top w:val="single" w:sz="4" w:space="0" w:color="auto"/>
+        <w:left w:val="single" w:sz="4" w:space="0" w:color="auto"/>
+        <w:bottom w:val="single" w:sz="4" w:space="0" w:color="auto"/>
+        <w:right w:val="single" w:sz="4" w:space="0" w:color="auto"/>
+        <w:insideH w:val="single" w:sz="4" w:space="0" w:color="auto"/>
+        <w:insideV w:val="single" w:sz="4" w:space="0" w:color="auto"/>
+      </w:tblBorders>
+    </w:tblPr>
+  </w:style>
 </w:styles>
 </file>
 

</xml_diff>

<commit_message>
Aggiornamento sprint finale e revisione file design
</commit_message>
<xml_diff>
--- a/documentazione/Design.docx
+++ b/documentazione/Design.docx
@@ -3,7 +3,21 @@
 <w:document xmlns:wpc="http://schemas.microsoft.com/office/word/2010/wordprocessingCanvas" xmlns:cx="http://schemas.microsoft.com/office/drawing/2014/chartex" xmlns:cx1="http://schemas.microsoft.com/office/drawing/2015/9/8/chartex" xmlns:cx2="http://schemas.microsoft.com/office/drawing/2015/10/21/chartex" xmlns:cx3="http://schemas.microsoft.com/office/drawing/2016/5/9/chartex" xmlns:cx4="http://schemas.microsoft.com/office/drawing/2016/5/10/chartex" xmlns:cx5="http://schemas.microsoft.com/office/drawing/2016/5/11/chartex" xmlns:cx6="http://schemas.microsoft.com/office/drawing/2016/5/12/chartex" xmlns:cx7="http://schemas.microsoft.com/office/drawing/2016/5/13/chartex" xmlns:cx8="http://schemas.microsoft.com/office/drawing/2016/5/14/chartex" xmlns:mc="http://schemas.openxmlformats.org/markup-compatibility/2006" xmlns:aink="http://schemas.microsoft.com/office/drawing/2016/ink" xmlns:am3d="http://schemas.microsoft.com/office/drawing/2017/model3d" xmlns:o="urn:schemas-microsoft-com:office:office" xmlns:oel="http://schemas.microsoft.com/office/2019/extlst" xmlns:r="http://schemas.openxmlformats.org/officeDocument/2006/relationships" xmlns:m="http://schemas.openxmlformats.org/officeDocument/2006/math" xmlns:v="urn:schemas-microsoft-com:vml" xmlns:wp14="http://schemas.microsoft.com/office/word/2010/wordprocessingDrawing" xmlns:wp="http://schemas.openxmlformats.org/drawingml/2006/wordprocessingDrawing" xmlns:w10="urn:schemas-microsoft-com:office:word" xmlns:w="http://schemas.openxmlformats.org/wordprocessingml/2006/main" xmlns:w14="http://schemas.microsoft.com/office/word/2010/wordml" xmlns:w15="http://schemas.microsoft.com/office/word/2012/wordml" xmlns:w16cex="http://schemas.microsoft.com/office/word/2018/wordml/cex" xmlns:w16cid="http://schemas.microsoft.com/office/word/2016/wordml/cid" xmlns:w16="http://schemas.microsoft.com/office/word/2018/wordml" xmlns:w16du="http://schemas.microsoft.com/office/word/2023/wordml/word16du" xmlns:w16sdtdh="http://schemas.microsoft.com/office/word/2020/wordml/sdtdatahash" xmlns:w16sdtfl="http://schemas.microsoft.com/office/word/2024/wordml/sdtformatlock" xmlns:w16se="http://schemas.microsoft.com/office/word/2015/wordml/symex" xmlns:wpg="http://schemas.microsoft.com/office/word/2010/wordprocessingGroup" xmlns:wpi="http://schemas.microsoft.com/office/word/2010/wordprocessingInk" xmlns:wne="http://schemas.microsoft.com/office/word/2006/wordml" xmlns:wps="http://schemas.microsoft.com/office/word/2010/wordprocessingShape" mc:Ignorable="w14 w15 w16se w16cid w16 w16cex w16sdtdh w16sdtfl w16du wp14">
   <w:body>
     <w:p>
-      <w:r>
+      <w:pPr>
+        <w:rPr>
+          <w:b/>
+          <w:bCs/>
+          <w:i/>
+          <w:iCs/>
+        </w:rPr>
+      </w:pPr>
+      <w:r>
+        <w:rPr>
+          <w:b/>
+          <w:bCs/>
+          <w:i/>
+          <w:iCs/>
+        </w:rPr>
         <w:t>DESIGN</w:t>
       </w:r>
     </w:p>
@@ -14,6 +28,7 @@
           <w:bCs/>
         </w:rPr>
       </w:pPr>
+      <w:proofErr w:type="spellStart"/>
       <w:r>
         <w:rPr>
           <w:b/>
@@ -21,6 +36,7 @@
         </w:rPr>
         <w:t>Modelling</w:t>
       </w:r>
+      <w:proofErr w:type="spellEnd"/>
     </w:p>
     <w:p>
       <w:pPr>
@@ -62,11 +78,16 @@
       <w:r>
         <w:t xml:space="preserve">Use case </w:t>
       </w:r>
+      <w:proofErr w:type="spellStart"/>
       <w:r>
         <w:t>d</w:t>
       </w:r>
       <w:r>
-        <w:t>iagram : definisce i confini del sistema e le interazioni degli attori Utente ed Admin</w:t>
+        <w:t>iagram</w:t>
+      </w:r>
+      <w:proofErr w:type="spellEnd"/>
+      <w:r>
+        <w:t xml:space="preserve"> : definisce i confini del sistema e le interazioni degli attori Utente ed Admin</w:t>
       </w:r>
     </w:p>
     <w:p>
@@ -87,9 +108,11 @@
       <w:r>
         <w:t xml:space="preserve">Class </w:t>
       </w:r>
+      <w:proofErr w:type="spellStart"/>
       <w:r>
         <w:t>diagram</w:t>
       </w:r>
+      <w:proofErr w:type="spellEnd"/>
       <w:r>
         <w:t xml:space="preserve"> : rappr</w:t>
       </w:r>
@@ -130,9 +153,11 @@
       <w:r>
         <w:t xml:space="preserve"> </w:t>
       </w:r>
+      <w:proofErr w:type="spellStart"/>
       <w:r>
         <w:t>diagram</w:t>
       </w:r>
+      <w:proofErr w:type="spellEnd"/>
       <w:r>
         <w:t>: modellato il flusso dell’accesso e della prenotazione</w:t>
       </w:r>
@@ -152,12 +177,19 @@
         </w:numPr>
         <w:spacing w:after="0"/>
       </w:pPr>
-      <w:r>
-        <w:t xml:space="preserve">Sequence </w:t>
-      </w:r>
+      <w:proofErr w:type="spellStart"/>
+      <w:r>
+        <w:t>Sequence</w:t>
+      </w:r>
+      <w:proofErr w:type="spellEnd"/>
+      <w:r>
+        <w:t xml:space="preserve"> </w:t>
+      </w:r>
+      <w:proofErr w:type="spellStart"/>
       <w:r>
         <w:t>diagram</w:t>
       </w:r>
+      <w:proofErr w:type="spellEnd"/>
       <w:r>
         <w:t>: rappresenta flusso di messaggi dal ten</w:t>
       </w:r>
@@ -185,12 +217,19 @@
         </w:numPr>
         <w:spacing w:after="0"/>
       </w:pPr>
-      <w:r>
-        <w:t xml:space="preserve">Communication </w:t>
-      </w:r>
+      <w:proofErr w:type="spellStart"/>
+      <w:r>
+        <w:t>Communication</w:t>
+      </w:r>
+      <w:proofErr w:type="spellEnd"/>
+      <w:r>
+        <w:t xml:space="preserve"> </w:t>
+      </w:r>
+      <w:proofErr w:type="spellStart"/>
       <w:r>
         <w:t>diagram</w:t>
       </w:r>
+      <w:proofErr w:type="spellEnd"/>
       <w:r>
         <w:t>: rappresenta flusso di messaggi dal ten</w:t>
       </w:r>
@@ -201,11 +240,21 @@
         <w:t>ativo di prenotazione alla sua conferma</w:t>
       </w:r>
       <w:r>
+        <w:t xml:space="preserve"> in maniera alternativa al </w:t>
+      </w:r>
+      <w:proofErr w:type="spellStart"/>
+      <w:r>
+        <w:t>sequence</w:t>
+      </w:r>
+      <w:proofErr w:type="spellEnd"/>
+      <w:r>
         <w:t xml:space="preserve"> </w:t>
       </w:r>
-      <w:r>
-        <w:t>in maniera alternativa al sequence diagram</w:t>
-      </w:r>
+      <w:proofErr w:type="spellStart"/>
+      <w:r>
+        <w:t>diagram</w:t>
+      </w:r>
+      <w:proofErr w:type="spellEnd"/>
     </w:p>
     <w:p>
       <w:pPr>
@@ -224,12 +273,14 @@
       <w:r>
         <w:t xml:space="preserve">Activity </w:t>
       </w:r>
+      <w:proofErr w:type="spellStart"/>
       <w:r>
         <w:t>D</w:t>
       </w:r>
       <w:r>
         <w:t>iagram</w:t>
       </w:r>
+      <w:proofErr w:type="spellEnd"/>
       <w:r>
         <w:t>: descrive il flusso completo dell’utente all’interno dell’applicazione, dall’accesso sino alla conferma della prenotazione</w:t>
       </w:r>
@@ -251,12 +302,14 @@
       <w:r>
         <w:t xml:space="preserve">Component </w:t>
       </w:r>
+      <w:proofErr w:type="spellStart"/>
       <w:r>
         <w:t>D</w:t>
       </w:r>
       <w:r>
         <w:t>iagram</w:t>
       </w:r>
+      <w:proofErr w:type="spellEnd"/>
       <w:r>
         <w:t>: illustra l’architettura del sistema e le dipendenze tra le varie componenti, sia interne che esterne</w:t>
       </w:r>
@@ -278,15 +331,22 @@
       <w:r>
         <w:t xml:space="preserve">Package </w:t>
       </w:r>
+      <w:proofErr w:type="spellStart"/>
       <w:r>
         <w:t>D</w:t>
       </w:r>
       <w:r>
         <w:t>iagram</w:t>
       </w:r>
-      <w:r>
-        <w:t>: visualizza l’organizzazione dei pacchetti java, senza creare cicli per garantire un codice pulito e manutenibile</w:t>
-      </w:r>
+      <w:proofErr w:type="spellEnd"/>
+      <w:r>
+        <w:t xml:space="preserve">: visualizza l’organizzazione dei pacchetti java, senza creare cicli per garantire un codice pulito e </w:t>
+      </w:r>
+      <w:proofErr w:type="spellStart"/>
+      <w:r>
+        <w:t>manutenibile</w:t>
+      </w:r>
+      <w:proofErr w:type="spellEnd"/>
     </w:p>
     <w:p>
       <w:pPr>
@@ -305,8 +365,29 @@
         <w:spacing w:after="0"/>
       </w:pPr>
       <w:r>
-        <w:t>I file presenti in questo documento sono ritrovabili anche all’interno della cartella del codice (find-n-charge/diagrammiUML</w:t>
-      </w:r>
+        <w:t>I file presenti in questo documento sono ritrovabili anche all’interno della cartella del codice (</w:t>
+      </w:r>
+      <w:proofErr w:type="spellStart"/>
+      <w:r>
+        <w:t>find</w:t>
+      </w:r>
+      <w:proofErr w:type="spellEnd"/>
+      <w:r>
+        <w:t>-n-</w:t>
+      </w:r>
+      <w:proofErr w:type="spellStart"/>
+      <w:r>
+        <w:t>charge</w:t>
+      </w:r>
+      <w:proofErr w:type="spellEnd"/>
+      <w:r>
+        <w:t>/</w:t>
+      </w:r>
+      <w:proofErr w:type="spellStart"/>
+      <w:r>
+        <w:t>diagrammiUML</w:t>
+      </w:r>
+      <w:proofErr w:type="spellEnd"/>
       <w:r>
         <w:t>)</w:t>
       </w:r>
@@ -448,12 +529,28 @@
     </w:p>
     <w:p>
       <w:r>
-        <w:t>Stile architetturale: il software utilizza un architettura a strati (layered) per garantire la separazione delle responsabilità e facilitare la manutenibilità.</w:t>
-      </w:r>
-    </w:p>
-    <w:p>
-      <w:r>
-        <w:t>Il sistema è diviso in tre layer principali:</w:t>
+        <w:t>Stile architetturale: il software utilizza un architettura a strati (</w:t>
+      </w:r>
+      <w:proofErr w:type="spellStart"/>
+      <w:r>
+        <w:t>layered</w:t>
+      </w:r>
+      <w:proofErr w:type="spellEnd"/>
+      <w:r>
+        <w:t>) per garantire la separazione delle responsabilità e facilitare la manutenibilità.</w:t>
+      </w:r>
+    </w:p>
+    <w:p>
+      <w:r>
+        <w:t xml:space="preserve">Il sistema è diviso in tre </w:t>
+      </w:r>
+      <w:proofErr w:type="spellStart"/>
+      <w:r>
+        <w:t>layer</w:t>
+      </w:r>
+      <w:proofErr w:type="spellEnd"/>
+      <w:r>
+        <w:t xml:space="preserve"> principali:</w:t>
       </w:r>
     </w:p>
     <w:p>
@@ -466,7 +563,23 @@
         <w:spacing w:line="360" w:lineRule="auto"/>
       </w:pPr>
       <w:r>
-        <w:t>Presentation Layer (Views): Gestione dell'interfaccia utente (Vaadin)</w:t>
+        <w:t>Presentation Layer (</w:t>
+      </w:r>
+      <w:proofErr w:type="spellStart"/>
+      <w:r>
+        <w:t>Views</w:t>
+      </w:r>
+      <w:proofErr w:type="spellEnd"/>
+      <w:r>
+        <w:t>): Gestione dell'interfaccia utente (</w:t>
+      </w:r>
+      <w:proofErr w:type="spellStart"/>
+      <w:r>
+        <w:t>Vaadin</w:t>
+      </w:r>
+      <w:proofErr w:type="spellEnd"/>
+      <w:r>
+        <w:t>)</w:t>
       </w:r>
       <w:r>
         <w:t xml:space="preserve">. </w:t>
@@ -495,7 +608,15 @@
         <w:spacing w:line="360" w:lineRule="auto"/>
       </w:pPr>
       <w:r>
-        <w:t>Data Access Layer (Interface + FirebaseService): Gestione dati.</w:t>
+        <w:t xml:space="preserve">Data Access Layer (Interface + </w:t>
+      </w:r>
+      <w:proofErr w:type="spellStart"/>
+      <w:r>
+        <w:t>FirebaseService</w:t>
+      </w:r>
+      <w:proofErr w:type="spellEnd"/>
+      <w:r>
+        <w:t>): Gestione dati.</w:t>
       </w:r>
     </w:p>
     <w:p>
@@ -521,8 +642,21 @@
         <w:spacing w:line="360" w:lineRule="auto"/>
       </w:pPr>
       <w:r>
-        <w:t>Componenti principali: oggetti, Firebase, Client Browser, Spring, backend Vaadin</w:t>
-      </w:r>
+        <w:t xml:space="preserve">Componenti principali: oggetti, Firebase, Client Browser, Spring, </w:t>
+      </w:r>
+      <w:proofErr w:type="spellStart"/>
+      <w:r>
+        <w:t>backend</w:t>
+      </w:r>
+      <w:proofErr w:type="spellEnd"/>
+      <w:r>
+        <w:t xml:space="preserve"> </w:t>
+      </w:r>
+      <w:proofErr w:type="spellStart"/>
+      <w:r>
+        <w:t>Vaadin</w:t>
+      </w:r>
+      <w:proofErr w:type="spellEnd"/>
     </w:p>
     <w:p>
       <w:pPr>
@@ -576,7 +710,15 @@
         <w:spacing w:line="360" w:lineRule="auto"/>
       </w:pPr>
       <w:r>
-        <w:t>Dipendenze Spring – per il corretto funzionamento di SpringBoot e Tomcat</w:t>
+        <w:t xml:space="preserve">Dipendenze Spring – per il corretto funzionamento di </w:t>
+      </w:r>
+      <w:proofErr w:type="spellStart"/>
+      <w:r>
+        <w:t>SpringBoot</w:t>
+      </w:r>
+      <w:proofErr w:type="spellEnd"/>
+      <w:r>
+        <w:t xml:space="preserve"> e Tomcat</w:t>
       </w:r>
     </w:p>
     <w:p>
@@ -589,7 +731,15 @@
         <w:spacing w:line="360" w:lineRule="auto"/>
       </w:pPr>
       <w:r>
-        <w:t>Dipendenze Zxing – per la generazione dei QR code</w:t>
+        <w:t xml:space="preserve">Dipendenze </w:t>
+      </w:r>
+      <w:proofErr w:type="spellStart"/>
+      <w:r>
+        <w:t>Zxing</w:t>
+      </w:r>
+      <w:proofErr w:type="spellEnd"/>
+      <w:r>
+        <w:t xml:space="preserve"> – per la generazione dei QR code</w:t>
       </w:r>
     </w:p>
     <w:p>
@@ -602,7 +752,15 @@
         <w:spacing w:line="360" w:lineRule="auto"/>
       </w:pPr>
       <w:r>
-        <w:t>Dipendenze BCrypt – per la gestione di password criptate</w:t>
+        <w:t xml:space="preserve">Dipendenze </w:t>
+      </w:r>
+      <w:proofErr w:type="spellStart"/>
+      <w:r>
+        <w:t>BCrypt</w:t>
+      </w:r>
+      <w:proofErr w:type="spellEnd"/>
+      <w:r>
+        <w:t xml:space="preserve"> – per la gestione di password criptate</w:t>
       </w:r>
     </w:p>
     <w:p>
@@ -614,8 +772,13 @@
         </w:numPr>
         <w:spacing w:line="360" w:lineRule="auto"/>
       </w:pPr>
-      <w:r>
-        <w:t>ApexCharts – per grafici e statistiche</w:t>
+      <w:proofErr w:type="spellStart"/>
+      <w:r>
+        <w:t>ApexCharts</w:t>
+      </w:r>
+      <w:proofErr w:type="spellEnd"/>
+      <w:r>
+        <w:t xml:space="preserve"> – per grafici e statistiche</w:t>
       </w:r>
     </w:p>
     <w:p>
@@ -627,27 +790,19 @@
         </w:numPr>
         <w:spacing w:line="360" w:lineRule="auto"/>
       </w:pPr>
-      <w:r>
-        <w:t>Vaadin – per completa gestione frontend</w:t>
-      </w:r>
-    </w:p>
-    <w:p>
-      <w:pPr>
-        <w:pStyle w:val="Paragrafoelenco"/>
-        <w:numPr>
-          <w:ilvl w:val="0"/>
-          <w:numId w:val="8"/>
-        </w:numPr>
-        <w:spacing w:line="360" w:lineRule="auto"/>
-      </w:pPr>
-      <w:r>
-        <w:t xml:space="preserve">LogJ4 – per log errori </w:t>
-      </w:r>
-    </w:p>
-    <w:p>
-      <w:pPr>
-        <w:spacing w:line="360" w:lineRule="auto"/>
-      </w:pPr>
+      <w:proofErr w:type="spellStart"/>
+      <w:r>
+        <w:t>Vaadin</w:t>
+      </w:r>
+      <w:proofErr w:type="spellEnd"/>
+      <w:r>
+        <w:t xml:space="preserve"> – per completa gestione </w:t>
+      </w:r>
+      <w:proofErr w:type="spellStart"/>
+      <w:r>
+        <w:t>frontend</w:t>
+      </w:r>
+      <w:proofErr w:type="spellEnd"/>
     </w:p>
     <w:p>
       <w:pPr>
@@ -672,6 +827,8 @@
         <w:ind w:left="720"/>
       </w:pPr>
     </w:p>
+    <w:p/>
+    <w:p/>
     <w:p/>
     <w:p/>
     <w:p/>
@@ -778,8 +935,37 @@
         <w:t xml:space="preserve"> Pattern</w:t>
       </w:r>
       <w:r>
-        <w:t>: utilizzo di addClickListener per frontend e ValueEventListener per backend</w:t>
-      </w:r>
+        <w:t xml:space="preserve">: utilizzo di </w:t>
+      </w:r>
+      <w:proofErr w:type="spellStart"/>
+      <w:r>
+        <w:t>addClickListener</w:t>
+      </w:r>
+      <w:proofErr w:type="spellEnd"/>
+      <w:r>
+        <w:t xml:space="preserve"> per </w:t>
+      </w:r>
+      <w:proofErr w:type="spellStart"/>
+      <w:r>
+        <w:t>frontend</w:t>
+      </w:r>
+      <w:proofErr w:type="spellEnd"/>
+      <w:r>
+        <w:t xml:space="preserve"> e </w:t>
+      </w:r>
+      <w:proofErr w:type="spellStart"/>
+      <w:r>
+        <w:t>ValueEventListener</w:t>
+      </w:r>
+      <w:proofErr w:type="spellEnd"/>
+      <w:r>
+        <w:t xml:space="preserve"> per </w:t>
+      </w:r>
+      <w:proofErr w:type="spellStart"/>
+      <w:r>
+        <w:t>backend</w:t>
+      </w:r>
+      <w:proofErr w:type="spellEnd"/>
     </w:p>
     <w:p/>
     <w:p>
@@ -944,7 +1130,15 @@
               <w:t>ELOC</w:t>
             </w:r>
             <w:r>
-              <w:t xml:space="preserve"> (Estimated Lines of Code)</w:t>
+              <w:t xml:space="preserve"> (</w:t>
+            </w:r>
+            <w:proofErr w:type="spellStart"/>
+            <w:r>
+              <w:t>Estimated</w:t>
+            </w:r>
+            <w:proofErr w:type="spellEnd"/>
+            <w:r>
+              <w:t xml:space="preserve"> Lines of Code)</w:t>
             </w:r>
           </w:p>
         </w:tc>
@@ -1080,7 +1274,15 @@
               <w:t>McCabe</w:t>
             </w:r>
             <w:r>
-              <w:t xml:space="preserve"> (Complessità Ciclomatica)</w:t>
+              <w:t xml:space="preserve"> (Complessità </w:t>
+            </w:r>
+            <w:proofErr w:type="spellStart"/>
+            <w:r>
+              <w:t>Ciclomatica</w:t>
+            </w:r>
+            <w:proofErr w:type="spellEnd"/>
+            <w:r>
+              <w:t>)</w:t>
             </w:r>
           </w:p>
         </w:tc>
@@ -1138,6 +1340,7 @@
             <w:pPr>
               <w:spacing w:after="160" w:line="259" w:lineRule="auto"/>
             </w:pPr>
+            <w:proofErr w:type="spellStart"/>
             <w:r>
               <w:rPr>
                 <w:b/>
@@ -1145,6 +1348,7 @@
               </w:rPr>
               <w:t>Pollution</w:t>
             </w:r>
+            <w:proofErr w:type="spellEnd"/>
           </w:p>
         </w:tc>
         <w:tc>
@@ -1185,7 +1389,15 @@
               <w:t xml:space="preserve"> Valore influenzato </w:t>
             </w:r>
             <w:r>
-              <w:t>dall’utilizzo di Vaadin.</w:t>
+              <w:t xml:space="preserve">dall’utilizzo di </w:t>
+            </w:r>
+            <w:proofErr w:type="spellStart"/>
+            <w:r>
+              <w:t>Vaadin</w:t>
+            </w:r>
+            <w:proofErr w:type="spellEnd"/>
+            <w:r>
+              <w:t>.</w:t>
             </w:r>
           </w:p>
         </w:tc>
@@ -1218,12 +1430,21 @@
             <w:pPr>
               <w:spacing w:after="160" w:line="259" w:lineRule="auto"/>
             </w:pPr>
+            <w:proofErr w:type="spellStart"/>
             <w:r>
               <w:rPr>
                 <w:b/>
                 <w:bCs/>
               </w:rPr>
-              <w:t>Tangled Libraries</w:t>
+              <w:t>Tangled</w:t>
+            </w:r>
+            <w:proofErr w:type="spellEnd"/>
+            <w:r>
+              <w:rPr>
+                <w:b/>
+                <w:bCs/>
+              </w:rPr>
+              <w:t xml:space="preserve"> Libraries</w:t>
             </w:r>
           </w:p>
         </w:tc>
@@ -1321,7 +1542,15 @@
               <w:spacing w:after="160" w:line="259" w:lineRule="auto"/>
             </w:pPr>
             <w:r>
-              <w:t>Progetto bilanciato nella "Main Sequence" (Stabilità vs Astrazione).</w:t>
+              <w:t xml:space="preserve">Progetto bilanciato nella "Main </w:t>
+            </w:r>
+            <w:proofErr w:type="spellStart"/>
+            <w:r>
+              <w:t>Sequence</w:t>
+            </w:r>
+            <w:proofErr w:type="spellEnd"/>
+            <w:r>
+              <w:t>" (Stabilità vs Astrazione).</w:t>
             </w:r>
           </w:p>
         </w:tc>
@@ -1362,7 +1591,23 @@
               <w:t>CBO</w:t>
             </w:r>
             <w:r>
-              <w:t xml:space="preserve"> (Coupling Between Objects)</w:t>
+              <w:t xml:space="preserve"> (</w:t>
+            </w:r>
+            <w:proofErr w:type="spellStart"/>
+            <w:r>
+              <w:t>Coupling</w:t>
+            </w:r>
+            <w:proofErr w:type="spellEnd"/>
+            <w:r>
+              <w:t xml:space="preserve"> </w:t>
+            </w:r>
+            <w:proofErr w:type="spellStart"/>
+            <w:r>
+              <w:t>Between</w:t>
+            </w:r>
+            <w:proofErr w:type="spellEnd"/>
+            <w:r>
+              <w:t xml:space="preserve"> Objects)</w:t>
             </w:r>
           </w:p>
         </w:tc>
@@ -1428,7 +1673,15 @@
               <w:t>WMC</w:t>
             </w:r>
             <w:r>
-              <w:t xml:space="preserve"> (Weighted Methods per Class)</w:t>
+              <w:t xml:space="preserve"> (</w:t>
+            </w:r>
+            <w:proofErr w:type="spellStart"/>
+            <w:r>
+              <w:t>Weighted</w:t>
+            </w:r>
+            <w:proofErr w:type="spellEnd"/>
+            <w:r>
+              <w:t xml:space="preserve"> Methods per Class)</w:t>
             </w:r>
           </w:p>
         </w:tc>
@@ -1494,7 +1747,15 @@
               <w:t>DIT</w:t>
             </w:r>
             <w:r>
-              <w:t xml:space="preserve"> (Depth of Inheritance Tree)</w:t>
+              <w:t xml:space="preserve"> (Depth of </w:t>
+            </w:r>
+            <w:proofErr w:type="spellStart"/>
+            <w:r>
+              <w:t>Inheritance</w:t>
+            </w:r>
+            <w:proofErr w:type="spellEnd"/>
+            <w:r>
+              <w:t xml:space="preserve"> Tree)</w:t>
             </w:r>
           </w:p>
         </w:tc>
@@ -1560,7 +1821,15 @@
               <w:t>RFC</w:t>
             </w:r>
             <w:r>
-              <w:t xml:space="preserve"> (Response For a Class)</w:t>
+              <w:t xml:space="preserve"> (</w:t>
+            </w:r>
+            <w:proofErr w:type="spellStart"/>
+            <w:r>
+              <w:t>Response</w:t>
+            </w:r>
+            <w:proofErr w:type="spellEnd"/>
+            <w:r>
+              <w:t xml:space="preserve"> For a Class)</w:t>
             </w:r>
           </w:p>
         </w:tc>
@@ -1673,11 +1942,16 @@
       <w:pPr>
         <w:jc w:val="both"/>
       </w:pPr>
+      <w:proofErr w:type="spellStart"/>
       <w:r>
         <w:t>Po</w:t>
       </w:r>
       <w:r>
-        <w:t xml:space="preserve">llution: </w:t>
+        <w:t>llution</w:t>
+      </w:r>
+      <w:proofErr w:type="spellEnd"/>
+      <w:r>
+        <w:t xml:space="preserve">: </w:t>
       </w:r>
     </w:p>
     <w:p>
@@ -1685,6 +1959,9 @@
         <w:jc w:val="center"/>
       </w:pPr>
       <w:r>
+        <w:rPr>
+          <w:noProof/>
+        </w:rPr>
         <w:drawing>
           <wp:inline distT="0" distB="0" distL="0" distR="0" wp14:anchorId="38D33023" wp14:editId="5A7401F8">
             <wp:extent cx="4824730" cy="3157250"/>
@@ -1733,6 +2010,9 @@
         <w:jc w:val="center"/>
       </w:pPr>
       <w:r>
+        <w:rPr>
+          <w:noProof/>
+        </w:rPr>
         <w:drawing>
           <wp:inline distT="0" distB="0" distL="0" distR="0" wp14:anchorId="03F85FE6" wp14:editId="6BD1C30F">
             <wp:extent cx="4508500" cy="4279900"/>
@@ -4679,6 +4959,7 @@
   <w:style w:type="character" w:default="1" w:styleId="Carpredefinitoparagrafo">
     <w:name w:val="Default Paragraph Font"/>
     <w:uiPriority w:val="1"/>
+    <w:semiHidden/>
     <w:unhideWhenUsed/>
   </w:style>
   <w:style w:type="table" w:default="1" w:styleId="Tabellanormale">

</xml_diff>